<commit_message>
Add angle timeline and format plan to Meta creative plan
Week-by-week grid of when each angle runs and in which format, plus
why the launch starts with statics.

Co-Authored-By: Claude Opus 5.5 <noreply@anthropic.com>
Claude-Session: https://claude.ai/code/session_01WYxT2oKqHUxfsBrXZ2Myb2
</commit_message>
<xml_diff>
--- a/nxt-school-launch/NXT_Meta_Creative_Plan.docx
+++ b/nxt-school-launch/NXT_Meta_Creative_Plan.docx
@@ -1284,6 +1284,1469 @@
         </w:tc>
       </w:tr>
     </w:tbl>
+    <w:p>
+      <w:pPr>
+        <w:pStyle w:val="Heading1"/>
+        <w:pageBreakBefore/>
+      </w:pPr>
+      <w:r>
+        <w:rPr>
+          <w:rFonts w:ascii="Arial" w:cs="Arial" w:eastAsia="Arial" w:hAnsi="Arial"/>
+        </w:rPr>
+        <w:t xml:space="preserve">When each angle runs — and in what format</w:t>
+      </w:r>
+    </w:p>
+    <w:tbl>
+      <w:tblPr>
+        <w:tblW w:type="dxa" w:w="9638"/>
+        <w:tblBorders>
+          <w:top w:val="single" w:color="auto" w:sz="4"/>
+          <w:left w:val="single" w:color="auto" w:sz="4"/>
+          <w:bottom w:val="single" w:color="auto" w:sz="4"/>
+          <w:right w:val="single" w:color="auto" w:sz="4"/>
+          <w:insideH w:val="single" w:color="auto" w:sz="4"/>
+          <w:insideV w:val="single" w:color="auto" w:sz="4"/>
+        </w:tblBorders>
+      </w:tblPr>
+      <w:tblGrid>
+        <w:gridCol w:w="9638"/>
+      </w:tblGrid>
+      <w:tr>
+        <w:tc>
+          <w:tcPr>
+            <w:tcW w:type="dxa" w:w="9638"/>
+            <w:tcBorders>
+              <w:top w:val="none" w:color="FFFFFF" w:sz="0"/>
+              <w:left w:val="single" w:color="007BFF" w:sz="24"/>
+              <w:bottom w:val="none" w:color="FFFFFF" w:sz="0"/>
+              <w:right w:val="none" w:color="FFFFFF" w:sz="0"/>
+            </w:tcBorders>
+            <w:shd w:fill="EEF4FF" w:color="auto" w:val="clear"/>
+            <w:tcMar>
+              <w:top w:type="dxa" w:w="110"/>
+              <w:left w:type="dxa" w:w="200"/>
+              <w:bottom w:type="dxa" w:w="110"/>
+              <w:right w:type="dxa" w:w="200"/>
+            </w:tcMar>
+          </w:tcPr>
+          <w:p>
+            <w:pPr>
+              <w:spacing w:after="30" w:line="250"/>
+            </w:pPr>
+            <w:r>
+              <w:rPr>
+                <w:rFonts w:ascii="Arial" w:cs="Arial" w:eastAsia="Arial" w:hAnsi="Arial"/>
+                <w:b/>
+                <w:bCs/>
+                <w:sz w:val="19"/>
+                <w:szCs w:val="19"/>
+              </w:rPr>
+              <w:t xml:space="preserve">Angles A, B and C don't take turns — they all start on day 1, side by side in Prospecting.</w:t>
+            </w:r>
+            <w:r>
+              <w:rPr>
+                <w:rFonts w:ascii="Arial" w:cs="Arial" w:eastAsia="Arial" w:hAnsi="Arial"/>
+                <w:sz w:val="19"/>
+                <w:szCs w:val="19"/>
+              </w:rPr>
+              <w:t xml:space="preserve"> That IS the test: same audience, same budget, 6 ads, and the data shows which angle wins. Only angle D (Open Day) is tied to dates.</w:t>
+            </w:r>
+          </w:p>
+        </w:tc>
+      </w:tr>
+    </w:tbl>
+    <w:p>
+      <w:pPr>
+        <w:spacing w:after="160"/>
+      </w:pPr>
+    </w:p>
+    <w:tbl>
+      <w:tblPr>
+        <w:tblW w:type="dxa" w:w="9638"/>
+        <w:tblBorders>
+          <w:top w:val="single" w:color="auto" w:sz="4"/>
+          <w:left w:val="single" w:color="auto" w:sz="4"/>
+          <w:bottom w:val="single" w:color="auto" w:sz="4"/>
+          <w:right w:val="single" w:color="auto" w:sz="4"/>
+          <w:insideH w:val="single" w:color="auto" w:sz="4"/>
+          <w:insideV w:val="single" w:color="auto" w:sz="4"/>
+        </w:tblBorders>
+      </w:tblPr>
+      <w:tblGrid>
+        <w:gridCol w:w="2300"/>
+        <w:gridCol w:w="1834"/>
+        <w:gridCol w:w="1834"/>
+        <w:gridCol w:w="1835"/>
+        <w:gridCol w:w="1835"/>
+      </w:tblGrid>
+      <w:tr>
+        <w:trPr>
+          <w:tblHeader/>
+        </w:trPr>
+        <w:tc>
+          <w:tcPr>
+            <w:tcW w:type="dxa" w:w="2300"/>
+            <w:tcBorders>
+              <w:top w:val="single" w:color="D9E1EC" w:sz="4"/>
+              <w:left w:val="single" w:color="D9E1EC" w:sz="4"/>
+              <w:bottom w:val="single" w:color="D9E1EC" w:sz="4"/>
+              <w:right w:val="single" w:color="D9E1EC" w:sz="4"/>
+            </w:tcBorders>
+            <w:shd w:fill="0F172A" w:color="auto" w:val="clear"/>
+            <w:tcMar>
+              <w:top w:type="dxa" w:w="90"/>
+              <w:left w:type="dxa" w:w="100"/>
+              <w:bottom w:type="dxa" w:w="90"/>
+              <w:right w:type="dxa" w:w="100"/>
+            </w:tcMar>
+            <w:vAlign w:val="center"/>
+          </w:tcPr>
+          <w:p>
+            <w:pPr>
+              <w:spacing w:after="30" w:line="250"/>
+            </w:pPr>
+            <w:r>
+              <w:rPr>
+                <w:rFonts w:ascii="Arial" w:cs="Arial" w:eastAsia="Arial" w:hAnsi="Arial"/>
+                <w:b/>
+                <w:bCs/>
+                <w:color w:val="FFFFFF"/>
+                <w:sz w:val="17"/>
+                <w:szCs w:val="17"/>
+              </w:rPr>
+              <w:t xml:space="preserve">Angle</w:t>
+            </w:r>
+          </w:p>
+        </w:tc>
+        <w:tc>
+          <w:tcPr>
+            <w:tcW w:type="dxa" w:w="1834"/>
+            <w:tcBorders>
+              <w:top w:val="single" w:color="D9E1EC" w:sz="4"/>
+              <w:left w:val="single" w:color="D9E1EC" w:sz="4"/>
+              <w:bottom w:val="single" w:color="D9E1EC" w:sz="4"/>
+              <w:right w:val="single" w:color="D9E1EC" w:sz="4"/>
+            </w:tcBorders>
+            <w:shd w:fill="0F172A" w:color="auto" w:val="clear"/>
+            <w:tcMar>
+              <w:top w:type="dxa" w:w="90"/>
+              <w:left w:type="dxa" w:w="100"/>
+              <w:bottom w:type="dxa" w:w="90"/>
+              <w:right w:type="dxa" w:w="100"/>
+            </w:tcMar>
+            <w:vAlign w:val="center"/>
+          </w:tcPr>
+          <w:p>
+            <w:pPr>
+              <w:spacing w:after="30" w:line="250"/>
+            </w:pPr>
+            <w:r>
+              <w:rPr>
+                <w:rFonts w:ascii="Arial" w:cs="Arial" w:eastAsia="Arial" w:hAnsi="Arial"/>
+                <w:b/>
+                <w:bCs/>
+                <w:color w:val="FFFFFF"/>
+                <w:sz w:val="17"/>
+                <w:szCs w:val="17"/>
+              </w:rPr>
+              <w:t xml:space="preserve">W1 · 6–11 Oct</w:t>
+            </w:r>
+          </w:p>
+          <w:p>
+            <w:pPr>
+              <w:spacing w:after="30" w:line="250"/>
+            </w:pPr>
+            <w:r>
+              <w:rPr>
+                <w:rFonts w:ascii="Arial" w:cs="Arial" w:eastAsia="Arial" w:hAnsi="Arial"/>
+                <w:b/>
+                <w:bCs/>
+                <w:color w:val="FFFFFF"/>
+                <w:sz w:val="17"/>
+                <w:szCs w:val="17"/>
+              </w:rPr>
+              <w:t xml:space="preserve">Launch</w:t>
+            </w:r>
+          </w:p>
+        </w:tc>
+        <w:tc>
+          <w:tcPr>
+            <w:tcW w:type="dxa" w:w="1834"/>
+            <w:tcBorders>
+              <w:top w:val="single" w:color="D9E1EC" w:sz="4"/>
+              <w:left w:val="single" w:color="D9E1EC" w:sz="4"/>
+              <w:bottom w:val="single" w:color="D9E1EC" w:sz="4"/>
+              <w:right w:val="single" w:color="D9E1EC" w:sz="4"/>
+            </w:tcBorders>
+            <w:shd w:fill="0F172A" w:color="auto" w:val="clear"/>
+            <w:tcMar>
+              <w:top w:type="dxa" w:w="90"/>
+              <w:left w:type="dxa" w:w="100"/>
+              <w:bottom w:type="dxa" w:w="90"/>
+              <w:right w:type="dxa" w:w="100"/>
+            </w:tcMar>
+            <w:vAlign w:val="center"/>
+          </w:tcPr>
+          <w:p>
+            <w:pPr>
+              <w:spacing w:after="30" w:line="250"/>
+            </w:pPr>
+            <w:r>
+              <w:rPr>
+                <w:rFonts w:ascii="Arial" w:cs="Arial" w:eastAsia="Arial" w:hAnsi="Arial"/>
+                <w:b/>
+                <w:bCs/>
+                <w:color w:val="FFFFFF"/>
+                <w:sz w:val="17"/>
+                <w:szCs w:val="17"/>
+              </w:rPr>
+              <w:t xml:space="preserve">W2 · 12–18 Oct</w:t>
+            </w:r>
+          </w:p>
+          <w:p>
+            <w:pPr>
+              <w:spacing w:after="30" w:line="250"/>
+            </w:pPr>
+            <w:r>
+              <w:rPr>
+                <w:rFonts w:ascii="Arial" w:cs="Arial" w:eastAsia="Arial" w:hAnsi="Arial"/>
+                <w:b/>
+                <w:bCs/>
+                <w:color w:val="FFFFFF"/>
+                <w:sz w:val="17"/>
+                <w:szCs w:val="17"/>
+              </w:rPr>
+              <w:t xml:space="preserve">First read</w:t>
+            </w:r>
+          </w:p>
+        </w:tc>
+        <w:tc>
+          <w:tcPr>
+            <w:tcW w:type="dxa" w:w="1835"/>
+            <w:tcBorders>
+              <w:top w:val="single" w:color="D9E1EC" w:sz="4"/>
+              <w:left w:val="single" w:color="D9E1EC" w:sz="4"/>
+              <w:bottom w:val="single" w:color="D9E1EC" w:sz="4"/>
+              <w:right w:val="single" w:color="D9E1EC" w:sz="4"/>
+            </w:tcBorders>
+            <w:shd w:fill="0F172A" w:color="auto" w:val="clear"/>
+            <w:tcMar>
+              <w:top w:type="dxa" w:w="90"/>
+              <w:left w:type="dxa" w:w="100"/>
+              <w:bottom w:type="dxa" w:w="90"/>
+              <w:right w:type="dxa" w:w="100"/>
+            </w:tcMar>
+            <w:vAlign w:val="center"/>
+          </w:tcPr>
+          <w:p>
+            <w:pPr>
+              <w:spacing w:after="30" w:line="250"/>
+            </w:pPr>
+            <w:r>
+              <w:rPr>
+                <w:rFonts w:ascii="Arial" w:cs="Arial" w:eastAsia="Arial" w:hAnsi="Arial"/>
+                <w:b/>
+                <w:bCs/>
+                <w:color w:val="FFFFFF"/>
+                <w:sz w:val="17"/>
+                <w:szCs w:val="17"/>
+              </w:rPr>
+              <w:t xml:space="preserve">W3 · 19–25 Oct</w:t>
+            </w:r>
+          </w:p>
+          <w:p>
+            <w:pPr>
+              <w:spacing w:after="30" w:line="250"/>
+            </w:pPr>
+            <w:r>
+              <w:rPr>
+                <w:rFonts w:ascii="Arial" w:cs="Arial" w:eastAsia="Arial" w:hAnsi="Arial"/>
+                <w:b/>
+                <w:bCs/>
+                <w:color w:val="FFFFFF"/>
+                <w:sz w:val="17"/>
+                <w:szCs w:val="17"/>
+              </w:rPr>
+              <w:t xml:space="preserve">Iterate winner</w:t>
+            </w:r>
+          </w:p>
+        </w:tc>
+        <w:tc>
+          <w:tcPr>
+            <w:tcW w:type="dxa" w:w="1835"/>
+            <w:tcBorders>
+              <w:top w:val="single" w:color="D9E1EC" w:sz="4"/>
+              <w:left w:val="single" w:color="D9E1EC" w:sz="4"/>
+              <w:bottom w:val="single" w:color="D9E1EC" w:sz="4"/>
+              <w:right w:val="single" w:color="D9E1EC" w:sz="4"/>
+            </w:tcBorders>
+            <w:shd w:fill="0F172A" w:color="auto" w:val="clear"/>
+            <w:tcMar>
+              <w:top w:type="dxa" w:w="90"/>
+              <w:left w:type="dxa" w:w="100"/>
+              <w:bottom w:type="dxa" w:w="90"/>
+              <w:right w:type="dxa" w:w="100"/>
+            </w:tcMar>
+            <w:vAlign w:val="center"/>
+          </w:tcPr>
+          <w:p>
+            <w:pPr>
+              <w:spacing w:after="30" w:line="250"/>
+            </w:pPr>
+            <w:r>
+              <w:rPr>
+                <w:rFonts w:ascii="Arial" w:cs="Arial" w:eastAsia="Arial" w:hAnsi="Arial"/>
+                <w:b/>
+                <w:bCs/>
+                <w:color w:val="FFFFFF"/>
+                <w:sz w:val="17"/>
+                <w:szCs w:val="17"/>
+              </w:rPr>
+              <w:t xml:space="preserve">W4 · 26 Oct →</w:t>
+            </w:r>
+          </w:p>
+          <w:p>
+            <w:pPr>
+              <w:spacing w:after="30" w:line="250"/>
+            </w:pPr>
+            <w:r>
+              <w:rPr>
+                <w:rFonts w:ascii="Arial" w:cs="Arial" w:eastAsia="Arial" w:hAnsi="Arial"/>
+                <w:b/>
+                <w:bCs/>
+                <w:color w:val="FFFFFF"/>
+                <w:sz w:val="17"/>
+                <w:szCs w:val="17"/>
+              </w:rPr>
+              <w:t xml:space="preserve">Real content</w:t>
+            </w:r>
+          </w:p>
+        </w:tc>
+      </w:tr>
+      <w:tr>
+        <w:trPr>
+          <w:cantSplit/>
+        </w:trPr>
+        <w:tc>
+          <w:tcPr>
+            <w:tcW w:type="dxa" w:w="2300"/>
+            <w:tcBorders>
+              <w:top w:val="single" w:color="D9E1EC" w:sz="4"/>
+              <w:left w:val="single" w:color="D9E1EC" w:sz="4"/>
+              <w:bottom w:val="single" w:color="D9E1EC" w:sz="4"/>
+              <w:right w:val="single" w:color="D9E1EC" w:sz="4"/>
+            </w:tcBorders>
+            <w:shd w:fill="FFFFFF" w:color="auto" w:val="clear"/>
+            <w:tcMar>
+              <w:top w:type="dxa" w:w="90"/>
+              <w:left w:type="dxa" w:w="100"/>
+              <w:bottom w:type="dxa" w:w="90"/>
+              <w:right w:type="dxa" w:w="100"/>
+            </w:tcMar>
+            <w:vAlign w:val="center"/>
+          </w:tcPr>
+          <w:p>
+            <w:pPr>
+              <w:spacing w:after="30" w:line="250"/>
+            </w:pPr>
+            <w:r>
+              <w:rPr>
+                <w:rFonts w:ascii="Arial" w:cs="Arial" w:eastAsia="Arial" w:hAnsi="Arial"/>
+                <w:b/>
+                <w:bCs/>
+                <w:sz w:val="17"/>
+                <w:szCs w:val="17"/>
+              </w:rPr>
+              <w:t xml:space="preserve">A · Problem</w:t>
+            </w:r>
+          </w:p>
+          <w:p>
+            <w:pPr>
+              <w:spacing w:after="30" w:line="250"/>
+            </w:pPr>
+            <w:r>
+              <w:rPr>
+                <w:rFonts w:ascii="Arial" w:cs="Arial" w:eastAsia="Arial" w:hAnsi="Arial"/>
+                <w:sz w:val="17"/>
+                <w:szCs w:val="17"/>
+              </w:rPr>
+              <w:t xml:space="preserve">"Less scrolling. More creating."</w:t>
+            </w:r>
+          </w:p>
+        </w:tc>
+        <w:tc>
+          <w:tcPr>
+            <w:tcW w:type="dxa" w:w="1834"/>
+            <w:tcBorders>
+              <w:top w:val="single" w:color="D9E1EC" w:sz="4"/>
+              <w:left w:val="single" w:color="D9E1EC" w:sz="4"/>
+              <w:bottom w:val="single" w:color="D9E1EC" w:sz="4"/>
+              <w:right w:val="single" w:color="D9E1EC" w:sz="4"/>
+            </w:tcBorders>
+            <w:shd w:fill="E8F2FF" w:color="auto" w:val="clear"/>
+            <w:tcMar>
+              <w:top w:type="dxa" w:w="90"/>
+              <w:left w:type="dxa" w:w="100"/>
+              <w:bottom w:type="dxa" w:w="90"/>
+              <w:right w:type="dxa" w:w="100"/>
+            </w:tcMar>
+            <w:vAlign w:val="center"/>
+          </w:tcPr>
+          <w:p>
+            <w:pPr>
+              <w:spacing w:after="30" w:line="250"/>
+            </w:pPr>
+            <w:r>
+              <w:rPr>
+                <w:rFonts w:ascii="Arial" w:cs="Arial" w:eastAsia="Arial" w:hAnsi="Arial"/>
+                <w:sz w:val="17"/>
+                <w:szCs w:val="17"/>
+              </w:rPr>
+              <w:t xml:space="preserve">P2, P4</w:t>
+            </w:r>
+          </w:p>
+          <w:p>
+            <w:pPr>
+              <w:spacing w:after="30" w:line="250"/>
+            </w:pPr>
+            <w:r>
+              <w:rPr>
+                <w:rFonts w:ascii="Arial" w:cs="Arial" w:eastAsia="Arial" w:hAnsi="Arial"/>
+                <w:sz w:val="17"/>
+                <w:szCs w:val="17"/>
+              </w:rPr>
+              <w:t xml:space="preserve">Static</w:t>
+            </w:r>
+          </w:p>
+        </w:tc>
+        <w:tc>
+          <w:tcPr>
+            <w:tcW w:type="dxa" w:w="1834"/>
+            <w:tcBorders>
+              <w:top w:val="single" w:color="D9E1EC" w:sz="4"/>
+              <w:left w:val="single" w:color="D9E1EC" w:sz="4"/>
+              <w:bottom w:val="single" w:color="D9E1EC" w:sz="4"/>
+              <w:right w:val="single" w:color="D9E1EC" w:sz="4"/>
+            </w:tcBorders>
+            <w:shd w:fill="E8F2FF" w:color="auto" w:val="clear"/>
+            <w:tcMar>
+              <w:top w:type="dxa" w:w="90"/>
+              <w:left w:type="dxa" w:w="100"/>
+              <w:bottom w:type="dxa" w:w="90"/>
+              <w:right w:type="dxa" w:w="100"/>
+            </w:tcMar>
+            <w:vAlign w:val="center"/>
+          </w:tcPr>
+          <w:p>
+            <w:pPr>
+              <w:spacing w:after="30" w:line="250"/>
+            </w:pPr>
+            <w:r>
+              <w:rPr>
+                <w:rFonts w:ascii="Arial" w:cs="Arial" w:eastAsia="Arial" w:hAnsi="Arial"/>
+                <w:sz w:val="17"/>
+                <w:szCs w:val="17"/>
+              </w:rPr>
+              <w:t xml:space="preserve">P2, P4 stay if in top 3</w:t>
+            </w:r>
+          </w:p>
+          <w:p>
+            <w:pPr>
+              <w:spacing w:after="30" w:line="250"/>
+            </w:pPr>
+            <w:r>
+              <w:rPr>
+                <w:rFonts w:ascii="Arial" w:cs="Arial" w:eastAsia="Arial" w:hAnsi="Arial"/>
+                <w:sz w:val="17"/>
+                <w:szCs w:val="17"/>
+              </w:rPr>
+              <w:t xml:space="preserve">Static</w:t>
+            </w:r>
+          </w:p>
+        </w:tc>
+        <w:tc>
+          <w:tcPr>
+            <w:tcW w:type="dxa" w:w="1835"/>
+            <w:tcBorders>
+              <w:top w:val="single" w:color="D9E1EC" w:sz="4"/>
+              <w:left w:val="single" w:color="D9E1EC" w:sz="4"/>
+              <w:bottom w:val="single" w:color="D9E1EC" w:sz="4"/>
+              <w:right w:val="single" w:color="D9E1EC" w:sz="4"/>
+            </w:tcBorders>
+            <w:shd w:fill="EDE8FF" w:color="auto" w:val="clear"/>
+            <w:tcMar>
+              <w:top w:type="dxa" w:w="90"/>
+              <w:left w:type="dxa" w:w="100"/>
+              <w:bottom w:type="dxa" w:w="90"/>
+              <w:right w:type="dxa" w:w="100"/>
+            </w:tcMar>
+            <w:vAlign w:val="center"/>
+          </w:tcPr>
+          <w:p>
+            <w:pPr>
+              <w:spacing w:after="30" w:line="250"/>
+            </w:pPr>
+            <w:r>
+              <w:rPr>
+                <w:rFonts w:ascii="Arial" w:cs="Arial" w:eastAsia="Arial" w:hAnsi="Arial"/>
+                <w:sz w:val="17"/>
+                <w:szCs w:val="17"/>
+              </w:rPr>
+              <w:t xml:space="preserve">If A wins: Serbian headline + 6 s motion of C3</w:t>
+            </w:r>
+          </w:p>
+        </w:tc>
+        <w:tc>
+          <w:tcPr>
+            <w:tcW w:type="dxa" w:w="1835"/>
+            <w:tcBorders>
+              <w:top w:val="single" w:color="D9E1EC" w:sz="4"/>
+              <w:left w:val="single" w:color="D9E1EC" w:sz="4"/>
+              <w:bottom w:val="single" w:color="D9E1EC" w:sz="4"/>
+              <w:right w:val="single" w:color="D9E1EC" w:sz="4"/>
+            </w:tcBorders>
+            <w:shd w:fill="E3F6EF" w:color="auto" w:val="clear"/>
+            <w:tcMar>
+              <w:top w:type="dxa" w:w="90"/>
+              <w:left w:type="dxa" w:w="100"/>
+              <w:bottom w:type="dxa" w:w="90"/>
+              <w:right w:type="dxa" w:w="100"/>
+            </w:tcMar>
+            <w:vAlign w:val="center"/>
+          </w:tcPr>
+          <w:p>
+            <w:pPr>
+              <w:spacing w:after="30" w:line="250"/>
+            </w:pPr>
+            <w:r>
+              <w:rPr>
+                <w:rFonts w:ascii="Arial" w:cs="Arial" w:eastAsia="Arial" w:hAnsi="Arial"/>
+                <w:sz w:val="17"/>
+                <w:szCs w:val="17"/>
+              </w:rPr>
+              <w:t xml:space="preserve">Real photo + 15 s Reel "scroll → create"</w:t>
+            </w:r>
+          </w:p>
+        </w:tc>
+      </w:tr>
+      <w:tr>
+        <w:trPr>
+          <w:cantSplit/>
+        </w:trPr>
+        <w:tc>
+          <w:tcPr>
+            <w:tcW w:type="dxa" w:w="2300"/>
+            <w:tcBorders>
+              <w:top w:val="single" w:color="D9E1EC" w:sz="4"/>
+              <w:left w:val="single" w:color="D9E1EC" w:sz="4"/>
+              <w:bottom w:val="single" w:color="D9E1EC" w:sz="4"/>
+              <w:right w:val="single" w:color="D9E1EC" w:sz="4"/>
+            </w:tcBorders>
+            <w:shd w:fill="FFFFFF" w:color="auto" w:val="clear"/>
+            <w:tcMar>
+              <w:top w:type="dxa" w:w="90"/>
+              <w:left w:type="dxa" w:w="100"/>
+              <w:bottom w:type="dxa" w:w="90"/>
+              <w:right w:type="dxa" w:w="100"/>
+            </w:tcMar>
+            <w:vAlign w:val="center"/>
+          </w:tcPr>
+          <w:p>
+            <w:pPr>
+              <w:spacing w:after="30" w:line="250"/>
+            </w:pPr>
+            <w:r>
+              <w:rPr>
+                <w:rFonts w:ascii="Arial" w:cs="Arial" w:eastAsia="Arial" w:hAnsi="Arial"/>
+                <w:b/>
+                <w:bCs/>
+                <w:sz w:val="17"/>
+                <w:szCs w:val="17"/>
+              </w:rPr>
+              <w:t xml:space="preserve">B · Future skills / AI</w:t>
+            </w:r>
+          </w:p>
+          <w:p>
+            <w:pPr>
+              <w:spacing w:after="30" w:line="250"/>
+            </w:pPr>
+            <w:r>
+              <w:rPr>
+                <w:rFonts w:ascii="Arial" w:cs="Arial" w:eastAsia="Arial" w:hAnsi="Arial"/>
+                <w:sz w:val="17"/>
+                <w:szCs w:val="17"/>
+              </w:rPr>
+              <w:t xml:space="preserve">"Veštine za svet u kojem će odrastati."</w:t>
+            </w:r>
+          </w:p>
+        </w:tc>
+        <w:tc>
+          <w:tcPr>
+            <w:tcW w:type="dxa" w:w="1834"/>
+            <w:tcBorders>
+              <w:top w:val="single" w:color="D9E1EC" w:sz="4"/>
+              <w:left w:val="single" w:color="D9E1EC" w:sz="4"/>
+              <w:bottom w:val="single" w:color="D9E1EC" w:sz="4"/>
+              <w:right w:val="single" w:color="D9E1EC" w:sz="4"/>
+            </w:tcBorders>
+            <w:shd w:fill="E8F2FF" w:color="auto" w:val="clear"/>
+            <w:tcMar>
+              <w:top w:type="dxa" w:w="90"/>
+              <w:left w:type="dxa" w:w="100"/>
+              <w:bottom w:type="dxa" w:w="90"/>
+              <w:right w:type="dxa" w:w="100"/>
+            </w:tcMar>
+            <w:vAlign w:val="center"/>
+          </w:tcPr>
+          <w:p>
+            <w:pPr>
+              <w:spacing w:after="30" w:line="250"/>
+            </w:pPr>
+            <w:r>
+              <w:rPr>
+                <w:rFonts w:ascii="Arial" w:cs="Arial" w:eastAsia="Arial" w:hAnsi="Arial"/>
+                <w:sz w:val="17"/>
+                <w:szCs w:val="17"/>
+              </w:rPr>
+              <w:t xml:space="preserve">P1, P3, P5</w:t>
+            </w:r>
+          </w:p>
+          <w:p>
+            <w:pPr>
+              <w:spacing w:after="30" w:line="250"/>
+            </w:pPr>
+            <w:r>
+              <w:rPr>
+                <w:rFonts w:ascii="Arial" w:cs="Arial" w:eastAsia="Arial" w:hAnsi="Arial"/>
+                <w:sz w:val="17"/>
+                <w:szCs w:val="17"/>
+              </w:rPr>
+              <w:t xml:space="preserve">Static</w:t>
+            </w:r>
+          </w:p>
+        </w:tc>
+        <w:tc>
+          <w:tcPr>
+            <w:tcW w:type="dxa" w:w="1834"/>
+            <w:tcBorders>
+              <w:top w:val="single" w:color="D9E1EC" w:sz="4"/>
+              <w:left w:val="single" w:color="D9E1EC" w:sz="4"/>
+              <w:bottom w:val="single" w:color="D9E1EC" w:sz="4"/>
+              <w:right w:val="single" w:color="D9E1EC" w:sz="4"/>
+            </w:tcBorders>
+            <w:shd w:fill="E8F2FF" w:color="auto" w:val="clear"/>
+            <w:tcMar>
+              <w:top w:type="dxa" w:w="90"/>
+              <w:left w:type="dxa" w:w="100"/>
+              <w:bottom w:type="dxa" w:w="90"/>
+              <w:right w:type="dxa" w:w="100"/>
+            </w:tcMar>
+            <w:vAlign w:val="center"/>
+          </w:tcPr>
+          <w:p>
+            <w:pPr>
+              <w:spacing w:after="30" w:line="250"/>
+            </w:pPr>
+            <w:r>
+              <w:rPr>
+                <w:rFonts w:ascii="Arial" w:cs="Arial" w:eastAsia="Arial" w:hAnsi="Arial"/>
+                <w:sz w:val="17"/>
+                <w:szCs w:val="17"/>
+              </w:rPr>
+              <w:t xml:space="preserve">Best 1–2 stay</w:t>
+            </w:r>
+          </w:p>
+          <w:p>
+            <w:pPr>
+              <w:spacing w:after="30" w:line="250"/>
+            </w:pPr>
+            <w:r>
+              <w:rPr>
+                <w:rFonts w:ascii="Arial" w:cs="Arial" w:eastAsia="Arial" w:hAnsi="Arial"/>
+                <w:sz w:val="17"/>
+                <w:szCs w:val="17"/>
+              </w:rPr>
+              <w:t xml:space="preserve">Static</w:t>
+            </w:r>
+          </w:p>
+        </w:tc>
+        <w:tc>
+          <w:tcPr>
+            <w:tcW w:type="dxa" w:w="1835"/>
+            <w:tcBorders>
+              <w:top w:val="single" w:color="D9E1EC" w:sz="4"/>
+              <w:left w:val="single" w:color="D9E1EC" w:sz="4"/>
+              <w:bottom w:val="single" w:color="D9E1EC" w:sz="4"/>
+              <w:right w:val="single" w:color="D9E1EC" w:sz="4"/>
+            </w:tcBorders>
+            <w:shd w:fill="EDE8FF" w:color="auto" w:val="clear"/>
+            <w:tcMar>
+              <w:top w:type="dxa" w:w="90"/>
+              <w:left w:type="dxa" w:w="100"/>
+              <w:bottom w:type="dxa" w:w="90"/>
+              <w:right w:type="dxa" w:w="100"/>
+            </w:tcMar>
+            <w:vAlign w:val="center"/>
+          </w:tcPr>
+          <w:p>
+            <w:pPr>
+              <w:spacing w:after="30" w:line="250"/>
+            </w:pPr>
+            <w:r>
+              <w:rPr>
+                <w:rFonts w:ascii="Arial" w:cs="Arial" w:eastAsia="Arial" w:hAnsi="Arial"/>
+                <w:sz w:val="17"/>
+                <w:szCs w:val="17"/>
+              </w:rPr>
+              <w:t xml:space="preserve">If B wins: C2 carousel + C1 photo layout</w:t>
+            </w:r>
+          </w:p>
+        </w:tc>
+        <w:tc>
+          <w:tcPr>
+            <w:tcW w:type="dxa" w:w="1835"/>
+            <w:tcBorders>
+              <w:top w:val="single" w:color="D9E1EC" w:sz="4"/>
+              <w:left w:val="single" w:color="D9E1EC" w:sz="4"/>
+              <w:bottom w:val="single" w:color="D9E1EC" w:sz="4"/>
+              <w:right w:val="single" w:color="D9E1EC" w:sz="4"/>
+            </w:tcBorders>
+            <w:shd w:fill="E3F6EF" w:color="auto" w:val="clear"/>
+            <w:tcMar>
+              <w:top w:type="dxa" w:w="90"/>
+              <w:left w:type="dxa" w:w="100"/>
+              <w:bottom w:type="dxa" w:w="90"/>
+              <w:right w:type="dxa" w:w="100"/>
+            </w:tcMar>
+            <w:vAlign w:val="center"/>
+          </w:tcPr>
+          <w:p>
+            <w:pPr>
+              <w:spacing w:after="30" w:line="250"/>
+            </w:pPr>
+            <w:r>
+              <w:rPr>
+                <w:rFonts w:ascii="Arial" w:cs="Arial" w:eastAsia="Arial" w:hAnsi="Arial"/>
+                <w:sz w:val="17"/>
+                <w:szCs w:val="17"/>
+              </w:rPr>
+              <w:t xml:space="preserve">Real-photo C1 / C4</w:t>
+            </w:r>
+          </w:p>
+        </w:tc>
+      </w:tr>
+      <w:tr>
+        <w:trPr>
+          <w:cantSplit/>
+        </w:trPr>
+        <w:tc>
+          <w:tcPr>
+            <w:tcW w:type="dxa" w:w="2300"/>
+            <w:tcBorders>
+              <w:top w:val="single" w:color="D9E1EC" w:sz="4"/>
+              <w:left w:val="single" w:color="D9E1EC" w:sz="4"/>
+              <w:bottom w:val="single" w:color="D9E1EC" w:sz="4"/>
+              <w:right w:val="single" w:color="D9E1EC" w:sz="4"/>
+            </w:tcBorders>
+            <w:shd w:fill="FFFFFF" w:color="auto" w:val="clear"/>
+            <w:tcMar>
+              <w:top w:type="dxa" w:w="90"/>
+              <w:left w:type="dxa" w:w="100"/>
+              <w:bottom w:type="dxa" w:w="90"/>
+              <w:right w:type="dxa" w:w="100"/>
+            </w:tcMar>
+            <w:vAlign w:val="center"/>
+          </w:tcPr>
+          <w:p>
+            <w:pPr>
+              <w:spacing w:after="30" w:line="250"/>
+            </w:pPr>
+            <w:r>
+              <w:rPr>
+                <w:rFonts w:ascii="Arial" w:cs="Arial" w:eastAsia="Arial" w:hAnsi="Arial"/>
+                <w:b/>
+                <w:bCs/>
+                <w:sz w:val="17"/>
+                <w:szCs w:val="17"/>
+              </w:rPr>
+              <w:t xml:space="preserve">C · Founding offer</w:t>
+            </w:r>
+          </w:p>
+          <w:p>
+            <w:pPr>
+              <w:spacing w:after="30" w:line="250"/>
+            </w:pPr>
+            <w:r>
+              <w:rPr>
+                <w:rFonts w:ascii="Arial" w:cs="Arial" w:eastAsia="Arial" w:hAnsi="Arial"/>
+                <w:sz w:val="17"/>
+                <w:szCs w:val="17"/>
+              </w:rPr>
+              <w:t xml:space="preserve">"Upisujemo prvu generaciju."</w:t>
+            </w:r>
+          </w:p>
+        </w:tc>
+        <w:tc>
+          <w:tcPr>
+            <w:tcW w:type="dxa" w:w="1834"/>
+            <w:tcBorders>
+              <w:top w:val="single" w:color="D9E1EC" w:sz="4"/>
+              <w:left w:val="single" w:color="D9E1EC" w:sz="4"/>
+              <w:bottom w:val="single" w:color="D9E1EC" w:sz="4"/>
+              <w:right w:val="single" w:color="D9E1EC" w:sz="4"/>
+            </w:tcBorders>
+            <w:shd w:fill="E8F2FF" w:color="auto" w:val="clear"/>
+            <w:tcMar>
+              <w:top w:type="dxa" w:w="90"/>
+              <w:left w:type="dxa" w:w="100"/>
+              <w:bottom w:type="dxa" w:w="90"/>
+              <w:right w:type="dxa" w:w="100"/>
+            </w:tcMar>
+            <w:vAlign w:val="center"/>
+          </w:tcPr>
+          <w:p>
+            <w:pPr>
+              <w:spacing w:after="30" w:line="250"/>
+            </w:pPr>
+            <w:r>
+              <w:rPr>
+                <w:rFonts w:ascii="Arial" w:cs="Arial" w:eastAsia="Arial" w:hAnsi="Arial"/>
+                <w:sz w:val="17"/>
+                <w:szCs w:val="17"/>
+              </w:rPr>
+              <w:t xml:space="preserve">P6 (cold audience)</w:t>
+            </w:r>
+          </w:p>
+          <w:p>
+            <w:pPr>
+              <w:spacing w:after="30" w:line="250"/>
+            </w:pPr>
+            <w:r>
+              <w:rPr>
+                <w:rFonts w:ascii="Arial" w:cs="Arial" w:eastAsia="Arial" w:hAnsi="Arial"/>
+                <w:sz w:val="17"/>
+                <w:szCs w:val="17"/>
+              </w:rPr>
+              <w:t xml:space="preserve">Static</w:t>
+            </w:r>
+          </w:p>
+        </w:tc>
+        <w:tc>
+          <w:tcPr>
+            <w:tcW w:type="dxa" w:w="1834"/>
+            <w:tcBorders>
+              <w:top w:val="single" w:color="D9E1EC" w:sz="4"/>
+              <w:left w:val="single" w:color="D9E1EC" w:sz="4"/>
+              <w:bottom w:val="single" w:color="D9E1EC" w:sz="4"/>
+              <w:right w:val="single" w:color="D9E1EC" w:sz="4"/>
+            </w:tcBorders>
+            <w:shd w:fill="E8F2FF" w:color="auto" w:val="clear"/>
+            <w:tcMar>
+              <w:top w:type="dxa" w:w="90"/>
+              <w:left w:type="dxa" w:w="100"/>
+              <w:bottom w:type="dxa" w:w="90"/>
+              <w:right w:type="dxa" w:w="100"/>
+            </w:tcMar>
+            <w:vAlign w:val="center"/>
+          </w:tcPr>
+          <w:p>
+            <w:pPr>
+              <w:spacing w:after="30" w:line="250"/>
+            </w:pPr>
+            <w:r>
+              <w:rPr>
+                <w:rFonts w:ascii="Arial" w:cs="Arial" w:eastAsia="Arial" w:hAnsi="Arial"/>
+                <w:sz w:val="17"/>
+                <w:szCs w:val="17"/>
+              </w:rPr>
+              <w:t xml:space="preserve">P6 + R1 in retargeting</w:t>
+            </w:r>
+          </w:p>
+          <w:p>
+            <w:pPr>
+              <w:spacing w:after="30" w:line="250"/>
+            </w:pPr>
+            <w:r>
+              <w:rPr>
+                <w:rFonts w:ascii="Arial" w:cs="Arial" w:eastAsia="Arial" w:hAnsi="Arial"/>
+                <w:sz w:val="17"/>
+                <w:szCs w:val="17"/>
+              </w:rPr>
+              <w:t xml:space="preserve">Static</w:t>
+            </w:r>
+          </w:p>
+        </w:tc>
+        <w:tc>
+          <w:tcPr>
+            <w:tcW w:type="dxa" w:w="1835"/>
+            <w:tcBorders>
+              <w:top w:val="single" w:color="D9E1EC" w:sz="4"/>
+              <w:left w:val="single" w:color="D9E1EC" w:sz="4"/>
+              <w:bottom w:val="single" w:color="D9E1EC" w:sz="4"/>
+              <w:right w:val="single" w:color="D9E1EC" w:sz="4"/>
+            </w:tcBorders>
+            <w:shd w:fill="E8F2FF" w:color="auto" w:val="clear"/>
+            <w:tcMar>
+              <w:top w:type="dxa" w:w="90"/>
+              <w:left w:type="dxa" w:w="100"/>
+              <w:bottom w:type="dxa" w:w="90"/>
+              <w:right w:type="dxa" w:w="100"/>
+            </w:tcMar>
+            <w:vAlign w:val="center"/>
+          </w:tcPr>
+          <w:p>
+            <w:pPr>
+              <w:spacing w:after="30" w:line="250"/>
+            </w:pPr>
+            <w:r>
+              <w:rPr>
+                <w:rFonts w:ascii="Arial" w:cs="Arial" w:eastAsia="Arial" w:hAnsi="Arial"/>
+                <w:sz w:val="17"/>
+                <w:szCs w:val="17"/>
+              </w:rPr>
+              <w:t xml:space="preserve">R1 price-led vs R2 FAQ</w:t>
+            </w:r>
+          </w:p>
+          <w:p>
+            <w:pPr>
+              <w:spacing w:after="30" w:line="250"/>
+            </w:pPr>
+            <w:r>
+              <w:rPr>
+                <w:rFonts w:ascii="Arial" w:cs="Arial" w:eastAsia="Arial" w:hAnsi="Arial"/>
+                <w:sz w:val="17"/>
+                <w:szCs w:val="17"/>
+              </w:rPr>
+              <w:t xml:space="preserve">Static</w:t>
+            </w:r>
+          </w:p>
+        </w:tc>
+        <w:tc>
+          <w:tcPr>
+            <w:tcW w:type="dxa" w:w="1835"/>
+            <w:tcBorders>
+              <w:top w:val="single" w:color="D9E1EC" w:sz="4"/>
+              <w:left w:val="single" w:color="D9E1EC" w:sz="4"/>
+              <w:bottom w:val="single" w:color="D9E1EC" w:sz="4"/>
+              <w:right w:val="single" w:color="D9E1EC" w:sz="4"/>
+            </w:tcBorders>
+            <w:shd w:fill="E3F6EF" w:color="auto" w:val="clear"/>
+            <w:tcMar>
+              <w:top w:type="dxa" w:w="90"/>
+              <w:left w:type="dxa" w:w="100"/>
+              <w:bottom w:type="dxa" w:w="90"/>
+              <w:right w:type="dxa" w:w="100"/>
+            </w:tcMar>
+            <w:vAlign w:val="center"/>
+          </w:tcPr>
+          <w:p>
+            <w:pPr>
+              <w:spacing w:after="30" w:line="250"/>
+            </w:pPr>
+            <w:r>
+              <w:rPr>
+                <w:rFonts w:ascii="Arial" w:cs="Arial" w:eastAsia="Arial" w:hAnsi="Arial"/>
+                <w:sz w:val="17"/>
+                <w:szCs w:val="17"/>
+              </w:rPr>
+              <w:t xml:space="preserve">R4 "Poslednja mesta" + parent quote</w:t>
+            </w:r>
+          </w:p>
+        </w:tc>
+      </w:tr>
+      <w:tr>
+        <w:trPr>
+          <w:cantSplit/>
+        </w:trPr>
+        <w:tc>
+          <w:tcPr>
+            <w:tcW w:type="dxa" w:w="2300"/>
+            <w:tcBorders>
+              <w:top w:val="single" w:color="D9E1EC" w:sz="4"/>
+              <w:left w:val="single" w:color="D9E1EC" w:sz="4"/>
+              <w:bottom w:val="single" w:color="D9E1EC" w:sz="4"/>
+              <w:right w:val="single" w:color="D9E1EC" w:sz="4"/>
+            </w:tcBorders>
+            <w:shd w:fill="FFFFFF" w:color="auto" w:val="clear"/>
+            <w:tcMar>
+              <w:top w:type="dxa" w:w="90"/>
+              <w:left w:type="dxa" w:w="100"/>
+              <w:bottom w:type="dxa" w:w="90"/>
+              <w:right w:type="dxa" w:w="100"/>
+            </w:tcMar>
+            <w:vAlign w:val="center"/>
+          </w:tcPr>
+          <w:p>
+            <w:pPr>
+              <w:spacing w:after="30" w:line="250"/>
+            </w:pPr>
+            <w:r>
+              <w:rPr>
+                <w:rFonts w:ascii="Arial" w:cs="Arial" w:eastAsia="Arial" w:hAnsi="Arial"/>
+                <w:b/>
+                <w:bCs/>
+                <w:sz w:val="17"/>
+                <w:szCs w:val="17"/>
+              </w:rPr>
+              <w:t xml:space="preserve">D · Open Day</w:t>
+            </w:r>
+          </w:p>
+          <w:p>
+            <w:pPr>
+              <w:spacing w:after="30" w:line="250"/>
+            </w:pPr>
+            <w:r>
+              <w:rPr>
+                <w:rFonts w:ascii="Arial" w:cs="Arial" w:eastAsia="Arial" w:hAnsi="Arial"/>
+                <w:sz w:val="17"/>
+                <w:szCs w:val="17"/>
+              </w:rPr>
+              <w:t xml:space="preserve">"Neka dete isproba."</w:t>
+            </w:r>
+          </w:p>
+        </w:tc>
+        <w:tc>
+          <w:tcPr>
+            <w:tcW w:type="dxa" w:w="1834"/>
+            <w:tcBorders>
+              <w:top w:val="single" w:color="D9E1EC" w:sz="4"/>
+              <w:left w:val="single" w:color="D9E1EC" w:sz="4"/>
+              <w:bottom w:val="single" w:color="D9E1EC" w:sz="4"/>
+              <w:right w:val="single" w:color="D9E1EC" w:sz="4"/>
+            </w:tcBorders>
+            <w:shd w:fill="F1F5F9" w:color="auto" w:val="clear"/>
+            <w:tcMar>
+              <w:top w:type="dxa" w:w="90"/>
+              <w:left w:type="dxa" w:w="100"/>
+              <w:bottom w:type="dxa" w:w="90"/>
+              <w:right w:type="dxa" w:w="100"/>
+            </w:tcMar>
+            <w:vAlign w:val="center"/>
+          </w:tcPr>
+          <w:p>
+            <w:pPr>
+              <w:spacing w:after="30" w:line="250"/>
+            </w:pPr>
+            <w:r>
+              <w:rPr>
+                <w:rFonts w:ascii="Arial" w:cs="Arial" w:eastAsia="Arial" w:hAnsi="Arial"/>
+                <w:sz w:val="17"/>
+                <w:szCs w:val="17"/>
+              </w:rPr>
+              <w:t xml:space="preserve">Off — design prep</w:t>
+            </w:r>
+          </w:p>
+        </w:tc>
+        <w:tc>
+          <w:tcPr>
+            <w:tcW w:type="dxa" w:w="1834"/>
+            <w:tcBorders>
+              <w:top w:val="single" w:color="D9E1EC" w:sz="4"/>
+              <w:left w:val="single" w:color="D9E1EC" w:sz="4"/>
+              <w:bottom w:val="single" w:color="D9E1EC" w:sz="4"/>
+              <w:right w:val="single" w:color="D9E1EC" w:sz="4"/>
+            </w:tcBorders>
+            <w:shd w:fill="E8F2FF" w:color="auto" w:val="clear"/>
+            <w:tcMar>
+              <w:top w:type="dxa" w:w="90"/>
+              <w:left w:type="dxa" w:w="100"/>
+              <w:bottom w:type="dxa" w:w="90"/>
+              <w:right w:type="dxa" w:w="100"/>
+            </w:tcMar>
+            <w:vAlign w:val="center"/>
+          </w:tcPr>
+          <w:p>
+            <w:pPr>
+              <w:spacing w:after="30" w:line="250"/>
+            </w:pPr>
+            <w:r>
+              <w:rPr>
+                <w:rFonts w:ascii="Arial" w:cs="Arial" w:eastAsia="Arial" w:hAnsi="Arial"/>
+                <w:sz w:val="17"/>
+                <w:szCs w:val="17"/>
+              </w:rPr>
+              <w:t xml:space="preserve">O1 (feed + story), O2 recut, R3</w:t>
+            </w:r>
+          </w:p>
+          <w:p>
+            <w:pPr>
+              <w:spacing w:after="30" w:line="250"/>
+            </w:pPr>
+            <w:r>
+              <w:rPr>
+                <w:rFonts w:ascii="Arial" w:cs="Arial" w:eastAsia="Arial" w:hAnsi="Arial"/>
+                <w:sz w:val="17"/>
+                <w:szCs w:val="17"/>
+              </w:rPr>
+              <w:t xml:space="preserve">Static</w:t>
+            </w:r>
+          </w:p>
+        </w:tc>
+        <w:tc>
+          <w:tcPr>
+            <w:tcW w:type="dxa" w:w="1835"/>
+            <w:tcBorders>
+              <w:top w:val="single" w:color="D9E1EC" w:sz="4"/>
+              <w:left w:val="single" w:color="D9E1EC" w:sz="4"/>
+              <w:bottom w:val="single" w:color="D9E1EC" w:sz="4"/>
+              <w:right w:val="single" w:color="D9E1EC" w:sz="4"/>
+            </w:tcBorders>
+            <w:shd w:fill="E8F2FF" w:color="auto" w:val="clear"/>
+            <w:tcMar>
+              <w:top w:type="dxa" w:w="90"/>
+              <w:left w:type="dxa" w:w="100"/>
+              <w:bottom w:type="dxa" w:w="90"/>
+              <w:right w:type="dxa" w:w="100"/>
+            </w:tcMar>
+            <w:vAlign w:val="center"/>
+          </w:tcPr>
+          <w:p>
+            <w:pPr>
+              <w:spacing w:after="30" w:line="250"/>
+            </w:pPr>
+            <w:r>
+              <w:rPr>
+                <w:rFonts w:ascii="Arial" w:cs="Arial" w:eastAsia="Arial" w:hAnsi="Arial"/>
+                <w:sz w:val="17"/>
+                <w:szCs w:val="17"/>
+              </w:rPr>
+              <w:t xml:space="preserve">O1 vs O3 countdown · ends 23 Oct · Open Day Sat 24</w:t>
+            </w:r>
+          </w:p>
+        </w:tc>
+        <w:tc>
+          <w:tcPr>
+            <w:tcW w:type="dxa" w:w="1835"/>
+            <w:tcBorders>
+              <w:top w:val="single" w:color="D9E1EC" w:sz="4"/>
+              <w:left w:val="single" w:color="D9E1EC" w:sz="4"/>
+              <w:bottom w:val="single" w:color="D9E1EC" w:sz="4"/>
+              <w:right w:val="single" w:color="D9E1EC" w:sz="4"/>
+            </w:tcBorders>
+            <w:shd w:fill="E3F6EF" w:color="auto" w:val="clear"/>
+            <w:tcMar>
+              <w:top w:type="dxa" w:w="90"/>
+              <w:left w:type="dxa" w:w="100"/>
+              <w:bottom w:type="dxa" w:w="90"/>
+              <w:right w:type="dxa" w:w="100"/>
+            </w:tcMar>
+            <w:vAlign w:val="center"/>
+          </w:tcPr>
+          <w:p>
+            <w:pPr>
+              <w:spacing w:after="30" w:line="250"/>
+            </w:pPr>
+            <w:r>
+              <w:rPr>
+                <w:rFonts w:ascii="Arial" w:cs="Arial" w:eastAsia="Arial" w:hAnsi="Arial"/>
+                <w:sz w:val="17"/>
+                <w:szCs w:val="17"/>
+              </w:rPr>
+              <w:t xml:space="preserve">R5 recap</w:t>
+            </w:r>
+          </w:p>
+          <w:p>
+            <w:pPr>
+              <w:spacing w:after="30" w:line="250"/>
+            </w:pPr>
+            <w:r>
+              <w:rPr>
+                <w:rFonts w:ascii="Arial" w:cs="Arial" w:eastAsia="Arial" w:hAnsi="Arial"/>
+                <w:sz w:val="17"/>
+                <w:szCs w:val="17"/>
+              </w:rPr>
+              <w:t xml:space="preserve">Real photos</w:t>
+            </w:r>
+          </w:p>
+        </w:tc>
+      </w:tr>
+    </w:tbl>
+    <w:p>
+      <w:pPr>
+        <w:spacing w:after="80"/>
+      </w:pPr>
+    </w:p>
+    <w:tbl>
+      <w:tblPr>
+        <w:tblW w:type="dxa" w:w="9636"/>
+        <w:tblBorders>
+          <w:top w:val="single" w:color="auto" w:sz="4"/>
+          <w:left w:val="single" w:color="auto" w:sz="4"/>
+          <w:bottom w:val="single" w:color="auto" w:sz="4"/>
+          <w:right w:val="single" w:color="auto" w:sz="4"/>
+          <w:insideH w:val="single" w:color="auto" w:sz="4"/>
+          <w:insideV w:val="single" w:color="auto" w:sz="4"/>
+        </w:tblBorders>
+      </w:tblPr>
+      <w:tblGrid>
+        <w:gridCol w:w="2409"/>
+        <w:gridCol w:w="2409"/>
+        <w:gridCol w:w="2409"/>
+        <w:gridCol w:w="2409"/>
+      </w:tblGrid>
+      <w:tr>
+        <w:tc>
+          <w:tcPr>
+            <w:tcW w:type="dxa" w:w="2409"/>
+            <w:tcBorders>
+              <w:top w:val="none" w:color="FFFFFF" w:sz="0"/>
+              <w:left w:val="none" w:color="FFFFFF" w:sz="0"/>
+              <w:bottom w:val="none" w:color="FFFFFF" w:sz="0"/>
+              <w:right w:val="single" w:color="FFFFFF" w:sz="24"/>
+            </w:tcBorders>
+            <w:shd w:fill="E8F2FF" w:color="auto" w:val="clear"/>
+            <w:tcMar>
+              <w:top w:type="dxa" w:w="50"/>
+              <w:left w:type="dxa" w:w="100"/>
+              <w:bottom w:type="dxa" w:w="50"/>
+              <w:right w:type="dxa" w:w="100"/>
+            </w:tcMar>
+          </w:tcPr>
+          <w:p>
+            <w:pPr>
+              <w:spacing w:after="30" w:line="250"/>
+              <w:jc w:val="center"/>
+            </w:pPr>
+            <w:r>
+              <w:rPr>
+                <w:rFonts w:ascii="Arial" w:cs="Arial" w:eastAsia="Arial" w:hAnsi="Arial"/>
+                <w:sz w:val="15"/>
+                <w:szCs w:val="15"/>
+              </w:rPr>
+              <w:t xml:space="preserve">Static — feed 4:5 + story 9:16</w:t>
+            </w:r>
+          </w:p>
+        </w:tc>
+        <w:tc>
+          <w:tcPr>
+            <w:tcW w:type="dxa" w:w="2409"/>
+            <w:tcBorders>
+              <w:top w:val="none" w:color="FFFFFF" w:sz="0"/>
+              <w:left w:val="none" w:color="FFFFFF" w:sz="0"/>
+              <w:bottom w:val="none" w:color="FFFFFF" w:sz="0"/>
+              <w:right w:val="single" w:color="FFFFFF" w:sz="24"/>
+            </w:tcBorders>
+            <w:shd w:fill="EDE8FF" w:color="auto" w:val="clear"/>
+            <w:tcMar>
+              <w:top w:type="dxa" w:w="50"/>
+              <w:left w:type="dxa" w:w="100"/>
+              <w:bottom w:type="dxa" w:w="50"/>
+              <w:right w:type="dxa" w:w="100"/>
+            </w:tcMar>
+          </w:tcPr>
+          <w:p>
+            <w:pPr>
+              <w:spacing w:after="30" w:line="250"/>
+              <w:jc w:val="center"/>
+            </w:pPr>
+            <w:r>
+              <w:rPr>
+                <w:rFonts w:ascii="Arial" w:cs="Arial" w:eastAsia="Arial" w:hAnsi="Arial"/>
+                <w:sz w:val="15"/>
+                <w:szCs w:val="15"/>
+              </w:rPr>
+              <w:t xml:space="preserve">Motion / carousel (test)</w:t>
+            </w:r>
+          </w:p>
+        </w:tc>
+        <w:tc>
+          <w:tcPr>
+            <w:tcW w:type="dxa" w:w="2409"/>
+            <w:tcBorders>
+              <w:top w:val="none" w:color="FFFFFF" w:sz="0"/>
+              <w:left w:val="none" w:color="FFFFFF" w:sz="0"/>
+              <w:bottom w:val="none" w:color="FFFFFF" w:sz="0"/>
+              <w:right w:val="single" w:color="FFFFFF" w:sz="24"/>
+            </w:tcBorders>
+            <w:shd w:fill="E3F6EF" w:color="auto" w:val="clear"/>
+            <w:tcMar>
+              <w:top w:type="dxa" w:w="50"/>
+              <w:left w:type="dxa" w:w="100"/>
+              <w:bottom w:type="dxa" w:w="50"/>
+              <w:right w:type="dxa" w:w="100"/>
+            </w:tcMar>
+          </w:tcPr>
+          <w:p>
+            <w:pPr>
+              <w:spacing w:after="30" w:line="250"/>
+              <w:jc w:val="center"/>
+            </w:pPr>
+            <w:r>
+              <w:rPr>
+                <w:rFonts w:ascii="Arial" w:cs="Arial" w:eastAsia="Arial" w:hAnsi="Arial"/>
+                <w:sz w:val="15"/>
+                <w:szCs w:val="15"/>
+              </w:rPr>
+              <w:t xml:space="preserve">Real photo / video</w:t>
+            </w:r>
+          </w:p>
+        </w:tc>
+        <w:tc>
+          <w:tcPr>
+            <w:tcW w:type="dxa" w:w="2409"/>
+            <w:tcBorders>
+              <w:top w:val="none" w:color="FFFFFF" w:sz="0"/>
+              <w:left w:val="none" w:color="FFFFFF" w:sz="0"/>
+              <w:bottom w:val="none" w:color="FFFFFF" w:sz="0"/>
+              <w:right w:val="single" w:color="FFFFFF" w:sz="24"/>
+            </w:tcBorders>
+            <w:shd w:fill="F1F5F9" w:color="auto" w:val="clear"/>
+            <w:tcMar>
+              <w:top w:type="dxa" w:w="50"/>
+              <w:left w:type="dxa" w:w="100"/>
+              <w:bottom w:type="dxa" w:w="50"/>
+              <w:right w:type="dxa" w:w="100"/>
+            </w:tcMar>
+          </w:tcPr>
+          <w:p>
+            <w:pPr>
+              <w:spacing w:after="30" w:line="250"/>
+              <w:jc w:val="center"/>
+            </w:pPr>
+            <w:r>
+              <w:rPr>
+                <w:rFonts w:ascii="Arial" w:cs="Arial" w:eastAsia="Arial" w:hAnsi="Arial"/>
+                <w:sz w:val="15"/>
+                <w:szCs w:val="15"/>
+              </w:rPr>
+              <w:t xml:space="preserve">Off</w:t>
+            </w:r>
+          </w:p>
+        </w:tc>
+      </w:tr>
+    </w:tbl>
+    <w:p>
+      <w:pPr>
+        <w:pStyle w:val="Heading3"/>
+        <w:keepNext/>
+      </w:pPr>
+      <w:r>
+        <w:rPr>
+          <w:rFonts w:ascii="Arial" w:cs="Arial" w:eastAsia="Arial" w:hAnsi="Arial"/>
+        </w:rPr>
+        <w:t xml:space="preserve">Why everything starts static</w:t>
+      </w:r>
+    </w:p>
+    <w:p>
+      <w:pPr>
+        <w:pStyle w:val="ListParagraph"/>
+        <w:numPr>
+          <w:ilvl w:val="0"/>
+          <w:numId w:val="3"/>
+        </w:numPr>
+        <w:spacing w:after="60" w:line="264"/>
+      </w:pPr>
+      <w:r>
+        <w:rPr>
+          <w:rFonts w:ascii="Arial" w:cs="Arial" w:eastAsia="Arial" w:hAnsi="Arial"/>
+          <w:b/>
+          <w:bCs/>
+        </w:rPr>
+        <w:t xml:space="preserve">No photos or video exist yet</w:t>
+      </w:r>
+      <w:r>
+        <w:rPr>
+          <w:rFonts w:ascii="Arial" w:cs="Arial" w:eastAsia="Arial" w:hAnsi="Arial"/>
+        </w:rPr>
+        <w:t xml:space="preserve"> — the shoot happens around the Open Day, so week 1–2 can only be designed graphics.</w:t>
+      </w:r>
+    </w:p>
+    <w:p>
+      <w:pPr>
+        <w:pStyle w:val="ListParagraph"/>
+        <w:numPr>
+          <w:ilvl w:val="0"/>
+          <w:numId w:val="3"/>
+        </w:numPr>
+        <w:spacing w:after="60" w:line="264"/>
+      </w:pPr>
+      <w:r>
+        <w:rPr>
+          <w:rFonts w:ascii="Arial" w:cs="Arial" w:eastAsia="Arial" w:hAnsi="Arial"/>
+          <w:b/>
+          <w:bCs/>
+        </w:rPr>
+        <w:t xml:space="preserve">Statics are the cleanest way to test messages.</w:t>
+      </w:r>
+      <w:r>
+        <w:rPr>
+          <w:rFonts w:ascii="Arial" w:cs="Arial" w:eastAsia="Arial" w:hAnsi="Arial"/>
+        </w:rPr>
+        <w:t xml:space="preserve"> When the only difference between ads is the angle, we know the angle won — not the editing or the music.</w:t>
+      </w:r>
+    </w:p>
+    <w:p>
+      <w:pPr>
+        <w:pStyle w:val="ListParagraph"/>
+        <w:numPr>
+          <w:ilvl w:val="0"/>
+          <w:numId w:val="3"/>
+        </w:numPr>
+        <w:spacing w:after="60" w:line="264"/>
+      </w:pPr>
+      <w:r>
+        <w:rPr>
+          <w:rFonts w:ascii="Arial" w:cs="Arial" w:eastAsia="Arial" w:hAnsi="Arial"/>
+          <w:b/>
+          <w:bCs/>
+        </w:rPr>
+        <w:t xml:space="preserve">Fast to make:</w:t>
+      </w:r>
+      <w:r>
+        <w:rPr>
+          <w:rFonts w:ascii="Arial" w:cs="Arial" w:eastAsia="Arial" w:hAnsi="Arial"/>
+        </w:rPr>
+        <w:t xml:space="preserve"> Nikola can ship all 6 by launch. Every static also gets a native 9:16 story version, so Stories and Reels placements are covered from day 1.</w:t>
+      </w:r>
+    </w:p>
+    <w:p>
+      <w:pPr>
+        <w:pStyle w:val="ListParagraph"/>
+        <w:numPr>
+          <w:ilvl w:val="0"/>
+          <w:numId w:val="3"/>
+        </w:numPr>
+        <w:spacing w:after="60" w:line="264"/>
+      </w:pPr>
+      <w:r>
+        <w:rPr>
+          <w:rFonts w:ascii="Arial" w:cs="Arial" w:eastAsia="Arial" w:hAnsi="Arial"/>
+          <w:b/>
+          <w:bCs/>
+        </w:rPr>
+        <w:t xml:space="preserve">Motion comes in week 3, only for the winning angle</w:t>
+      </w:r>
+      <w:r>
+        <w:rPr>
+          <w:rFonts w:ascii="Arial" w:cs="Arial" w:eastAsia="Arial" w:hAnsi="Arial"/>
+        </w:rPr>
+        <w:t xml:space="preserve"> — no animation budget wasted on angles that lose. Real video comes in week 4 from the shoot / Open Day.</w:t>
+      </w:r>
+    </w:p>
+    <w:p>
+      <w:pPr>
+        <w:pStyle w:val="ListParagraph"/>
+        <w:numPr>
+          <w:ilvl w:val="0"/>
+          <w:numId w:val="3"/>
+        </w:numPr>
+        <w:spacing w:after="60" w:line="264"/>
+      </w:pPr>
+      <w:r>
+        <w:rPr>
+          <w:rFonts w:ascii="Arial" w:cs="Arial" w:eastAsia="Arial" w:hAnsi="Arial"/>
+          <w:b/>
+          <w:bCs/>
+        </w:rPr>
+        <w:t xml:space="preserve">Optional upgrade if there's time:</w:t>
+      </w:r>
+      <w:r>
+        <w:rPr>
+          <w:rFonts w:ascii="Arial" w:cs="Arial" w:eastAsia="Arial" w:hAnsi="Arial"/>
+        </w:rPr>
+        <w:t xml:space="preserve"> animate the 9:16 versions of P4 (C3) and O1 (C6) — 6 s, same design, text builds in. Reels placements tend to favour motion, and it needs no footage.</w:t>
+      </w:r>
+    </w:p>
     <w:p>
       <w:pPr>
         <w:pStyle w:val="Heading1"/>

</xml_diff>

<commit_message>
Weave angle timing and format through the Meta creative plan
Week + format on the cover, at-a-glance, format specs, per-campaign
week strips, every ad card, test rounds, iteration library, gallery
captions and the calendar, with a shared colour legend. Test rounds
renamed to avoid clashing with retargeting ad IDs.

Co-Authored-By: Claude Opus 5.5 <noreply@anthropic.com>
Claude-Session: https://claude.ai/code/session_01WYxT2oKqHUxfsBrXZ2Myb2
</commit_message>
<xml_diff>
--- a/nxt-school-launch/NXT_Meta_Creative_Plan.docx
+++ b/nxt-school-launch/NXT_Meta_Creative_Plan.docx
@@ -4,7 +4,7 @@
   <w:body>
     <w:p>
       <w:pPr>
-        <w:spacing w:after="140" w:before="400"/>
+        <w:spacing w:after="100" w:before="0"/>
       </w:pPr>
       <w:r>
         <w:rPr>
@@ -37,7 +37,7 @@
     </w:p>
     <w:p>
       <w:pPr>
-        <w:spacing w:after="260"/>
+        <w:spacing w:after="180"/>
       </w:pPr>
       <w:r>
         <w:rPr>
@@ -305,6 +305,111 @@
                 <w:sz w:val="18"/>
                 <w:szCs w:val="18"/>
               </w:rPr>
+              <w:t xml:space="preserve">How it runs</w:t>
+            </w:r>
+          </w:p>
+        </w:tc>
+        <w:tc>
+          <w:tcPr>
+            <w:tcW w:type="dxa" w:w="7638"/>
+            <w:tcBorders>
+              <w:top w:val="single" w:color="D9E1EC" w:sz="4"/>
+              <w:left w:val="single" w:color="D9E1EC" w:sz="4"/>
+              <w:bottom w:val="single" w:color="D9E1EC" w:sz="4"/>
+              <w:right w:val="single" w:color="D9E1EC" w:sz="4"/>
+            </w:tcBorders>
+            <w:shd w:fill="F8FAFC" w:color="auto" w:val="clear"/>
+            <w:tcMar>
+              <w:top w:type="dxa" w:w="60"/>
+              <w:left w:type="dxa" w:w="100"/>
+              <w:bottom w:type="dxa" w:w="60"/>
+              <w:right w:type="dxa" w:w="100"/>
+            </w:tcMar>
+          </w:tcPr>
+          <w:p>
+            <w:pPr>
+              <w:spacing w:after="30" w:line="250"/>
+            </w:pPr>
+            <w:r>
+              <w:rPr>
+                <w:rFonts w:ascii="Arial" w:cs="Arial" w:eastAsia="Arial" w:hAnsi="Arial"/>
+                <w:sz w:val="18"/>
+                <w:szCs w:val="18"/>
+              </w:rPr>
+              <w:t xml:space="preserve">Angles A, B and C run </w:t>
+            </w:r>
+            <w:r>
+              <w:rPr>
+                <w:rFonts w:ascii="Arial" w:cs="Arial" w:eastAsia="Arial" w:hAnsi="Arial"/>
+                <w:b/>
+                <w:bCs/>
+                <w:sz w:val="18"/>
+                <w:szCs w:val="18"/>
+              </w:rPr>
+              <w:t xml:space="preserve">in parallel from day 1</w:t>
+            </w:r>
+            <w:r>
+              <w:rPr>
+                <w:rFonts w:ascii="Arial" w:cs="Arial" w:eastAsia="Arial" w:hAnsi="Arial"/>
+                <w:sz w:val="18"/>
+                <w:szCs w:val="18"/>
+              </w:rPr>
+              <w:t xml:space="preserve"> (that is the test) · angle D (Open Day) runs 12–23 Oct · </w:t>
+            </w:r>
+            <w:r>
+              <w:rPr>
+                <w:rFonts w:ascii="Arial" w:cs="Arial" w:eastAsia="Arial" w:hAnsi="Arial"/>
+                <w:b/>
+                <w:bCs/>
+                <w:sz w:val="18"/>
+                <w:szCs w:val="18"/>
+              </w:rPr>
+              <w:t xml:space="preserve">static first</w:t>
+            </w:r>
+            <w:r>
+              <w:rPr>
+                <w:rFonts w:ascii="Arial" w:cs="Arial" w:eastAsia="Arial" w:hAnsi="Arial"/>
+                <w:sz w:val="18"/>
+                <w:szCs w:val="18"/>
+              </w:rPr>
+              <w:t xml:space="preserve"> (W1–W2) → motion / carousel for the winner only (W3) → real photo / video (W4). Every ad below shows its week + format; colours: blue = static, purple = motion/carousel, green = real photo/video.</w:t>
+            </w:r>
+          </w:p>
+        </w:tc>
+      </w:tr>
+      <w:tr>
+        <w:trPr>
+          <w:cantSplit/>
+        </w:trPr>
+        <w:tc>
+          <w:tcPr>
+            <w:tcW w:type="dxa" w:w="2000"/>
+            <w:tcBorders>
+              <w:top w:val="single" w:color="D9E1EC" w:sz="4"/>
+              <w:left w:val="single" w:color="D9E1EC" w:sz="4"/>
+              <w:bottom w:val="single" w:color="D9E1EC" w:sz="4"/>
+              <w:right w:val="single" w:color="D9E1EC" w:sz="4"/>
+            </w:tcBorders>
+            <w:shd w:fill="F1F5F9" w:color="auto" w:val="clear"/>
+            <w:tcMar>
+              <w:top w:type="dxa" w:w="60"/>
+              <w:left w:type="dxa" w:w="100"/>
+              <w:bottom w:type="dxa" w:w="60"/>
+              <w:right w:type="dxa" w:w="100"/>
+            </w:tcMar>
+          </w:tcPr>
+          <w:p>
+            <w:pPr>
+              <w:spacing w:after="30" w:line="250"/>
+            </w:pPr>
+            <w:r>
+              <w:rPr>
+                <w:rFonts w:ascii="Arial" w:cs="Arial" w:eastAsia="Arial" w:hAnsi="Arial"/>
+                <w:b/>
+                <w:bCs/>
+                <w:sz w:val="18"/>
+                <w:szCs w:val="18"/>
+              </w:rPr>
               <w:t xml:space="preserve">Status of visuals</w:t>
             </w:r>
           </w:p>
@@ -318,7 +423,7 @@
               <w:bottom w:val="single" w:color="D9E1EC" w:sz="4"/>
               <w:right w:val="single" w:color="D9E1EC" w:sz="4"/>
             </w:tcBorders>
-            <w:shd w:fill="F8FAFC" w:color="auto" w:val="clear"/>
+            <w:shd w:fill="FFFFFF" w:color="auto" w:val="clear"/>
             <w:tcMar>
               <w:top w:type="dxa" w:w="60"/>
               <w:left w:type="dxa" w:w="100"/>
@@ -362,7 +467,7 @@
     </w:tbl>
     <w:p>
       <w:pPr>
-        <w:spacing w:after="200"/>
+        <w:spacing w:after="60"/>
       </w:pPr>
     </w:p>
     <w:p>
@@ -463,7 +568,23 @@
                 <w:sz w:val="18"/>
                 <w:szCs w:val="18"/>
               </w:rPr>
-              <w:t xml:space="preserve">START (launch)</w:t>
+              <w:t xml:space="preserve">START · W1–W2</w:t>
+            </w:r>
+          </w:p>
+          <w:p>
+            <w:pPr>
+              <w:spacing w:after="30" w:line="250"/>
+            </w:pPr>
+            <w:r>
+              <w:rPr>
+                <w:rFonts w:ascii="Arial" w:cs="Arial" w:eastAsia="Arial" w:hAnsi="Arial"/>
+                <w:b/>
+                <w:bCs/>
+                <w:color w:val="FFFFFF"/>
+                <w:sz w:val="18"/>
+                <w:szCs w:val="18"/>
+              </w:rPr>
+              <w:t xml:space="preserve">static</w:t>
             </w:r>
           </w:p>
         </w:tc>
@@ -497,7 +618,23 @@
                 <w:sz w:val="18"/>
                 <w:szCs w:val="18"/>
               </w:rPr>
-              <w:t xml:space="preserve">TEST next</w:t>
+              <w:t xml:space="preserve">TEST · W3</w:t>
+            </w:r>
+          </w:p>
+          <w:p>
+            <w:pPr>
+              <w:spacing w:after="30" w:line="250"/>
+            </w:pPr>
+            <w:r>
+              <w:rPr>
+                <w:rFonts w:ascii="Arial" w:cs="Arial" w:eastAsia="Arial" w:hAnsi="Arial"/>
+                <w:b/>
+                <w:bCs/>
+                <w:color w:val="FFFFFF"/>
+                <w:sz w:val="18"/>
+                <w:szCs w:val="18"/>
+              </w:rPr>
+              <w:t xml:space="preserve">winner only</w:t>
             </w:r>
           </w:p>
         </w:tc>
@@ -531,7 +668,23 @@
                 <w:sz w:val="18"/>
                 <w:szCs w:val="18"/>
               </w:rPr>
-              <w:t xml:space="preserve">SWAP IN later</w:t>
+              <w:t xml:space="preserve">SWAP IN · W4</w:t>
+            </w:r>
+          </w:p>
+          <w:p>
+            <w:pPr>
+              <w:spacing w:after="30" w:line="250"/>
+            </w:pPr>
+            <w:r>
+              <w:rPr>
+                <w:rFonts w:ascii="Arial" w:cs="Arial" w:eastAsia="Arial" w:hAnsi="Arial"/>
+                <w:b/>
+                <w:bCs/>
+                <w:color w:val="FFFFFF"/>
+                <w:sz w:val="18"/>
+                <w:szCs w:val="18"/>
+              </w:rPr>
+              <w:t xml:space="preserve">real photo / video</w:t>
             </w:r>
           </w:p>
         </w:tc>
@@ -608,90 +761,105 @@
               <w:bottom w:val="single" w:color="D9E1EC" w:sz="4"/>
               <w:right w:val="single" w:color="D9E1EC" w:sz="4"/>
             </w:tcBorders>
-            <w:shd w:fill="FFFFFF" w:color="auto" w:val="clear"/>
-            <w:tcMar>
-              <w:top w:type="dxa" w:w="60"/>
-              <w:left w:type="dxa" w:w="100"/>
-              <w:bottom w:type="dxa" w:w="60"/>
-              <w:right w:type="dxa" w:w="100"/>
-            </w:tcMar>
-          </w:tcPr>
-          <w:p>
-            <w:pPr>
-              <w:spacing w:after="30" w:line="250"/>
-            </w:pPr>
-            <w:r>
-              <w:rPr>
-                <w:rFonts w:ascii="Arial" w:cs="Arial" w:eastAsia="Arial" w:hAnsi="Arial"/>
-                <w:sz w:val="18"/>
-                <w:szCs w:val="18"/>
-              </w:rPr>
-              <w:t xml:space="preserve">P1 C1 Hero (angle B)</w:t>
-            </w:r>
-          </w:p>
-          <w:p>
-            <w:pPr>
-              <w:spacing w:after="30" w:line="250"/>
-            </w:pPr>
-            <w:r>
-              <w:rPr>
-                <w:rFonts w:ascii="Arial" w:cs="Arial" w:eastAsia="Arial" w:hAnsi="Arial"/>
-                <w:sz w:val="18"/>
-                <w:szCs w:val="18"/>
-              </w:rPr>
-              <w:t xml:space="preserve">P2 C1 Hero (angle A)</w:t>
-            </w:r>
-          </w:p>
-          <w:p>
-            <w:pPr>
-              <w:spacing w:after="30" w:line="250"/>
-            </w:pPr>
-            <w:r>
-              <w:rPr>
-                <w:rFonts w:ascii="Arial" w:cs="Arial" w:eastAsia="Arial" w:hAnsi="Arial"/>
-                <w:sz w:val="18"/>
-                <w:szCs w:val="18"/>
-              </w:rPr>
-              <w:t xml:space="preserve">P3 C2 Future Skills</w:t>
-            </w:r>
-          </w:p>
-          <w:p>
-            <w:pPr>
-              <w:spacing w:after="30" w:line="250"/>
-            </w:pPr>
-            <w:r>
-              <w:rPr>
-                <w:rFonts w:ascii="Arial" w:cs="Arial" w:eastAsia="Arial" w:hAnsi="Arial"/>
-                <w:sz w:val="18"/>
-                <w:szCs w:val="18"/>
-              </w:rPr>
-              <w:t xml:space="preserve">P4 C3 Less scrolling</w:t>
-            </w:r>
-          </w:p>
-          <w:p>
-            <w:pPr>
-              <w:spacing w:after="30" w:line="250"/>
-            </w:pPr>
-            <w:r>
-              <w:rPr>
-                <w:rFonts w:ascii="Arial" w:cs="Arial" w:eastAsia="Arial" w:hAnsi="Arial"/>
-                <w:sz w:val="18"/>
-                <w:szCs w:val="18"/>
-              </w:rPr>
-              <w:t xml:space="preserve">P5 C4 English + AI</w:t>
-            </w:r>
-          </w:p>
-          <w:p>
-            <w:pPr>
-              <w:spacing w:after="30" w:line="250"/>
-            </w:pPr>
-            <w:r>
-              <w:rPr>
-                <w:rFonts w:ascii="Arial" w:cs="Arial" w:eastAsia="Arial" w:hAnsi="Arial"/>
-                <w:sz w:val="18"/>
-                <w:szCs w:val="18"/>
-              </w:rPr>
-              <w:t xml:space="preserve">P6 C5 Founding</w:t>
+            <w:shd w:fill="E8F2FF" w:color="auto" w:val="clear"/>
+            <w:tcMar>
+              <w:top w:type="dxa" w:w="60"/>
+              <w:left w:type="dxa" w:w="100"/>
+              <w:bottom w:type="dxa" w:w="60"/>
+              <w:right w:type="dxa" w:w="100"/>
+            </w:tcMar>
+          </w:tcPr>
+          <w:p>
+            <w:pPr>
+              <w:spacing w:after="30" w:line="250"/>
+            </w:pPr>
+            <w:r>
+              <w:rPr>
+                <w:rFonts w:ascii="Arial" w:cs="Arial" w:eastAsia="Arial" w:hAnsi="Arial"/>
+                <w:b/>
+                <w:bCs/>
+                <w:sz w:val="18"/>
+                <w:szCs w:val="18"/>
+              </w:rPr>
+              <w:t xml:space="preserve">Angles A + B + C side by side, from day 1</w:t>
+            </w:r>
+          </w:p>
+          <w:p>
+            <w:pPr>
+              <w:spacing w:after="30" w:line="250"/>
+            </w:pPr>
+            <w:r>
+              <w:rPr>
+                <w:rFonts w:ascii="Arial" w:cs="Arial" w:eastAsia="Arial" w:hAnsi="Arial"/>
+                <w:sz w:val="18"/>
+                <w:szCs w:val="18"/>
+              </w:rPr>
+              <w:t xml:space="preserve">P1 C1 Hero (B)</w:t>
+            </w:r>
+          </w:p>
+          <w:p>
+            <w:pPr>
+              <w:spacing w:after="30" w:line="250"/>
+            </w:pPr>
+            <w:r>
+              <w:rPr>
+                <w:rFonts w:ascii="Arial" w:cs="Arial" w:eastAsia="Arial" w:hAnsi="Arial"/>
+                <w:sz w:val="18"/>
+                <w:szCs w:val="18"/>
+              </w:rPr>
+              <w:t xml:space="preserve">P2 C1 Hero (A)</w:t>
+            </w:r>
+          </w:p>
+          <w:p>
+            <w:pPr>
+              <w:spacing w:after="30" w:line="250"/>
+            </w:pPr>
+            <w:r>
+              <w:rPr>
+                <w:rFonts w:ascii="Arial" w:cs="Arial" w:eastAsia="Arial" w:hAnsi="Arial"/>
+                <w:sz w:val="18"/>
+                <w:szCs w:val="18"/>
+              </w:rPr>
+              <w:t xml:space="preserve">P3 C2 Future Skills (B)</w:t>
+            </w:r>
+          </w:p>
+          <w:p>
+            <w:pPr>
+              <w:spacing w:after="30" w:line="250"/>
+            </w:pPr>
+            <w:r>
+              <w:rPr>
+                <w:rFonts w:ascii="Arial" w:cs="Arial" w:eastAsia="Arial" w:hAnsi="Arial"/>
+                <w:sz w:val="18"/>
+                <w:szCs w:val="18"/>
+              </w:rPr>
+              <w:t xml:space="preserve">P4 C3 Less scrolling (A)</w:t>
+            </w:r>
+          </w:p>
+          <w:p>
+            <w:pPr>
+              <w:spacing w:after="30" w:line="250"/>
+            </w:pPr>
+            <w:r>
+              <w:rPr>
+                <w:rFonts w:ascii="Arial" w:cs="Arial" w:eastAsia="Arial" w:hAnsi="Arial"/>
+                <w:sz w:val="18"/>
+                <w:szCs w:val="18"/>
+              </w:rPr>
+              <w:t xml:space="preserve">P5 C4 English + AI (B)</w:t>
+            </w:r>
+          </w:p>
+          <w:p>
+            <w:pPr>
+              <w:spacing w:after="30" w:line="250"/>
+            </w:pPr>
+            <w:r>
+              <w:rPr>
+                <w:rFonts w:ascii="Arial" w:cs="Arial" w:eastAsia="Arial" w:hAnsi="Arial"/>
+                <w:sz w:val="18"/>
+                <w:szCs w:val="18"/>
+              </w:rPr>
+              <w:t xml:space="preserve">P6 C5 Founding (C)</w:t>
             </w:r>
           </w:p>
         </w:tc>
@@ -704,7 +872,7 @@
               <w:bottom w:val="single" w:color="D9E1EC" w:sz="4"/>
               <w:right w:val="single" w:color="D9E1EC" w:sz="4"/>
             </w:tcBorders>
-            <w:shd w:fill="FFFFFF" w:color="auto" w:val="clear"/>
+            <w:shd w:fill="EDE8FF" w:color="auto" w:val="clear"/>
             <w:tcMar>
               <w:top w:type="dxa" w:w="60"/>
               <w:left w:type="dxa" w:w="100"/>
@@ -740,7 +908,7 @@
                 <w:sz w:val="18"/>
                 <w:szCs w:val="18"/>
               </w:rPr>
-              <w:t xml:space="preserve">headline language (SR vs EN)</w:t>
+              <w:t xml:space="preserve">headline language (SR vs EN) — static</w:t>
             </w:r>
           </w:p>
           <w:p>
@@ -758,7 +926,7 @@
                 <w:sz w:val="18"/>
                 <w:szCs w:val="18"/>
               </w:rPr>
-              <w:t xml:space="preserve">format (static vs carousel / 6 s motion)</w:t>
+              <w:t xml:space="preserve">carousel or 6 s motion</w:t>
             </w:r>
           </w:p>
           <w:p>
@@ -789,7 +957,7 @@
               <w:bottom w:val="single" w:color="D9E1EC" w:sz="4"/>
               <w:right w:val="single" w:color="D9E1EC" w:sz="4"/>
             </w:tcBorders>
-            <w:shd w:fill="FFFFFF" w:color="auto" w:val="clear"/>
+            <w:shd w:fill="E3F6EF" w:color="auto" w:val="clear"/>
             <w:tcMar>
               <w:top w:type="dxa" w:w="60"/>
               <w:left w:type="dxa" w:w="100"/>
@@ -938,14 +1106,29 @@
               <w:bottom w:val="single" w:color="D9E1EC" w:sz="4"/>
               <w:right w:val="single" w:color="D9E1EC" w:sz="4"/>
             </w:tcBorders>
-            <w:shd w:fill="F8FAFC" w:color="auto" w:val="clear"/>
-            <w:tcMar>
-              <w:top w:type="dxa" w:w="60"/>
-              <w:left w:type="dxa" w:w="100"/>
-              <w:bottom w:type="dxa" w:w="60"/>
-              <w:right w:type="dxa" w:w="100"/>
-            </w:tcMar>
-          </w:tcPr>
+            <w:shd w:fill="E8F2FF" w:color="auto" w:val="clear"/>
+            <w:tcMar>
+              <w:top w:type="dxa" w:w="60"/>
+              <w:left w:type="dxa" w:w="100"/>
+              <w:bottom w:type="dxa" w:w="60"/>
+              <w:right w:type="dxa" w:w="100"/>
+            </w:tcMar>
+          </w:tcPr>
+          <w:p>
+            <w:pPr>
+              <w:spacing w:after="30" w:line="250"/>
+            </w:pPr>
+            <w:r>
+              <w:rPr>
+                <w:rFonts w:ascii="Arial" w:cs="Arial" w:eastAsia="Arial" w:hAnsi="Arial"/>
+                <w:b/>
+                <w:bCs/>
+                <w:sz w:val="18"/>
+                <w:szCs w:val="18"/>
+              </w:rPr>
+              <w:t xml:space="preserve">Angle D · from 12 Oct</w:t>
+            </w:r>
+          </w:p>
           <w:p>
             <w:pPr>
               <w:spacing w:after="30" w:line="250"/>
@@ -969,7 +1152,7 @@
                 <w:sz w:val="18"/>
                 <w:szCs w:val="18"/>
               </w:rPr>
-              <w:t xml:space="preserve">O2 best P-ad + Open Day band (from 13 Oct)</w:t>
+              <w:t xml:space="preserve">O2 best P-ad + Open Day band (13 Oct)</w:t>
             </w:r>
           </w:p>
         </w:tc>
@@ -982,25 +1165,25 @@
               <w:bottom w:val="single" w:color="D9E1EC" w:sz="4"/>
               <w:right w:val="single" w:color="D9E1EC" w:sz="4"/>
             </w:tcBorders>
-            <w:shd w:fill="F8FAFC" w:color="auto" w:val="clear"/>
-            <w:tcMar>
-              <w:top w:type="dxa" w:w="60"/>
-              <w:left w:type="dxa" w:w="100"/>
-              <w:bottom w:type="dxa" w:w="60"/>
-              <w:right w:type="dxa" w:w="100"/>
-            </w:tcMar>
-          </w:tcPr>
-          <w:p>
-            <w:pPr>
-              <w:spacing w:after="30" w:line="250"/>
-            </w:pPr>
-            <w:r>
-              <w:rPr>
-                <w:rFonts w:ascii="Arial" w:cs="Arial" w:eastAsia="Arial" w:hAnsi="Arial"/>
-                <w:sz w:val="18"/>
-                <w:szCs w:val="18"/>
-              </w:rPr>
-              <w:t xml:space="preserve">From 19 Oct: experience-led (O1) vs countdown (O3 "Još 5 dana")</w:t>
+            <w:shd w:fill="E8F2FF" w:color="auto" w:val="clear"/>
+            <w:tcMar>
+              <w:top w:type="dxa" w:w="60"/>
+              <w:left w:type="dxa" w:w="100"/>
+              <w:bottom w:type="dxa" w:w="60"/>
+              <w:right w:type="dxa" w:w="100"/>
+            </w:tcMar>
+          </w:tcPr>
+          <w:p>
+            <w:pPr>
+              <w:spacing w:after="30" w:line="250"/>
+            </w:pPr>
+            <w:r>
+              <w:rPr>
+                <w:rFonts w:ascii="Arial" w:cs="Arial" w:eastAsia="Arial" w:hAnsi="Arial"/>
+                <w:sz w:val="18"/>
+                <w:szCs w:val="18"/>
+              </w:rPr>
+              <w:t xml:space="preserve">From 19 Oct: experience-led (O1) vs countdown (O3 "Još 5 dana") — both static</w:t>
             </w:r>
           </w:p>
         </w:tc>
@@ -1013,7 +1196,7 @@
               <w:bottom w:val="single" w:color="D9E1EC" w:sz="4"/>
               <w:right w:val="single" w:color="D9E1EC" w:sz="4"/>
             </w:tcBorders>
-            <w:shd w:fill="F8FAFC" w:color="auto" w:val="clear"/>
+            <w:shd w:fill="F1F5F9" w:color="auto" w:val="clear"/>
             <w:tcMar>
               <w:top w:type="dxa" w:w="60"/>
               <w:left w:type="dxa" w:w="100"/>
@@ -1108,51 +1291,66 @@
               <w:bottom w:val="single" w:color="D9E1EC" w:sz="4"/>
               <w:right w:val="single" w:color="D9E1EC" w:sz="4"/>
             </w:tcBorders>
-            <w:shd w:fill="FFFFFF" w:color="auto" w:val="clear"/>
-            <w:tcMar>
-              <w:top w:type="dxa" w:w="60"/>
-              <w:left w:type="dxa" w:w="100"/>
-              <w:bottom w:type="dxa" w:w="60"/>
-              <w:right w:type="dxa" w:w="100"/>
-            </w:tcMar>
-          </w:tcPr>
-          <w:p>
-            <w:pPr>
-              <w:spacing w:after="30" w:line="250"/>
-            </w:pPr>
-            <w:r>
-              <w:rPr>
-                <w:rFonts w:ascii="Arial" w:cs="Arial" w:eastAsia="Arial" w:hAnsi="Arial"/>
-                <w:sz w:val="18"/>
-                <w:szCs w:val="18"/>
-              </w:rPr>
-              <w:t xml:space="preserve">R1 C5 Founding</w:t>
-            </w:r>
-          </w:p>
-          <w:p>
-            <w:pPr>
-              <w:spacing w:after="30" w:line="250"/>
-            </w:pPr>
-            <w:r>
-              <w:rPr>
-                <w:rFonts w:ascii="Arial" w:cs="Arial" w:eastAsia="Arial" w:hAnsi="Arial"/>
-                <w:sz w:val="18"/>
-                <w:szCs w:val="18"/>
-              </w:rPr>
-              <w:t xml:space="preserve">R2 FAQ "Još razmišljate?"</w:t>
-            </w:r>
-          </w:p>
-          <w:p>
-            <w:pPr>
-              <w:spacing w:after="30" w:line="250"/>
-            </w:pPr>
-            <w:r>
-              <w:rPr>
-                <w:rFonts w:ascii="Arial" w:cs="Arial" w:eastAsia="Arial" w:hAnsi="Arial"/>
-                <w:sz w:val="18"/>
-                <w:szCs w:val="18"/>
-              </w:rPr>
-              <w:t xml:space="preserve">R3 C6 Open Day (until 23 Oct)</w:t>
+            <w:shd w:fill="E8F2FF" w:color="auto" w:val="clear"/>
+            <w:tcMar>
+              <w:top w:type="dxa" w:w="60"/>
+              <w:left w:type="dxa" w:w="100"/>
+              <w:bottom w:type="dxa" w:w="60"/>
+              <w:right w:type="dxa" w:w="100"/>
+            </w:tcMar>
+          </w:tcPr>
+          <w:p>
+            <w:pPr>
+              <w:spacing w:after="30" w:line="250"/>
+            </w:pPr>
+            <w:r>
+              <w:rPr>
+                <w:rFonts w:ascii="Arial" w:cs="Arial" w:eastAsia="Arial" w:hAnsi="Arial"/>
+                <w:b/>
+                <w:bCs/>
+                <w:sz w:val="18"/>
+                <w:szCs w:val="18"/>
+              </w:rPr>
+              <w:t xml:space="preserve">Angles C + D · from 13 Oct</w:t>
+            </w:r>
+          </w:p>
+          <w:p>
+            <w:pPr>
+              <w:spacing w:after="30" w:line="250"/>
+            </w:pPr>
+            <w:r>
+              <w:rPr>
+                <w:rFonts w:ascii="Arial" w:cs="Arial" w:eastAsia="Arial" w:hAnsi="Arial"/>
+                <w:sz w:val="18"/>
+                <w:szCs w:val="18"/>
+              </w:rPr>
+              <w:t xml:space="preserve">R1 C5 Founding (C)</w:t>
+            </w:r>
+          </w:p>
+          <w:p>
+            <w:pPr>
+              <w:spacing w:after="30" w:line="250"/>
+            </w:pPr>
+            <w:r>
+              <w:rPr>
+                <w:rFonts w:ascii="Arial" w:cs="Arial" w:eastAsia="Arial" w:hAnsi="Arial"/>
+                <w:sz w:val="18"/>
+                <w:szCs w:val="18"/>
+              </w:rPr>
+              <w:t xml:space="preserve">R2 FAQ "Još razmišljate?" (C)</w:t>
+            </w:r>
+          </w:p>
+          <w:p>
+            <w:pPr>
+              <w:spacing w:after="30" w:line="250"/>
+            </w:pPr>
+            <w:r>
+              <w:rPr>
+                <w:rFonts w:ascii="Arial" w:cs="Arial" w:eastAsia="Arial" w:hAnsi="Arial"/>
+                <w:sz w:val="18"/>
+                <w:szCs w:val="18"/>
+              </w:rPr>
+              <w:t xml:space="preserve">R3 C6 Open Day (D, until 23 Oct)</w:t>
             </w:r>
           </w:p>
         </w:tc>
@@ -1165,25 +1363,25 @@
               <w:bottom w:val="single" w:color="D9E1EC" w:sz="4"/>
               <w:right w:val="single" w:color="D9E1EC" w:sz="4"/>
             </w:tcBorders>
-            <w:shd w:fill="FFFFFF" w:color="auto" w:val="clear"/>
-            <w:tcMar>
-              <w:top w:type="dxa" w:w="60"/>
-              <w:left w:type="dxa" w:w="100"/>
-              <w:bottom w:type="dxa" w:w="60"/>
-              <w:right w:type="dxa" w:w="100"/>
-            </w:tcMar>
-          </w:tcPr>
-          <w:p>
-            <w:pPr>
-              <w:spacing w:after="30" w:line="250"/>
-            </w:pPr>
-            <w:r>
-              <w:rPr>
-                <w:rFonts w:ascii="Arial" w:cs="Arial" w:eastAsia="Arial" w:hAnsi="Arial"/>
-                <w:sz w:val="18"/>
-                <w:szCs w:val="18"/>
-              </w:rPr>
-              <w:t xml:space="preserve">Price-led (R1) vs objection-led (R2)</w:t>
+            <w:shd w:fill="E8F2FF" w:color="auto" w:val="clear"/>
+            <w:tcMar>
+              <w:top w:type="dxa" w:w="60"/>
+              <w:left w:type="dxa" w:w="100"/>
+              <w:bottom w:type="dxa" w:w="60"/>
+              <w:right w:type="dxa" w:w="100"/>
+            </w:tcMar>
+          </w:tcPr>
+          <w:p>
+            <w:pPr>
+              <w:spacing w:after="30" w:line="250"/>
+            </w:pPr>
+            <w:r>
+              <w:rPr>
+                <w:rFonts w:ascii="Arial" w:cs="Arial" w:eastAsia="Arial" w:hAnsi="Arial"/>
+                <w:sz w:val="18"/>
+                <w:szCs w:val="18"/>
+              </w:rPr>
+              <w:t xml:space="preserve">Price-led (R1) vs objection-led (R2) — both static</w:t>
             </w:r>
           </w:p>
         </w:tc>
@@ -1196,7 +1394,7 @@
               <w:bottom w:val="single" w:color="D9E1EC" w:sz="4"/>
               <w:right w:val="single" w:color="D9E1EC" w:sz="4"/>
             </w:tcBorders>
-            <w:shd w:fill="FFFFFF" w:color="auto" w:val="clear"/>
+            <w:shd w:fill="E3F6EF" w:color="auto" w:val="clear"/>
             <w:tcMar>
               <w:top w:type="dxa" w:w="60"/>
               <w:left w:type="dxa" w:w="100"/>
@@ -1215,6 +1413,160 @@
                 <w:szCs w:val="18"/>
               </w:rPr>
               <w:t xml:space="preserve">From 26 Oct: R4 "Poslednja founding mesta" + R5 Open Day recap (real photos)</w:t>
+            </w:r>
+          </w:p>
+        </w:tc>
+      </w:tr>
+    </w:tbl>
+    <w:p>
+      <w:pPr>
+        <w:spacing w:after="80"/>
+      </w:pPr>
+    </w:p>
+    <w:tbl>
+      <w:tblPr>
+        <w:tblW w:type="dxa" w:w="9636"/>
+        <w:tblBorders>
+          <w:top w:val="single" w:color="auto" w:sz="4"/>
+          <w:left w:val="single" w:color="auto" w:sz="4"/>
+          <w:bottom w:val="single" w:color="auto" w:sz="4"/>
+          <w:right w:val="single" w:color="auto" w:sz="4"/>
+          <w:insideH w:val="single" w:color="auto" w:sz="4"/>
+          <w:insideV w:val="single" w:color="auto" w:sz="4"/>
+        </w:tblBorders>
+      </w:tblPr>
+      <w:tblGrid>
+        <w:gridCol w:w="2409"/>
+        <w:gridCol w:w="2409"/>
+        <w:gridCol w:w="2409"/>
+        <w:gridCol w:w="2409"/>
+      </w:tblGrid>
+      <w:tr>
+        <w:tc>
+          <w:tcPr>
+            <w:tcW w:type="dxa" w:w="2409"/>
+            <w:tcBorders>
+              <w:top w:val="none" w:color="FFFFFF" w:sz="0"/>
+              <w:left w:val="none" w:color="FFFFFF" w:sz="0"/>
+              <w:bottom w:val="none" w:color="FFFFFF" w:sz="0"/>
+              <w:right w:val="single" w:color="FFFFFF" w:sz="24"/>
+            </w:tcBorders>
+            <w:shd w:fill="E8F2FF" w:color="auto" w:val="clear"/>
+            <w:tcMar>
+              <w:top w:type="dxa" w:w="40"/>
+              <w:left w:type="dxa" w:w="100"/>
+              <w:bottom w:type="dxa" w:w="40"/>
+              <w:right w:type="dxa" w:w="100"/>
+            </w:tcMar>
+          </w:tcPr>
+          <w:p>
+            <w:pPr>
+              <w:spacing w:after="30" w:line="250"/>
+              <w:jc w:val="center"/>
+            </w:pPr>
+            <w:r>
+              <w:rPr>
+                <w:rFonts w:ascii="Arial" w:cs="Arial" w:eastAsia="Arial" w:hAnsi="Arial"/>
+                <w:sz w:val="15"/>
+                <w:szCs w:val="15"/>
+              </w:rPr>
+              <w:t xml:space="preserve">Static — feed 4:5 + story 9:16</w:t>
+            </w:r>
+          </w:p>
+        </w:tc>
+        <w:tc>
+          <w:tcPr>
+            <w:tcW w:type="dxa" w:w="2409"/>
+            <w:tcBorders>
+              <w:top w:val="none" w:color="FFFFFF" w:sz="0"/>
+              <w:left w:val="none" w:color="FFFFFF" w:sz="0"/>
+              <w:bottom w:val="none" w:color="FFFFFF" w:sz="0"/>
+              <w:right w:val="single" w:color="FFFFFF" w:sz="24"/>
+            </w:tcBorders>
+            <w:shd w:fill="EDE8FF" w:color="auto" w:val="clear"/>
+            <w:tcMar>
+              <w:top w:type="dxa" w:w="40"/>
+              <w:left w:type="dxa" w:w="100"/>
+              <w:bottom w:type="dxa" w:w="40"/>
+              <w:right w:type="dxa" w:w="100"/>
+            </w:tcMar>
+          </w:tcPr>
+          <w:p>
+            <w:pPr>
+              <w:spacing w:after="30" w:line="250"/>
+              <w:jc w:val="center"/>
+            </w:pPr>
+            <w:r>
+              <w:rPr>
+                <w:rFonts w:ascii="Arial" w:cs="Arial" w:eastAsia="Arial" w:hAnsi="Arial"/>
+                <w:sz w:val="15"/>
+                <w:szCs w:val="15"/>
+              </w:rPr>
+              <w:t xml:space="preserve">Motion / carousel (test)</w:t>
+            </w:r>
+          </w:p>
+        </w:tc>
+        <w:tc>
+          <w:tcPr>
+            <w:tcW w:type="dxa" w:w="2409"/>
+            <w:tcBorders>
+              <w:top w:val="none" w:color="FFFFFF" w:sz="0"/>
+              <w:left w:val="none" w:color="FFFFFF" w:sz="0"/>
+              <w:bottom w:val="none" w:color="FFFFFF" w:sz="0"/>
+              <w:right w:val="single" w:color="FFFFFF" w:sz="24"/>
+            </w:tcBorders>
+            <w:shd w:fill="E3F6EF" w:color="auto" w:val="clear"/>
+            <w:tcMar>
+              <w:top w:type="dxa" w:w="40"/>
+              <w:left w:type="dxa" w:w="100"/>
+              <w:bottom w:type="dxa" w:w="40"/>
+              <w:right w:type="dxa" w:w="100"/>
+            </w:tcMar>
+          </w:tcPr>
+          <w:p>
+            <w:pPr>
+              <w:spacing w:after="30" w:line="250"/>
+              <w:jc w:val="center"/>
+            </w:pPr>
+            <w:r>
+              <w:rPr>
+                <w:rFonts w:ascii="Arial" w:cs="Arial" w:eastAsia="Arial" w:hAnsi="Arial"/>
+                <w:sz w:val="15"/>
+                <w:szCs w:val="15"/>
+              </w:rPr>
+              <w:t xml:space="preserve">Real photo / video</w:t>
+            </w:r>
+          </w:p>
+        </w:tc>
+        <w:tc>
+          <w:tcPr>
+            <w:tcW w:type="dxa" w:w="2409"/>
+            <w:tcBorders>
+              <w:top w:val="none" w:color="FFFFFF" w:sz="0"/>
+              <w:left w:val="none" w:color="FFFFFF" w:sz="0"/>
+              <w:bottom w:val="none" w:color="FFFFFF" w:sz="0"/>
+              <w:right w:val="single" w:color="FFFFFF" w:sz="24"/>
+            </w:tcBorders>
+            <w:shd w:fill="F1F5F9" w:color="auto" w:val="clear"/>
+            <w:tcMar>
+              <w:top w:type="dxa" w:w="40"/>
+              <w:left w:type="dxa" w:w="100"/>
+              <w:bottom w:type="dxa" w:w="40"/>
+              <w:right w:type="dxa" w:w="100"/>
+            </w:tcMar>
+          </w:tcPr>
+          <w:p>
+            <w:pPr>
+              <w:spacing w:after="30" w:line="250"/>
+              <w:jc w:val="center"/>
+            </w:pPr>
+            <w:r>
+              <w:rPr>
+                <w:rFonts w:ascii="Arial" w:cs="Arial" w:eastAsia="Arial" w:hAnsi="Arial"/>
+                <w:sz w:val="15"/>
+                <w:szCs w:val="15"/>
+              </w:rPr>
+              <w:t xml:space="preserve">Off</w:t>
             </w:r>
           </w:p>
         </w:tc>
@@ -2496,9 +2848,9 @@
             </w:tcBorders>
             <w:shd w:fill="E8F2FF" w:color="auto" w:val="clear"/>
             <w:tcMar>
-              <w:top w:type="dxa" w:w="50"/>
-              <w:left w:type="dxa" w:w="100"/>
-              <w:bottom w:type="dxa" w:w="50"/>
+              <w:top w:type="dxa" w:w="40"/>
+              <w:left w:type="dxa" w:w="100"/>
+              <w:bottom w:type="dxa" w:w="40"/>
               <w:right w:type="dxa" w:w="100"/>
             </w:tcMar>
           </w:tcPr>
@@ -2528,9 +2880,9 @@
             </w:tcBorders>
             <w:shd w:fill="EDE8FF" w:color="auto" w:val="clear"/>
             <w:tcMar>
-              <w:top w:type="dxa" w:w="50"/>
-              <w:left w:type="dxa" w:w="100"/>
-              <w:bottom w:type="dxa" w:w="50"/>
+              <w:top w:type="dxa" w:w="40"/>
+              <w:left w:type="dxa" w:w="100"/>
+              <w:bottom w:type="dxa" w:w="40"/>
               <w:right w:type="dxa" w:w="100"/>
             </w:tcMar>
           </w:tcPr>
@@ -2560,9 +2912,9 @@
             </w:tcBorders>
             <w:shd w:fill="E3F6EF" w:color="auto" w:val="clear"/>
             <w:tcMar>
-              <w:top w:type="dxa" w:w="50"/>
-              <w:left w:type="dxa" w:w="100"/>
-              <w:bottom w:type="dxa" w:w="50"/>
+              <w:top w:type="dxa" w:w="40"/>
+              <w:left w:type="dxa" w:w="100"/>
+              <w:bottom w:type="dxa" w:w="40"/>
               <w:right w:type="dxa" w:w="100"/>
             </w:tcMar>
           </w:tcPr>
@@ -2592,9 +2944,9 @@
             </w:tcBorders>
             <w:shd w:fill="F1F5F9" w:color="auto" w:val="clear"/>
             <w:tcMar>
-              <w:top w:type="dxa" w:w="50"/>
-              <w:left w:type="dxa" w:w="100"/>
-              <w:bottom w:type="dxa" w:w="50"/>
+              <w:top w:type="dxa" w:w="40"/>
+              <w:left w:type="dxa" w:w="100"/>
+              <w:bottom w:type="dxa" w:w="40"/>
               <w:right w:type="dxa" w:w="100"/>
             </w:tcMar>
           </w:tcPr>
@@ -2942,10 +3294,11 @@
         </w:tblBorders>
       </w:tblPr>
       <w:tblGrid>
-        <w:gridCol w:w="1900"/>
-        <w:gridCol w:w="1500"/>
-        <w:gridCol w:w="3800"/>
-        <w:gridCol w:w="2438"/>
+        <w:gridCol w:w="1700"/>
+        <w:gridCol w:w="1250"/>
+        <w:gridCol w:w="2950"/>
+        <w:gridCol w:w="2200"/>
+        <w:gridCol w:w="1538"/>
       </w:tblGrid>
       <w:tr>
         <w:trPr>
@@ -2953,7 +3306,7 @@
         </w:trPr>
         <w:tc>
           <w:tcPr>
-            <w:tcW w:type="dxa" w:w="1900"/>
+            <w:tcW w:type="dxa" w:w="1700"/>
             <w:tcBorders>
               <w:top w:val="single" w:color="D9E1EC" w:sz="4"/>
               <w:left w:val="single" w:color="D9E1EC" w:sz="4"/>
@@ -2987,7 +3340,7 @@
         </w:tc>
         <w:tc>
           <w:tcPr>
-            <w:tcW w:type="dxa" w:w="1500"/>
+            <w:tcW w:type="dxa" w:w="1250"/>
             <w:tcBorders>
               <w:top w:val="single" w:color="D9E1EC" w:sz="4"/>
               <w:left w:val="single" w:color="D9E1EC" w:sz="4"/>
@@ -3021,7 +3374,7 @@
         </w:tc>
         <w:tc>
           <w:tcPr>
-            <w:tcW w:type="dxa" w:w="3800"/>
+            <w:tcW w:type="dxa" w:w="2950"/>
             <w:tcBorders>
               <w:top w:val="single" w:color="D9E1EC" w:sz="4"/>
               <w:left w:val="single" w:color="D9E1EC" w:sz="4"/>
@@ -3055,7 +3408,7 @@
         </w:tc>
         <w:tc>
           <w:tcPr>
-            <w:tcW w:type="dxa" w:w="2438"/>
+            <w:tcW w:type="dxa" w:w="2200"/>
             <w:tcBorders>
               <w:top w:val="single" w:color="D9E1EC" w:sz="4"/>
               <w:left w:val="single" w:color="D9E1EC" w:sz="4"/>
@@ -3084,6 +3437,40 @@
                 <w:szCs w:val="18"/>
               </w:rPr>
               <w:t xml:space="preserve">Used for</w:t>
+            </w:r>
+          </w:p>
+        </w:tc>
+        <w:tc>
+          <w:tcPr>
+            <w:tcW w:type="dxa" w:w="1538"/>
+            <w:tcBorders>
+              <w:top w:val="single" w:color="D9E1EC" w:sz="4"/>
+              <w:left w:val="single" w:color="D9E1EC" w:sz="4"/>
+              <w:bottom w:val="single" w:color="D9E1EC" w:sz="4"/>
+              <w:right w:val="single" w:color="D9E1EC" w:sz="4"/>
+            </w:tcBorders>
+            <w:shd w:fill="0F172A" w:color="auto" w:val="clear"/>
+            <w:tcMar>
+              <w:top w:type="dxa" w:w="70"/>
+              <w:left w:type="dxa" w:w="100"/>
+              <w:bottom w:type="dxa" w:w="70"/>
+              <w:right w:type="dxa" w:w="100"/>
+            </w:tcMar>
+          </w:tcPr>
+          <w:p>
+            <w:pPr>
+              <w:spacing w:after="30" w:line="250"/>
+            </w:pPr>
+            <w:r>
+              <w:rPr>
+                <w:rFonts w:ascii="Arial" w:cs="Arial" w:eastAsia="Arial" w:hAnsi="Arial"/>
+                <w:b/>
+                <w:bCs/>
+                <w:color w:val="FFFFFF"/>
+                <w:sz w:val="18"/>
+                <w:szCs w:val="18"/>
+              </w:rPr>
+              <w:t xml:space="preserve">When</w:t>
             </w:r>
           </w:p>
         </w:tc>
@@ -3094,7 +3481,38 @@
         </w:trPr>
         <w:tc>
           <w:tcPr>
-            <w:tcW w:type="dxa" w:w="1900"/>
+            <w:tcW w:type="dxa" w:w="1700"/>
+            <w:tcBorders>
+              <w:top w:val="single" w:color="D9E1EC" w:sz="4"/>
+              <w:left w:val="single" w:color="D9E1EC" w:sz="4"/>
+              <w:bottom w:val="single" w:color="D9E1EC" w:sz="4"/>
+              <w:right w:val="single" w:color="D9E1EC" w:sz="4"/>
+            </w:tcBorders>
+            <w:shd w:fill="E8F2FF" w:color="auto" w:val="clear"/>
+            <w:tcMar>
+              <w:top w:type="dxa" w:w="60"/>
+              <w:left w:type="dxa" w:w="100"/>
+              <w:bottom w:type="dxa" w:w="60"/>
+              <w:right w:type="dxa" w:w="100"/>
+            </w:tcMar>
+          </w:tcPr>
+          <w:p>
+            <w:pPr>
+              <w:spacing w:after="30" w:line="250"/>
+            </w:pPr>
+            <w:r>
+              <w:rPr>
+                <w:rFonts w:ascii="Arial" w:cs="Arial" w:eastAsia="Arial" w:hAnsi="Arial"/>
+                <w:sz w:val="18"/>
+                <w:szCs w:val="18"/>
+              </w:rPr>
+              <w:t xml:space="preserve">Static feed 4:5</w:t>
+            </w:r>
+          </w:p>
+        </w:tc>
+        <w:tc>
+          <w:tcPr>
+            <w:tcW w:type="dxa" w:w="1250"/>
             <w:tcBorders>
               <w:top w:val="single" w:color="D9E1EC" w:sz="4"/>
               <w:left w:val="single" w:color="D9E1EC" w:sz="4"/>
@@ -3119,13 +3537,13 @@
                 <w:sz w:val="18"/>
                 <w:szCs w:val="18"/>
               </w:rPr>
-              <w:t xml:space="preserve">Feed 4:5</w:t>
-            </w:r>
-          </w:p>
-        </w:tc>
-        <w:tc>
-          <w:tcPr>
-            <w:tcW w:type="dxa" w:w="1500"/>
+              <w:t xml:space="preserve">1080 × 1350</w:t>
+            </w:r>
+          </w:p>
+        </w:tc>
+        <w:tc>
+          <w:tcPr>
+            <w:tcW w:type="dxa" w:w="2950"/>
             <w:tcBorders>
               <w:top w:val="single" w:color="D9E1EC" w:sz="4"/>
               <w:left w:val="single" w:color="D9E1EC" w:sz="4"/>
@@ -3150,13 +3568,13 @@
                 <w:sz w:val="18"/>
                 <w:szCs w:val="18"/>
               </w:rPr>
-              <w:t xml:space="preserve">1080 × 1350</w:t>
-            </w:r>
-          </w:p>
-        </w:tc>
-        <w:tc>
-          <w:tcPr>
-            <w:tcW w:type="dxa" w:w="3800"/>
+              <w:t xml:space="preserve">≥ 60 px margins; CTA pill bottom-right</w:t>
+            </w:r>
+          </w:p>
+        </w:tc>
+        <w:tc>
+          <w:tcPr>
+            <w:tcW w:type="dxa" w:w="2200"/>
             <w:tcBorders>
               <w:top w:val="single" w:color="D9E1EC" w:sz="4"/>
               <w:left w:val="single" w:color="D9E1EC" w:sz="4"/>
@@ -3181,13 +3599,13 @@
                 <w:sz w:val="18"/>
                 <w:szCs w:val="18"/>
               </w:rPr>
-              <w:t xml:space="preserve">≥ 60 px margins; CTA pill bottom-right</w:t>
-            </w:r>
-          </w:p>
-        </w:tc>
-        <w:tc>
-          <w:tcPr>
-            <w:tcW w:type="dxa" w:w="2438"/>
+              <w:t xml:space="preserve">All ads (main format)</w:t>
+            </w:r>
+          </w:p>
+        </w:tc>
+        <w:tc>
+          <w:tcPr>
+            <w:tcW w:type="dxa" w:w="1538"/>
             <w:tcBorders>
               <w:top w:val="single" w:color="D9E1EC" w:sz="4"/>
               <w:left w:val="single" w:color="D9E1EC" w:sz="4"/>
@@ -3209,10 +3627,12 @@
             <w:r>
               <w:rPr>
                 <w:rFonts w:ascii="Arial" w:cs="Arial" w:eastAsia="Arial" w:hAnsi="Arial"/>
-                <w:sz w:val="18"/>
-                <w:szCs w:val="18"/>
-              </w:rPr>
-              <w:t xml:space="preserve">All ads (main format)</w:t>
+                <w:b/>
+                <w:bCs/>
+                <w:sz w:val="18"/>
+                <w:szCs w:val="18"/>
+              </w:rPr>
+              <w:t xml:space="preserve">W1 →</w:t>
             </w:r>
           </w:p>
         </w:tc>
@@ -3223,7 +3643,38 @@
         </w:trPr>
         <w:tc>
           <w:tcPr>
-            <w:tcW w:type="dxa" w:w="1900"/>
+            <w:tcW w:type="dxa" w:w="1700"/>
+            <w:tcBorders>
+              <w:top w:val="single" w:color="D9E1EC" w:sz="4"/>
+              <w:left w:val="single" w:color="D9E1EC" w:sz="4"/>
+              <w:bottom w:val="single" w:color="D9E1EC" w:sz="4"/>
+              <w:right w:val="single" w:color="D9E1EC" w:sz="4"/>
+            </w:tcBorders>
+            <w:shd w:fill="E8F2FF" w:color="auto" w:val="clear"/>
+            <w:tcMar>
+              <w:top w:type="dxa" w:w="60"/>
+              <w:left w:type="dxa" w:w="100"/>
+              <w:bottom w:type="dxa" w:w="60"/>
+              <w:right w:type="dxa" w:w="100"/>
+            </w:tcMar>
+          </w:tcPr>
+          <w:p>
+            <w:pPr>
+              <w:spacing w:after="30" w:line="250"/>
+            </w:pPr>
+            <w:r>
+              <w:rPr>
+                <w:rFonts w:ascii="Arial" w:cs="Arial" w:eastAsia="Arial" w:hAnsi="Arial"/>
+                <w:sz w:val="18"/>
+                <w:szCs w:val="18"/>
+              </w:rPr>
+              <w:t xml:space="preserve">Static story 9:16</w:t>
+            </w:r>
+          </w:p>
+        </w:tc>
+        <w:tc>
+          <w:tcPr>
+            <w:tcW w:type="dxa" w:w="1250"/>
             <w:tcBorders>
               <w:top w:val="single" w:color="D9E1EC" w:sz="4"/>
               <w:left w:val="single" w:color="D9E1EC" w:sz="4"/>
@@ -3248,13 +3699,13 @@
                 <w:sz w:val="18"/>
                 <w:szCs w:val="18"/>
               </w:rPr>
-              <w:t xml:space="preserve">Stories / Reels 9:16</w:t>
-            </w:r>
-          </w:p>
-        </w:tc>
-        <w:tc>
-          <w:tcPr>
-            <w:tcW w:type="dxa" w:w="1500"/>
+              <w:t xml:space="preserve">1080 × 1920</w:t>
+            </w:r>
+          </w:p>
+        </w:tc>
+        <w:tc>
+          <w:tcPr>
+            <w:tcW w:type="dxa" w:w="2950"/>
             <w:tcBorders>
               <w:top w:val="single" w:color="D9E1EC" w:sz="4"/>
               <w:left w:val="single" w:color="D9E1EC" w:sz="4"/>
@@ -3279,13 +3730,13 @@
                 <w:sz w:val="18"/>
                 <w:szCs w:val="18"/>
               </w:rPr>
-              <w:t xml:space="preserve">1080 × 1920</w:t>
-            </w:r>
-          </w:p>
-        </w:tc>
-        <w:tc>
-          <w:tcPr>
-            <w:tcW w:type="dxa" w:w="3800"/>
+              <w:t xml:space="preserve">Keep top 250 px and bottom 380 px free of text &amp; CTA</w:t>
+            </w:r>
+          </w:p>
+        </w:tc>
+        <w:tc>
+          <w:tcPr>
+            <w:tcW w:type="dxa" w:w="2200"/>
             <w:tcBorders>
               <w:top w:val="single" w:color="D9E1EC" w:sz="4"/>
               <w:left w:val="single" w:color="D9E1EC" w:sz="4"/>
@@ -3310,13 +3761,13 @@
                 <w:sz w:val="18"/>
                 <w:szCs w:val="18"/>
               </w:rPr>
-              <w:t xml:space="preserve">Keep top 250 px and bottom 380 px free of text &amp; CTA</w:t>
-            </w:r>
-          </w:p>
-        </w:tc>
-        <w:tc>
-          <w:tcPr>
-            <w:tcW w:type="dxa" w:w="2438"/>
+              <w:t xml:space="preserve">All ads (native version)</w:t>
+            </w:r>
+          </w:p>
+        </w:tc>
+        <w:tc>
+          <w:tcPr>
+            <w:tcW w:type="dxa" w:w="1538"/>
             <w:tcBorders>
               <w:top w:val="single" w:color="D9E1EC" w:sz="4"/>
               <w:left w:val="single" w:color="D9E1EC" w:sz="4"/>
@@ -3338,10 +3789,12 @@
             <w:r>
               <w:rPr>
                 <w:rFonts w:ascii="Arial" w:cs="Arial" w:eastAsia="Arial" w:hAnsi="Arial"/>
-                <w:sz w:val="18"/>
-                <w:szCs w:val="18"/>
-              </w:rPr>
-              <w:t xml:space="preserve">All ads (native version)</w:t>
+                <w:b/>
+                <w:bCs/>
+                <w:sz w:val="18"/>
+                <w:szCs w:val="18"/>
+              </w:rPr>
+              <w:t xml:space="preserve">W1 →</w:t>
             </w:r>
           </w:p>
         </w:tc>
@@ -3352,7 +3805,38 @@
         </w:trPr>
         <w:tc>
           <w:tcPr>
-            <w:tcW w:type="dxa" w:w="1900"/>
+            <w:tcW w:type="dxa" w:w="1700"/>
+            <w:tcBorders>
+              <w:top w:val="single" w:color="D9E1EC" w:sz="4"/>
+              <w:left w:val="single" w:color="D9E1EC" w:sz="4"/>
+              <w:bottom w:val="single" w:color="D9E1EC" w:sz="4"/>
+              <w:right w:val="single" w:color="D9E1EC" w:sz="4"/>
+            </w:tcBorders>
+            <w:shd w:fill="EDE8FF" w:color="auto" w:val="clear"/>
+            <w:tcMar>
+              <w:top w:type="dxa" w:w="60"/>
+              <w:left w:type="dxa" w:w="100"/>
+              <w:bottom w:type="dxa" w:w="60"/>
+              <w:right w:type="dxa" w:w="100"/>
+            </w:tcMar>
+          </w:tcPr>
+          <w:p>
+            <w:pPr>
+              <w:spacing w:after="30" w:line="250"/>
+            </w:pPr>
+            <w:r>
+              <w:rPr>
+                <w:rFonts w:ascii="Arial" w:cs="Arial" w:eastAsia="Arial" w:hAnsi="Arial"/>
+                <w:sz w:val="18"/>
+                <w:szCs w:val="18"/>
+              </w:rPr>
+              <w:t xml:space="preserve">Carousel 1:1</w:t>
+            </w:r>
+          </w:p>
+        </w:tc>
+        <w:tc>
+          <w:tcPr>
+            <w:tcW w:type="dxa" w:w="1250"/>
             <w:tcBorders>
               <w:top w:val="single" w:color="D9E1EC" w:sz="4"/>
               <w:left w:val="single" w:color="D9E1EC" w:sz="4"/>
@@ -3377,13 +3861,13 @@
                 <w:sz w:val="18"/>
                 <w:szCs w:val="18"/>
               </w:rPr>
-              <w:t xml:space="preserve">Carousel 1:1</w:t>
-            </w:r>
-          </w:p>
-        </w:tc>
-        <w:tc>
-          <w:tcPr>
-            <w:tcW w:type="dxa" w:w="1500"/>
+              <w:t xml:space="preserve">1080 × 1080</w:t>
+            </w:r>
+          </w:p>
+        </w:tc>
+        <w:tc>
+          <w:tcPr>
+            <w:tcW w:type="dxa" w:w="2950"/>
             <w:tcBorders>
               <w:top w:val="single" w:color="D9E1EC" w:sz="4"/>
               <w:left w:val="single" w:color="D9E1EC" w:sz="4"/>
@@ -3408,13 +3892,13 @@
                 <w:sz w:val="18"/>
                 <w:szCs w:val="18"/>
               </w:rPr>
-              <w:t xml:space="preserve">1080 × 1080</w:t>
-            </w:r>
-          </w:p>
-        </w:tc>
-        <w:tc>
-          <w:tcPr>
-            <w:tcW w:type="dxa" w:w="3800"/>
+              <w:t xml:space="preserve">Card 1 = hook, last card = offer + CTA</w:t>
+            </w:r>
+          </w:p>
+        </w:tc>
+        <w:tc>
+          <w:tcPr>
+            <w:tcW w:type="dxa" w:w="2200"/>
             <w:tcBorders>
               <w:top w:val="single" w:color="D9E1EC" w:sz="4"/>
               <w:left w:val="single" w:color="D9E1EC" w:sz="4"/>
@@ -3439,13 +3923,13 @@
                 <w:sz w:val="18"/>
                 <w:szCs w:val="18"/>
               </w:rPr>
-              <w:t xml:space="preserve">Card 1 = hook, last card = offer + CTA</w:t>
-            </w:r>
-          </w:p>
-        </w:tc>
-        <w:tc>
-          <w:tcPr>
-            <w:tcW w:type="dxa" w:w="2438"/>
+              <w:t xml:space="preserve">C2, if angle B wins</w:t>
+            </w:r>
+          </w:p>
+        </w:tc>
+        <w:tc>
+          <w:tcPr>
+            <w:tcW w:type="dxa" w:w="1538"/>
             <w:tcBorders>
               <w:top w:val="single" w:color="D9E1EC" w:sz="4"/>
               <w:left w:val="single" w:color="D9E1EC" w:sz="4"/>
@@ -3467,10 +3951,12 @@
             <w:r>
               <w:rPr>
                 <w:rFonts w:ascii="Arial" w:cs="Arial" w:eastAsia="Arial" w:hAnsi="Arial"/>
-                <w:sz w:val="18"/>
-                <w:szCs w:val="18"/>
-              </w:rPr>
-              <w:t xml:space="preserve">C2 test only</w:t>
+                <w:b/>
+                <w:bCs/>
+                <w:sz w:val="18"/>
+                <w:szCs w:val="18"/>
+              </w:rPr>
+              <w:t xml:space="preserve">W3</w:t>
             </w:r>
           </w:p>
         </w:tc>
@@ -3481,7 +3967,38 @@
         </w:trPr>
         <w:tc>
           <w:tcPr>
-            <w:tcW w:type="dxa" w:w="1900"/>
+            <w:tcW w:type="dxa" w:w="1700"/>
+            <w:tcBorders>
+              <w:top w:val="single" w:color="D9E1EC" w:sz="4"/>
+              <w:left w:val="single" w:color="D9E1EC" w:sz="4"/>
+              <w:bottom w:val="single" w:color="D9E1EC" w:sz="4"/>
+              <w:right w:val="single" w:color="D9E1EC" w:sz="4"/>
+            </w:tcBorders>
+            <w:shd w:fill="EDE8FF" w:color="auto" w:val="clear"/>
+            <w:tcMar>
+              <w:top w:type="dxa" w:w="60"/>
+              <w:left w:type="dxa" w:w="100"/>
+              <w:bottom w:type="dxa" w:w="60"/>
+              <w:right w:type="dxa" w:w="100"/>
+            </w:tcMar>
+          </w:tcPr>
+          <w:p>
+            <w:pPr>
+              <w:spacing w:after="30" w:line="250"/>
+            </w:pPr>
+            <w:r>
+              <w:rPr>
+                <w:rFonts w:ascii="Arial" w:cs="Arial" w:eastAsia="Arial" w:hAnsi="Arial"/>
+                <w:sz w:val="18"/>
+                <w:szCs w:val="18"/>
+              </w:rPr>
+              <w:t xml:space="preserve">Motion 6 s</w:t>
+            </w:r>
+          </w:p>
+        </w:tc>
+        <w:tc>
+          <w:tcPr>
+            <w:tcW w:type="dxa" w:w="1250"/>
             <w:tcBorders>
               <w:top w:val="single" w:color="D9E1EC" w:sz="4"/>
               <w:left w:val="single" w:color="D9E1EC" w:sz="4"/>
@@ -3506,13 +4023,13 @@
                 <w:sz w:val="18"/>
                 <w:szCs w:val="18"/>
               </w:rPr>
-              <w:t xml:space="preserve">Motion 6 s</w:t>
-            </w:r>
-          </w:p>
-        </w:tc>
-        <w:tc>
-          <w:tcPr>
-            <w:tcW w:type="dxa" w:w="1500"/>
+              <w:t xml:space="preserve">4:5 + 9:16</w:t>
+            </w:r>
+          </w:p>
+        </w:tc>
+        <w:tc>
+          <w:tcPr>
+            <w:tcW w:type="dxa" w:w="2950"/>
             <w:tcBorders>
               <w:top w:val="single" w:color="D9E1EC" w:sz="4"/>
               <w:left w:val="single" w:color="D9E1EC" w:sz="4"/>
@@ -3537,69 +4054,233 @@
                 <w:sz w:val="18"/>
                 <w:szCs w:val="18"/>
               </w:rPr>
+              <w:t xml:space="preserve">First frame must work as a static; no sound needed</w:t>
+            </w:r>
+          </w:p>
+        </w:tc>
+        <w:tc>
+          <w:tcPr>
+            <w:tcW w:type="dxa" w:w="2200"/>
+            <w:tcBorders>
+              <w:top w:val="single" w:color="D9E1EC" w:sz="4"/>
+              <w:left w:val="single" w:color="D9E1EC" w:sz="4"/>
+              <w:bottom w:val="single" w:color="D9E1EC" w:sz="4"/>
+              <w:right w:val="single" w:color="D9E1EC" w:sz="4"/>
+            </w:tcBorders>
+            <w:shd w:fill="F8FAFC" w:color="auto" w:val="clear"/>
+            <w:tcMar>
+              <w:top w:type="dxa" w:w="60"/>
+              <w:left w:type="dxa" w:w="100"/>
+              <w:bottom w:type="dxa" w:w="60"/>
+              <w:right w:type="dxa" w:w="100"/>
+            </w:tcMar>
+          </w:tcPr>
+          <w:p>
+            <w:pPr>
+              <w:spacing w:after="30" w:line="250"/>
+            </w:pPr>
+            <w:r>
+              <w:rPr>
+                <w:rFonts w:ascii="Arial" w:cs="Arial" w:eastAsia="Arial" w:hAnsi="Arial"/>
+                <w:sz w:val="18"/>
+                <w:szCs w:val="18"/>
+              </w:rPr>
+              <w:t xml:space="preserve">C3, if angle A wins (optional at launch for P4 / O1 stories)</w:t>
+            </w:r>
+          </w:p>
+        </w:tc>
+        <w:tc>
+          <w:tcPr>
+            <w:tcW w:type="dxa" w:w="1538"/>
+            <w:tcBorders>
+              <w:top w:val="single" w:color="D9E1EC" w:sz="4"/>
+              <w:left w:val="single" w:color="D9E1EC" w:sz="4"/>
+              <w:bottom w:val="single" w:color="D9E1EC" w:sz="4"/>
+              <w:right w:val="single" w:color="D9E1EC" w:sz="4"/>
+            </w:tcBorders>
+            <w:shd w:fill="F8FAFC" w:color="auto" w:val="clear"/>
+            <w:tcMar>
+              <w:top w:type="dxa" w:w="60"/>
+              <w:left w:type="dxa" w:w="100"/>
+              <w:bottom w:type="dxa" w:w="60"/>
+              <w:right w:type="dxa" w:w="100"/>
+            </w:tcMar>
+          </w:tcPr>
+          <w:p>
+            <w:pPr>
+              <w:spacing w:after="30" w:line="250"/>
+            </w:pPr>
+            <w:r>
+              <w:rPr>
+                <w:rFonts w:ascii="Arial" w:cs="Arial" w:eastAsia="Arial" w:hAnsi="Arial"/>
+                <w:b/>
+                <w:bCs/>
+                <w:sz w:val="18"/>
+                <w:szCs w:val="18"/>
+              </w:rPr>
+              <w:t xml:space="preserve">W3</w:t>
+            </w:r>
+          </w:p>
+        </w:tc>
+      </w:tr>
+      <w:tr>
+        <w:trPr>
+          <w:cantSplit/>
+        </w:trPr>
+        <w:tc>
+          <w:tcPr>
+            <w:tcW w:type="dxa" w:w="1700"/>
+            <w:tcBorders>
+              <w:top w:val="single" w:color="D9E1EC" w:sz="4"/>
+              <w:left w:val="single" w:color="D9E1EC" w:sz="4"/>
+              <w:bottom w:val="single" w:color="D9E1EC" w:sz="4"/>
+              <w:right w:val="single" w:color="D9E1EC" w:sz="4"/>
+            </w:tcBorders>
+            <w:shd w:fill="E3F6EF" w:color="auto" w:val="clear"/>
+            <w:tcMar>
+              <w:top w:type="dxa" w:w="60"/>
+              <w:left w:type="dxa" w:w="100"/>
+              <w:bottom w:type="dxa" w:w="60"/>
+              <w:right w:type="dxa" w:w="100"/>
+            </w:tcMar>
+          </w:tcPr>
+          <w:p>
+            <w:pPr>
+              <w:spacing w:after="30" w:line="250"/>
+            </w:pPr>
+            <w:r>
+              <w:rPr>
+                <w:rFonts w:ascii="Arial" w:cs="Arial" w:eastAsia="Arial" w:hAnsi="Arial"/>
+                <w:sz w:val="18"/>
+                <w:szCs w:val="18"/>
+              </w:rPr>
+              <w:t xml:space="preserve">Real photo / 15 s video</w:t>
+            </w:r>
+          </w:p>
+        </w:tc>
+        <w:tc>
+          <w:tcPr>
+            <w:tcW w:type="dxa" w:w="1250"/>
+            <w:tcBorders>
+              <w:top w:val="single" w:color="D9E1EC" w:sz="4"/>
+              <w:left w:val="single" w:color="D9E1EC" w:sz="4"/>
+              <w:bottom w:val="single" w:color="D9E1EC" w:sz="4"/>
+              <w:right w:val="single" w:color="D9E1EC" w:sz="4"/>
+            </w:tcBorders>
+            <w:shd w:fill="FFFFFF" w:color="auto" w:val="clear"/>
+            <w:tcMar>
+              <w:top w:type="dxa" w:w="60"/>
+              <w:left w:type="dxa" w:w="100"/>
+              <w:bottom w:type="dxa" w:w="60"/>
+              <w:right w:type="dxa" w:w="100"/>
+            </w:tcMar>
+          </w:tcPr>
+          <w:p>
+            <w:pPr>
+              <w:spacing w:after="30" w:line="250"/>
+            </w:pPr>
+            <w:r>
+              <w:rPr>
+                <w:rFonts w:ascii="Arial" w:cs="Arial" w:eastAsia="Arial" w:hAnsi="Arial"/>
+                <w:sz w:val="18"/>
+                <w:szCs w:val="18"/>
+              </w:rPr>
               <w:t xml:space="preserve">4:5 + 9:16</w:t>
             </w:r>
           </w:p>
         </w:tc>
         <w:tc>
           <w:tcPr>
-            <w:tcW w:type="dxa" w:w="3800"/>
-            <w:tcBorders>
-              <w:top w:val="single" w:color="D9E1EC" w:sz="4"/>
-              <w:left w:val="single" w:color="D9E1EC" w:sz="4"/>
-              <w:bottom w:val="single" w:color="D9E1EC" w:sz="4"/>
-              <w:right w:val="single" w:color="D9E1EC" w:sz="4"/>
-            </w:tcBorders>
-            <w:shd w:fill="F8FAFC" w:color="auto" w:val="clear"/>
-            <w:tcMar>
-              <w:top w:type="dxa" w:w="60"/>
-              <w:left w:type="dxa" w:w="100"/>
-              <w:bottom w:type="dxa" w:w="60"/>
-              <w:right w:type="dxa" w:w="100"/>
-            </w:tcMar>
-          </w:tcPr>
-          <w:p>
-            <w:pPr>
-              <w:spacing w:after="30" w:line="250"/>
-            </w:pPr>
-            <w:r>
-              <w:rPr>
-                <w:rFonts w:ascii="Arial" w:cs="Arial" w:eastAsia="Arial" w:hAnsi="Arial"/>
-                <w:sz w:val="18"/>
-                <w:szCs w:val="18"/>
-              </w:rPr>
-              <w:t xml:space="preserve">First frame must work as a static; no sound needed</w:t>
-            </w:r>
-          </w:p>
-        </w:tc>
-        <w:tc>
-          <w:tcPr>
-            <w:tcW w:type="dxa" w:w="2438"/>
-            <w:tcBorders>
-              <w:top w:val="single" w:color="D9E1EC" w:sz="4"/>
-              <w:left w:val="single" w:color="D9E1EC" w:sz="4"/>
-              <w:bottom w:val="single" w:color="D9E1EC" w:sz="4"/>
-              <w:right w:val="single" w:color="D9E1EC" w:sz="4"/>
-            </w:tcBorders>
-            <w:shd w:fill="F8FAFC" w:color="auto" w:val="clear"/>
-            <w:tcMar>
-              <w:top w:type="dxa" w:w="60"/>
-              <w:left w:type="dxa" w:w="100"/>
-              <w:bottom w:type="dxa" w:w="60"/>
-              <w:right w:type="dxa" w:w="100"/>
-            </w:tcMar>
-          </w:tcPr>
-          <w:p>
-            <w:pPr>
-              <w:spacing w:after="30" w:line="250"/>
-            </w:pPr>
-            <w:r>
-              <w:rPr>
-                <w:rFonts w:ascii="Arial" w:cs="Arial" w:eastAsia="Arial" w:hAnsi="Arial"/>
-                <w:sz w:val="18"/>
-                <w:szCs w:val="18"/>
-              </w:rPr>
-              <w:t xml:space="preserve">C3 test only</w:t>
+            <w:tcW w:type="dxa" w:w="2950"/>
+            <w:tcBorders>
+              <w:top w:val="single" w:color="D9E1EC" w:sz="4"/>
+              <w:left w:val="single" w:color="D9E1EC" w:sz="4"/>
+              <w:bottom w:val="single" w:color="D9E1EC" w:sz="4"/>
+              <w:right w:val="single" w:color="D9E1EC" w:sz="4"/>
+            </w:tcBorders>
+            <w:shd w:fill="FFFFFF" w:color="auto" w:val="clear"/>
+            <w:tcMar>
+              <w:top w:type="dxa" w:w="60"/>
+              <w:left w:type="dxa" w:w="100"/>
+              <w:bottom w:type="dxa" w:w="60"/>
+              <w:right w:type="dxa" w:w="100"/>
+            </w:tcMar>
+          </w:tcPr>
+          <w:p>
+            <w:pPr>
+              <w:spacing w:after="30" w:line="250"/>
+            </w:pPr>
+            <w:r>
+              <w:rPr>
+                <w:rFonts w:ascii="Arial" w:cs="Arial" w:eastAsia="Arial" w:hAnsi="Arial"/>
+                <w:sz w:val="18"/>
+                <w:szCs w:val="18"/>
+              </w:rPr>
+              <w:t xml:space="preserve">Kid-eye height, natural light, signed consent</w:t>
+            </w:r>
+          </w:p>
+        </w:tc>
+        <w:tc>
+          <w:tcPr>
+            <w:tcW w:type="dxa" w:w="2200"/>
+            <w:tcBorders>
+              <w:top w:val="single" w:color="D9E1EC" w:sz="4"/>
+              <w:left w:val="single" w:color="D9E1EC" w:sz="4"/>
+              <w:bottom w:val="single" w:color="D9E1EC" w:sz="4"/>
+              <w:right w:val="single" w:color="D9E1EC" w:sz="4"/>
+            </w:tcBorders>
+            <w:shd w:fill="FFFFFF" w:color="auto" w:val="clear"/>
+            <w:tcMar>
+              <w:top w:type="dxa" w:w="60"/>
+              <w:left w:type="dxa" w:w="100"/>
+              <w:bottom w:type="dxa" w:w="60"/>
+              <w:right w:type="dxa" w:w="100"/>
+            </w:tcMar>
+          </w:tcPr>
+          <w:p>
+            <w:pPr>
+              <w:spacing w:after="30" w:line="250"/>
+            </w:pPr>
+            <w:r>
+              <w:rPr>
+                <w:rFonts w:ascii="Arial" w:cs="Arial" w:eastAsia="Arial" w:hAnsi="Arial"/>
+                <w:sz w:val="18"/>
+                <w:szCs w:val="18"/>
+              </w:rPr>
+              <w:t xml:space="preserve">Top 2 ads, Reel, R4–R5</w:t>
+            </w:r>
+          </w:p>
+        </w:tc>
+        <w:tc>
+          <w:tcPr>
+            <w:tcW w:type="dxa" w:w="1538"/>
+            <w:tcBorders>
+              <w:top w:val="single" w:color="D9E1EC" w:sz="4"/>
+              <w:left w:val="single" w:color="D9E1EC" w:sz="4"/>
+              <w:bottom w:val="single" w:color="D9E1EC" w:sz="4"/>
+              <w:right w:val="single" w:color="D9E1EC" w:sz="4"/>
+            </w:tcBorders>
+            <w:shd w:fill="FFFFFF" w:color="auto" w:val="clear"/>
+            <w:tcMar>
+              <w:top w:type="dxa" w:w="60"/>
+              <w:left w:type="dxa" w:w="100"/>
+              <w:bottom w:type="dxa" w:w="60"/>
+              <w:right w:type="dxa" w:w="100"/>
+            </w:tcMar>
+          </w:tcPr>
+          <w:p>
+            <w:pPr>
+              <w:spacing w:after="30" w:line="250"/>
+            </w:pPr>
+            <w:r>
+              <w:rPr>
+                <w:rFonts w:ascii="Arial" w:cs="Arial" w:eastAsia="Arial" w:hAnsi="Arial"/>
+                <w:b/>
+                <w:bCs/>
+                <w:sz w:val="18"/>
+                <w:szCs w:val="18"/>
+              </w:rPr>
+              <w:t xml:space="preserve">W4 →</w:t>
             </w:r>
           </w:p>
         </w:tc>
@@ -3796,6 +4477,437 @@
               <w:t xml:space="preserve">Job of the creatives: find which message makes cold Novi Sad parents apply — and which grades respond.</w:t>
             </w:r>
           </w:p>
+          <w:p>
+            <w:pPr>
+              <w:spacing w:after="20"/>
+            </w:pPr>
+            <w:r>
+              <w:rPr>
+                <w:rFonts w:ascii="Arial" w:cs="Arial" w:eastAsia="Arial" w:hAnsi="Arial"/>
+                <w:color w:val="CBD5E1"/>
+                <w:sz w:val="18"/>
+                <w:szCs w:val="18"/>
+              </w:rPr>
+              <w:t xml:space="preserve">Angles: </w:t>
+            </w:r>
+            <w:r>
+              <w:rPr>
+                <w:rFonts w:ascii="Arial" w:cs="Arial" w:eastAsia="Arial" w:hAnsi="Arial"/>
+                <w:b/>
+                <w:bCs/>
+                <w:color w:val="CBD5E1"/>
+                <w:sz w:val="18"/>
+                <w:szCs w:val="18"/>
+              </w:rPr>
+              <w:t xml:space="preserve">A + B + C, all live in parallel from day 1</w:t>
+            </w:r>
+            <w:r>
+              <w:rPr>
+                <w:rFonts w:ascii="Arial" w:cs="Arial" w:eastAsia="Arial" w:hAnsi="Arial"/>
+                <w:color w:val="CBD5E1"/>
+                <w:sz w:val="18"/>
+                <w:szCs w:val="18"/>
+              </w:rPr>
+              <w:t xml:space="preserve"> · formats: static (W1–W2) → winner's motion / carousel (W3) → real photo / video (W4)</w:t>
+            </w:r>
+          </w:p>
+        </w:tc>
+      </w:tr>
+    </w:tbl>
+    <w:p>
+      <w:pPr>
+        <w:spacing w:after="100"/>
+      </w:pPr>
+    </w:p>
+    <w:tbl>
+      <w:tblPr>
+        <w:tblW w:type="dxa" w:w="9638"/>
+        <w:tblBorders>
+          <w:top w:val="single" w:color="auto" w:sz="4"/>
+          <w:left w:val="single" w:color="auto" w:sz="4"/>
+          <w:bottom w:val="single" w:color="auto" w:sz="4"/>
+          <w:right w:val="single" w:color="auto" w:sz="4"/>
+          <w:insideH w:val="single" w:color="auto" w:sz="4"/>
+          <w:insideV w:val="single" w:color="auto" w:sz="4"/>
+        </w:tblBorders>
+      </w:tblPr>
+      <w:tblGrid>
+        <w:gridCol w:w="1400"/>
+        <w:gridCol w:w="2059"/>
+        <w:gridCol w:w="2059"/>
+        <w:gridCol w:w="2059"/>
+        <w:gridCol w:w="2061"/>
+      </w:tblGrid>
+      <w:tr>
+        <w:tc>
+          <w:tcPr>
+            <w:tcW w:type="dxa" w:w="1400"/>
+            <w:tcBorders>
+              <w:top w:val="single" w:color="D9E1EC" w:sz="4"/>
+              <w:left w:val="single" w:color="D9E1EC" w:sz="4"/>
+              <w:bottom w:val="single" w:color="D9E1EC" w:sz="4"/>
+              <w:right w:val="single" w:color="D9E1EC" w:sz="4"/>
+            </w:tcBorders>
+            <w:shd w:fill="0F172A" w:color="auto" w:val="clear"/>
+            <w:tcMar>
+              <w:top w:type="dxa" w:w="60"/>
+              <w:left w:type="dxa" w:w="90"/>
+              <w:bottom w:type="dxa" w:w="60"/>
+              <w:right w:type="dxa" w:w="90"/>
+            </w:tcMar>
+            <w:vAlign w:val="center"/>
+          </w:tcPr>
+          <w:p>
+            <w:pPr>
+              <w:spacing w:after="30" w:line="250"/>
+            </w:pPr>
+          </w:p>
+        </w:tc>
+        <w:tc>
+          <w:tcPr>
+            <w:tcW w:type="dxa" w:w="2059"/>
+            <w:tcBorders>
+              <w:top w:val="single" w:color="D9E1EC" w:sz="4"/>
+              <w:left w:val="single" w:color="D9E1EC" w:sz="4"/>
+              <w:bottom w:val="single" w:color="D9E1EC" w:sz="4"/>
+              <w:right w:val="single" w:color="D9E1EC" w:sz="4"/>
+            </w:tcBorders>
+            <w:shd w:fill="0F172A" w:color="auto" w:val="clear"/>
+            <w:tcMar>
+              <w:top w:type="dxa" w:w="60"/>
+              <w:left w:type="dxa" w:w="90"/>
+              <w:bottom w:type="dxa" w:w="60"/>
+              <w:right w:type="dxa" w:w="90"/>
+            </w:tcMar>
+            <w:vAlign w:val="center"/>
+          </w:tcPr>
+          <w:p>
+            <w:pPr>
+              <w:spacing w:after="30" w:line="250"/>
+            </w:pPr>
+            <w:r>
+              <w:rPr>
+                <w:rFonts w:ascii="Arial" w:cs="Arial" w:eastAsia="Arial" w:hAnsi="Arial"/>
+                <w:b/>
+                <w:bCs/>
+                <w:color w:val="FFFFFF"/>
+                <w:sz w:val="16"/>
+                <w:szCs w:val="16"/>
+              </w:rPr>
+              <w:t xml:space="preserve">W1 · 6–11 Oct</w:t>
+            </w:r>
+          </w:p>
+        </w:tc>
+        <w:tc>
+          <w:tcPr>
+            <w:tcW w:type="dxa" w:w="2059"/>
+            <w:tcBorders>
+              <w:top w:val="single" w:color="D9E1EC" w:sz="4"/>
+              <w:left w:val="single" w:color="D9E1EC" w:sz="4"/>
+              <w:bottom w:val="single" w:color="D9E1EC" w:sz="4"/>
+              <w:right w:val="single" w:color="D9E1EC" w:sz="4"/>
+            </w:tcBorders>
+            <w:shd w:fill="0F172A" w:color="auto" w:val="clear"/>
+            <w:tcMar>
+              <w:top w:type="dxa" w:w="60"/>
+              <w:left w:type="dxa" w:w="90"/>
+              <w:bottom w:type="dxa" w:w="60"/>
+              <w:right w:type="dxa" w:w="90"/>
+            </w:tcMar>
+            <w:vAlign w:val="center"/>
+          </w:tcPr>
+          <w:p>
+            <w:pPr>
+              <w:spacing w:after="30" w:line="250"/>
+            </w:pPr>
+            <w:r>
+              <w:rPr>
+                <w:rFonts w:ascii="Arial" w:cs="Arial" w:eastAsia="Arial" w:hAnsi="Arial"/>
+                <w:b/>
+                <w:bCs/>
+                <w:color w:val="FFFFFF"/>
+                <w:sz w:val="16"/>
+                <w:szCs w:val="16"/>
+              </w:rPr>
+              <w:t xml:space="preserve">W2 · 12–18 Oct</w:t>
+            </w:r>
+          </w:p>
+        </w:tc>
+        <w:tc>
+          <w:tcPr>
+            <w:tcW w:type="dxa" w:w="2059"/>
+            <w:tcBorders>
+              <w:top w:val="single" w:color="D9E1EC" w:sz="4"/>
+              <w:left w:val="single" w:color="D9E1EC" w:sz="4"/>
+              <w:bottom w:val="single" w:color="D9E1EC" w:sz="4"/>
+              <w:right w:val="single" w:color="D9E1EC" w:sz="4"/>
+            </w:tcBorders>
+            <w:shd w:fill="0F172A" w:color="auto" w:val="clear"/>
+            <w:tcMar>
+              <w:top w:type="dxa" w:w="60"/>
+              <w:left w:type="dxa" w:w="90"/>
+              <w:bottom w:type="dxa" w:w="60"/>
+              <w:right w:type="dxa" w:w="90"/>
+            </w:tcMar>
+            <w:vAlign w:val="center"/>
+          </w:tcPr>
+          <w:p>
+            <w:pPr>
+              <w:spacing w:after="30" w:line="250"/>
+            </w:pPr>
+            <w:r>
+              <w:rPr>
+                <w:rFonts w:ascii="Arial" w:cs="Arial" w:eastAsia="Arial" w:hAnsi="Arial"/>
+                <w:b/>
+                <w:bCs/>
+                <w:color w:val="FFFFFF"/>
+                <w:sz w:val="16"/>
+                <w:szCs w:val="16"/>
+              </w:rPr>
+              <w:t xml:space="preserve">W3 · 19–25 Oct</w:t>
+            </w:r>
+          </w:p>
+        </w:tc>
+        <w:tc>
+          <w:tcPr>
+            <w:tcW w:type="dxa" w:w="2061"/>
+            <w:tcBorders>
+              <w:top w:val="single" w:color="D9E1EC" w:sz="4"/>
+              <w:left w:val="single" w:color="D9E1EC" w:sz="4"/>
+              <w:bottom w:val="single" w:color="D9E1EC" w:sz="4"/>
+              <w:right w:val="single" w:color="D9E1EC" w:sz="4"/>
+            </w:tcBorders>
+            <w:shd w:fill="0F172A" w:color="auto" w:val="clear"/>
+            <w:tcMar>
+              <w:top w:type="dxa" w:w="60"/>
+              <w:left w:type="dxa" w:w="90"/>
+              <w:bottom w:type="dxa" w:w="60"/>
+              <w:right w:type="dxa" w:w="90"/>
+            </w:tcMar>
+            <w:vAlign w:val="center"/>
+          </w:tcPr>
+          <w:p>
+            <w:pPr>
+              <w:spacing w:after="30" w:line="250"/>
+            </w:pPr>
+            <w:r>
+              <w:rPr>
+                <w:rFonts w:ascii="Arial" w:cs="Arial" w:eastAsia="Arial" w:hAnsi="Arial"/>
+                <w:b/>
+                <w:bCs/>
+                <w:color w:val="FFFFFF"/>
+                <w:sz w:val="16"/>
+                <w:szCs w:val="16"/>
+              </w:rPr>
+              <w:t xml:space="preserve">W4 · 26 Oct →</w:t>
+            </w:r>
+          </w:p>
+        </w:tc>
+      </w:tr>
+      <w:tr>
+        <w:trPr>
+          <w:cantSplit/>
+        </w:trPr>
+        <w:tc>
+          <w:tcPr>
+            <w:tcW w:type="dxa" w:w="1400"/>
+            <w:tcBorders>
+              <w:top w:val="single" w:color="D9E1EC" w:sz="4"/>
+              <w:left w:val="single" w:color="D9E1EC" w:sz="4"/>
+              <w:bottom w:val="single" w:color="D9E1EC" w:sz="4"/>
+              <w:right w:val="single" w:color="D9E1EC" w:sz="4"/>
+            </w:tcBorders>
+            <w:shd w:fill="FFFFFF" w:color="auto" w:val="clear"/>
+            <w:tcMar>
+              <w:top w:type="dxa" w:w="60"/>
+              <w:left w:type="dxa" w:w="90"/>
+              <w:bottom w:type="dxa" w:w="60"/>
+              <w:right w:type="dxa" w:w="90"/>
+            </w:tcMar>
+            <w:vAlign w:val="center"/>
+          </w:tcPr>
+          <w:p>
+            <w:pPr>
+              <w:spacing w:after="30" w:line="250"/>
+            </w:pPr>
+            <w:r>
+              <w:rPr>
+                <w:rFonts w:ascii="Arial" w:cs="Arial" w:eastAsia="Arial" w:hAnsi="Arial"/>
+                <w:b/>
+                <w:bCs/>
+                <w:sz w:val="16"/>
+                <w:szCs w:val="16"/>
+              </w:rPr>
+              <w:t xml:space="preserve">This ad set</w:t>
+            </w:r>
+          </w:p>
+        </w:tc>
+        <w:tc>
+          <w:tcPr>
+            <w:tcW w:type="dxa" w:w="2059"/>
+            <w:tcBorders>
+              <w:top w:val="single" w:color="D9E1EC" w:sz="4"/>
+              <w:left w:val="single" w:color="D9E1EC" w:sz="4"/>
+              <w:bottom w:val="single" w:color="D9E1EC" w:sz="4"/>
+              <w:right w:val="single" w:color="D9E1EC" w:sz="4"/>
+            </w:tcBorders>
+            <w:shd w:fill="E8F2FF" w:color="auto" w:val="clear"/>
+            <w:tcMar>
+              <w:top w:type="dxa" w:w="60"/>
+              <w:left w:type="dxa" w:w="90"/>
+              <w:bottom w:type="dxa" w:w="60"/>
+              <w:right w:type="dxa" w:w="90"/>
+            </w:tcMar>
+            <w:vAlign w:val="center"/>
+          </w:tcPr>
+          <w:p>
+            <w:pPr>
+              <w:spacing w:after="30" w:line="250"/>
+            </w:pPr>
+            <w:r>
+              <w:rPr>
+                <w:rFonts w:ascii="Arial" w:cs="Arial" w:eastAsia="Arial" w:hAnsi="Arial"/>
+                <w:sz w:val="16"/>
+                <w:szCs w:val="16"/>
+              </w:rPr>
+              <w:t xml:space="preserve">P1–P6 live · angles A + B + C side by side</w:t>
+            </w:r>
+          </w:p>
+          <w:p>
+            <w:pPr>
+              <w:spacing w:after="30" w:line="250"/>
+            </w:pPr>
+            <w:r>
+              <w:rPr>
+                <w:rFonts w:ascii="Arial" w:cs="Arial" w:eastAsia="Arial" w:hAnsi="Arial"/>
+                <w:sz w:val="16"/>
+                <w:szCs w:val="16"/>
+              </w:rPr>
+              <w:t xml:space="preserve">Static</w:t>
+            </w:r>
+          </w:p>
+        </w:tc>
+        <w:tc>
+          <w:tcPr>
+            <w:tcW w:type="dxa" w:w="2059"/>
+            <w:tcBorders>
+              <w:top w:val="single" w:color="D9E1EC" w:sz="4"/>
+              <w:left w:val="single" w:color="D9E1EC" w:sz="4"/>
+              <w:bottom w:val="single" w:color="D9E1EC" w:sz="4"/>
+              <w:right w:val="single" w:color="D9E1EC" w:sz="4"/>
+            </w:tcBorders>
+            <w:shd w:fill="E8F2FF" w:color="auto" w:val="clear"/>
+            <w:tcMar>
+              <w:top w:type="dxa" w:w="60"/>
+              <w:left w:type="dxa" w:w="90"/>
+              <w:bottom w:type="dxa" w:w="60"/>
+              <w:right w:type="dxa" w:w="90"/>
+            </w:tcMar>
+            <w:vAlign w:val="center"/>
+          </w:tcPr>
+          <w:p>
+            <w:pPr>
+              <w:spacing w:after="30" w:line="250"/>
+            </w:pPr>
+            <w:r>
+              <w:rPr>
+                <w:rFonts w:ascii="Arial" w:cs="Arial" w:eastAsia="Arial" w:hAnsi="Arial"/>
+                <w:sz w:val="16"/>
+                <w:szCs w:val="16"/>
+              </w:rPr>
+              <w:t xml:space="preserve">First read → pause bottom 2–3</w:t>
+            </w:r>
+          </w:p>
+          <w:p>
+            <w:pPr>
+              <w:spacing w:after="30" w:line="250"/>
+            </w:pPr>
+            <w:r>
+              <w:rPr>
+                <w:rFonts w:ascii="Arial" w:cs="Arial" w:eastAsia="Arial" w:hAnsi="Arial"/>
+                <w:sz w:val="16"/>
+                <w:szCs w:val="16"/>
+              </w:rPr>
+              <w:t xml:space="preserve">Static</w:t>
+            </w:r>
+          </w:p>
+        </w:tc>
+        <w:tc>
+          <w:tcPr>
+            <w:tcW w:type="dxa" w:w="2059"/>
+            <w:tcBorders>
+              <w:top w:val="single" w:color="D9E1EC" w:sz="4"/>
+              <w:left w:val="single" w:color="D9E1EC" w:sz="4"/>
+              <w:bottom w:val="single" w:color="D9E1EC" w:sz="4"/>
+              <w:right w:val="single" w:color="D9E1EC" w:sz="4"/>
+            </w:tcBorders>
+            <w:shd w:fill="EDE8FF" w:color="auto" w:val="clear"/>
+            <w:tcMar>
+              <w:top w:type="dxa" w:w="60"/>
+              <w:left w:type="dxa" w:w="90"/>
+              <w:bottom w:type="dxa" w:w="60"/>
+              <w:right w:type="dxa" w:w="90"/>
+            </w:tcMar>
+            <w:vAlign w:val="center"/>
+          </w:tcPr>
+          <w:p>
+            <w:pPr>
+              <w:spacing w:after="30" w:line="250"/>
+            </w:pPr>
+            <w:r>
+              <w:rPr>
+                <w:rFonts w:ascii="Arial" w:cs="Arial" w:eastAsia="Arial" w:hAnsi="Arial"/>
+                <w:sz w:val="16"/>
+                <w:szCs w:val="16"/>
+              </w:rPr>
+              <w:t xml:space="preserve">Round 2: winner iterations</w:t>
+            </w:r>
+          </w:p>
+          <w:p>
+            <w:pPr>
+              <w:spacing w:after="30" w:line="250"/>
+            </w:pPr>
+            <w:r>
+              <w:rPr>
+                <w:rFonts w:ascii="Arial" w:cs="Arial" w:eastAsia="Arial" w:hAnsi="Arial"/>
+                <w:sz w:val="16"/>
+                <w:szCs w:val="16"/>
+              </w:rPr>
+              <w:t xml:space="preserve">Static + motion / carousel</w:t>
+            </w:r>
+          </w:p>
+        </w:tc>
+        <w:tc>
+          <w:tcPr>
+            <w:tcW w:type="dxa" w:w="2061"/>
+            <w:tcBorders>
+              <w:top w:val="single" w:color="D9E1EC" w:sz="4"/>
+              <w:left w:val="single" w:color="D9E1EC" w:sz="4"/>
+              <w:bottom w:val="single" w:color="D9E1EC" w:sz="4"/>
+              <w:right w:val="single" w:color="D9E1EC" w:sz="4"/>
+            </w:tcBorders>
+            <w:shd w:fill="E3F6EF" w:color="auto" w:val="clear"/>
+            <w:tcMar>
+              <w:top w:type="dxa" w:w="60"/>
+              <w:left w:type="dxa" w:w="90"/>
+              <w:bottom w:type="dxa" w:w="60"/>
+              <w:right w:type="dxa" w:w="90"/>
+            </w:tcMar>
+            <w:vAlign w:val="center"/>
+          </w:tcPr>
+          <w:p>
+            <w:pPr>
+              <w:spacing w:after="30" w:line="250"/>
+            </w:pPr>
+            <w:r>
+              <w:rPr>
+                <w:rFonts w:ascii="Arial" w:cs="Arial" w:eastAsia="Arial" w:hAnsi="Arial"/>
+                <w:sz w:val="16"/>
+                <w:szCs w:val="16"/>
+              </w:rPr>
+              <w:t xml:space="preserve">Round 3: real-photo versions + 15 s Reel</w:t>
+            </w:r>
+          </w:p>
         </w:tc>
       </w:tr>
     </w:tbl>
@@ -3808,7 +4920,7 @@
         <w:rPr>
           <w:rFonts w:ascii="Arial" w:cs="Arial" w:eastAsia="Arial" w:hAnsi="Arial"/>
         </w:rPr>
-        <w:t xml:space="preserve">START — 6 ads at launch</w:t>
+        <w:t xml:space="preserve">START — W1 · 6 static ads, angles A + B + C side by side</w:t>
       </w:r>
     </w:p>
     <w:p>
@@ -3819,7 +4931,21 @@
         <w:rPr>
           <w:rFonts w:ascii="Arial" w:cs="Arial" w:eastAsia="Arial" w:hAnsi="Arial"/>
         </w:rPr>
-        <w:t xml:space="preserve">All six go into the same ad set on day 1. They cover four different emotional territories (aspiration, mechanism, problem, offer), so Meta can find the right parent for each — and we get a clean read on which angle wins. P1 and P2 share one visual to test </w:t>
+        <w:t xml:space="preserve">All six go live together on day 1, in the same ad set — the angles run </w:t>
+      </w:r>
+      <w:r>
+        <w:rPr>
+          <w:rFonts w:ascii="Arial" w:cs="Arial" w:eastAsia="Arial" w:hAnsi="Arial"/>
+          <w:b/>
+          <w:bCs/>
+        </w:rPr>
+        <w:t xml:space="preserve">side by side, not one after another</w:t>
+      </w:r>
+      <w:r>
+        <w:rPr>
+          <w:rFonts w:ascii="Arial" w:cs="Arial" w:eastAsia="Arial" w:hAnsi="Arial"/>
+        </w:rPr>
+        <w:t xml:space="preserve">. They cover four different emotional territories (aspiration, mechanism, problem, offer), so Meta can find the right parent for each — and we get a clean read on which angle wins. P1 and P2 share one visual to test </w:t>
       </w:r>
       <w:r>
         <w:rPr>
@@ -3954,6 +5080,30 @@
           </w:p>
           <w:p>
             <w:pPr>
+              <w:shd w:fill="E8F2FF" w:color="auto" w:val="clear"/>
+              <w:spacing w:after="90"/>
+            </w:pPr>
+            <w:r>
+              <w:rPr>
+                <w:rFonts w:ascii="Arial" w:cs="Arial" w:eastAsia="Arial" w:hAnsi="Arial"/>
+                <w:b/>
+                <w:bCs/>
+                <w:sz w:val="18"/>
+                <w:szCs w:val="18"/>
+              </w:rPr>
+              <w:t xml:space="preserve">When · format:</w:t>
+            </w:r>
+            <w:r>
+              <w:rPr>
+                <w:rFonts w:ascii="Arial" w:cs="Arial" w:eastAsia="Arial" w:hAnsi="Arial"/>
+                <w:sz w:val="18"/>
+                <w:szCs w:val="18"/>
+              </w:rPr>
+              <w:t xml:space="preserve"> From W1 · stays while in the top 3 · static 4:5 + 9:16</w:t>
+            </w:r>
+          </w:p>
+          <w:p>
+            <w:pPr>
               <w:spacing w:after="55" w:line="250"/>
             </w:pPr>
             <w:r>
@@ -4216,6 +5366,30 @@
           </w:p>
           <w:p>
             <w:pPr>
+              <w:shd w:fill="E8F2FF" w:color="auto" w:val="clear"/>
+              <w:spacing w:after="90"/>
+            </w:pPr>
+            <w:r>
+              <w:rPr>
+                <w:rFonts w:ascii="Arial" w:cs="Arial" w:eastAsia="Arial" w:hAnsi="Arial"/>
+                <w:b/>
+                <w:bCs/>
+                <w:sz w:val="18"/>
+                <w:szCs w:val="18"/>
+              </w:rPr>
+              <w:t xml:space="preserve">When · format:</w:t>
+            </w:r>
+            <w:r>
+              <w:rPr>
+                <w:rFonts w:ascii="Arial" w:cs="Arial" w:eastAsia="Arial" w:hAnsi="Arial"/>
+                <w:sz w:val="18"/>
+                <w:szCs w:val="18"/>
+              </w:rPr>
+              <w:t xml:space="preserve"> From W1 · read in W2 · copy test vs P1 · static (reuses P1)</w:t>
+            </w:r>
+          </w:p>
+          <w:p>
+            <w:pPr>
               <w:spacing w:after="55" w:line="250"/>
             </w:pPr>
             <w:r>
@@ -4455,6 +5629,30 @@
           </w:p>
           <w:p>
             <w:pPr>
+              <w:shd w:fill="E8F2FF" w:color="auto" w:val="clear"/>
+              <w:spacing w:after="90"/>
+            </w:pPr>
+            <w:r>
+              <w:rPr>
+                <w:rFonts w:ascii="Arial" w:cs="Arial" w:eastAsia="Arial" w:hAnsi="Arial"/>
+                <w:b/>
+                <w:bCs/>
+                <w:sz w:val="18"/>
+                <w:szCs w:val="18"/>
+              </w:rPr>
+              <w:t xml:space="preserve">When · format:</w:t>
+            </w:r>
+            <w:r>
+              <w:rPr>
+                <w:rFonts w:ascii="Arial" w:cs="Arial" w:eastAsia="Arial" w:hAnsi="Arial"/>
+                <w:sz w:val="18"/>
+                <w:szCs w:val="18"/>
+              </w:rPr>
+              <w:t xml:space="preserve"> From W1 · static · carousel version in W3 if angle B wins</w:t>
+            </w:r>
+          </w:p>
+          <w:p>
+            <w:pPr>
               <w:spacing w:after="55" w:line="250"/>
             </w:pPr>
             <w:r>
@@ -4717,6 +5915,30 @@
           </w:p>
           <w:p>
             <w:pPr>
+              <w:shd w:fill="E8F2FF" w:color="auto" w:val="clear"/>
+              <w:spacing w:after="90"/>
+            </w:pPr>
+            <w:r>
+              <w:rPr>
+                <w:rFonts w:ascii="Arial" w:cs="Arial" w:eastAsia="Arial" w:hAnsi="Arial"/>
+                <w:b/>
+                <w:bCs/>
+                <w:sz w:val="18"/>
+                <w:szCs w:val="18"/>
+              </w:rPr>
+              <w:t xml:space="preserve">When · format:</w:t>
+            </w:r>
+            <w:r>
+              <w:rPr>
+                <w:rFonts w:ascii="Arial" w:cs="Arial" w:eastAsia="Arial" w:hAnsi="Arial"/>
+                <w:sz w:val="18"/>
+                <w:szCs w:val="18"/>
+              </w:rPr>
+              <w:t xml:space="preserve"> From W1 · static · 6 s motion in W3 if angle A wins (optional earlier for the 9:16)</w:t>
+            </w:r>
+          </w:p>
+          <w:p>
+            <w:pPr>
               <w:spacing w:after="55" w:line="250"/>
             </w:pPr>
             <w:r>
@@ -4979,6 +6201,30 @@
           </w:p>
           <w:p>
             <w:pPr>
+              <w:shd w:fill="E8F2FF" w:color="auto" w:val="clear"/>
+              <w:spacing w:after="90"/>
+            </w:pPr>
+            <w:r>
+              <w:rPr>
+                <w:rFonts w:ascii="Arial" w:cs="Arial" w:eastAsia="Arial" w:hAnsi="Arial"/>
+                <w:b/>
+                <w:bCs/>
+                <w:sz w:val="18"/>
+                <w:szCs w:val="18"/>
+              </w:rPr>
+              <w:t xml:space="preserve">When · format:</w:t>
+            </w:r>
+            <w:r>
+              <w:rPr>
+                <w:rFonts w:ascii="Arial" w:cs="Arial" w:eastAsia="Arial" w:hAnsi="Arial"/>
+                <w:sz w:val="18"/>
+                <w:szCs w:val="18"/>
+              </w:rPr>
+              <w:t xml:space="preserve"> From W1 · stays while in the top 3 · static 4:5 + 9:16</w:t>
+            </w:r>
+          </w:p>
+          <w:p>
+            <w:pPr>
               <w:spacing w:after="55" w:line="250"/>
             </w:pPr>
             <w:r>
@@ -5241,6 +6487,30 @@
           </w:p>
           <w:p>
             <w:pPr>
+              <w:shd w:fill="E8F2FF" w:color="auto" w:val="clear"/>
+              <w:spacing w:after="90"/>
+            </w:pPr>
+            <w:r>
+              <w:rPr>
+                <w:rFonts w:ascii="Arial" w:cs="Arial" w:eastAsia="Arial" w:hAnsi="Arial"/>
+                <w:b/>
+                <w:bCs/>
+                <w:sz w:val="18"/>
+                <w:szCs w:val="18"/>
+              </w:rPr>
+              <w:t xml:space="preserve">When · format:</w:t>
+            </w:r>
+            <w:r>
+              <w:rPr>
+                <w:rFonts w:ascii="Arial" w:cs="Arial" w:eastAsia="Arial" w:hAnsi="Arial"/>
+                <w:sz w:val="18"/>
+                <w:szCs w:val="18"/>
+              </w:rPr>
+              <w:t xml:space="preserve"> From W1 in Prospecting · from W2 also R1 in Retargeting · static</w:t>
+            </w:r>
+          </w:p>
+          <w:p>
+            <w:pPr>
               <w:spacing w:after="55" w:line="250"/>
             </w:pPr>
             <w:r>
@@ -5394,7 +6664,7 @@
         <w:rPr>
           <w:rFonts w:ascii="Arial" w:cs="Arial" w:eastAsia="Arial" w:hAnsi="Arial"/>
         </w:rPr>
-        <w:t xml:space="preserve">TEST — what we do after the first read</w:t>
+        <w:t xml:space="preserve">TEST — W2 first read → W3 iterations of the winner</w:t>
       </w:r>
     </w:p>
     <w:tbl>
@@ -5410,10 +6680,11 @@
         </w:tblBorders>
       </w:tblPr>
       <w:tblGrid>
-        <w:gridCol w:w="1900"/>
-        <w:gridCol w:w="1300"/>
-        <w:gridCol w:w="3400"/>
-        <w:gridCol w:w="3038"/>
+        <w:gridCol w:w="1700"/>
+        <w:gridCol w:w="1150"/>
+        <w:gridCol w:w="1500"/>
+        <w:gridCol w:w="2900"/>
+        <w:gridCol w:w="2388"/>
       </w:tblGrid>
       <w:tr>
         <w:trPr>
@@ -5421,7 +6692,7 @@
         </w:trPr>
         <w:tc>
           <w:tcPr>
-            <w:tcW w:type="dxa" w:w="1900"/>
+            <w:tcW w:type="dxa" w:w="1700"/>
             <w:tcBorders>
               <w:top w:val="single" w:color="D9E1EC" w:sz="4"/>
               <w:left w:val="single" w:color="D9E1EC" w:sz="4"/>
@@ -5455,7 +6726,7 @@
         </w:tc>
         <w:tc>
           <w:tcPr>
-            <w:tcW w:type="dxa" w:w="1300"/>
+            <w:tcW w:type="dxa" w:w="1150"/>
             <w:tcBorders>
               <w:top w:val="single" w:color="D9E1EC" w:sz="4"/>
               <w:left w:val="single" w:color="D9E1EC" w:sz="4"/>
@@ -5489,7 +6760,7 @@
         </w:tc>
         <w:tc>
           <w:tcPr>
-            <w:tcW w:type="dxa" w:w="3400"/>
+            <w:tcW w:type="dxa" w:w="1500"/>
             <w:tcBorders>
               <w:top w:val="single" w:color="D9E1EC" w:sz="4"/>
               <w:left w:val="single" w:color="D9E1EC" w:sz="4"/>
@@ -5517,13 +6788,47 @@
                 <w:sz w:val="18"/>
                 <w:szCs w:val="18"/>
               </w:rPr>
+              <w:t xml:space="preserve">Format</w:t>
+            </w:r>
+          </w:p>
+        </w:tc>
+        <w:tc>
+          <w:tcPr>
+            <w:tcW w:type="dxa" w:w="2900"/>
+            <w:tcBorders>
+              <w:top w:val="single" w:color="D9E1EC" w:sz="4"/>
+              <w:left w:val="single" w:color="D9E1EC" w:sz="4"/>
+              <w:bottom w:val="single" w:color="D9E1EC" w:sz="4"/>
+              <w:right w:val="single" w:color="D9E1EC" w:sz="4"/>
+            </w:tcBorders>
+            <w:shd w:fill="0F172A" w:color="auto" w:val="clear"/>
+            <w:tcMar>
+              <w:top w:type="dxa" w:w="70"/>
+              <w:left w:type="dxa" w:w="100"/>
+              <w:bottom w:type="dxa" w:w="70"/>
+              <w:right w:type="dxa" w:w="100"/>
+            </w:tcMar>
+          </w:tcPr>
+          <w:p>
+            <w:pPr>
+              <w:spacing w:after="30" w:line="250"/>
+            </w:pPr>
+            <w:r>
+              <w:rPr>
+                <w:rFonts w:ascii="Arial" w:cs="Arial" w:eastAsia="Arial" w:hAnsi="Arial"/>
+                <w:b/>
+                <w:bCs/>
+                <w:color w:val="FFFFFF"/>
+                <w:sz w:val="18"/>
+                <w:szCs w:val="18"/>
+              </w:rPr>
               <w:t xml:space="preserve">What</w:t>
             </w:r>
           </w:p>
         </w:tc>
         <w:tc>
           <w:tcPr>
-            <w:tcW w:type="dxa" w:w="3038"/>
+            <w:tcW w:type="dxa" w:w="2388"/>
             <w:tcBorders>
               <w:top w:val="single" w:color="D9E1EC" w:sz="4"/>
               <w:left w:val="single" w:color="D9E1EC" w:sz="4"/>
@@ -5562,7 +6867,7 @@
         </w:trPr>
         <w:tc>
           <w:tcPr>
-            <w:tcW w:type="dxa" w:w="1900"/>
+            <w:tcW w:type="dxa" w:w="1700"/>
             <w:tcBorders>
               <w:top w:val="single" w:color="D9E1EC" w:sz="4"/>
               <w:left w:val="single" w:color="D9E1EC" w:sz="4"/>
@@ -5589,13 +6894,13 @@
                 <w:sz w:val="18"/>
                 <w:szCs w:val="18"/>
               </w:rPr>
-              <w:t xml:space="preserve">R1 · Angle test</w:t>
-            </w:r>
-          </w:p>
-        </w:tc>
-        <w:tc>
-          <w:tcPr>
-            <w:tcW w:type="dxa" w:w="1300"/>
+              <w:t xml:space="preserve">Round 1 · Angle test</w:t>
+            </w:r>
+          </w:p>
+        </w:tc>
+        <w:tc>
+          <w:tcPr>
+            <w:tcW w:type="dxa" w:w="1150"/>
             <w:tcBorders>
               <w:top w:val="single" w:color="D9E1EC" w:sz="4"/>
               <w:left w:val="single" w:color="D9E1EC" w:sz="4"/>
@@ -5620,13 +6925,57 @@
                 <w:sz w:val="18"/>
                 <w:szCs w:val="18"/>
               </w:rPr>
+              <w:t xml:space="preserve">W1–W2</w:t>
+            </w:r>
+          </w:p>
+          <w:p>
+            <w:pPr>
+              <w:spacing w:after="30" w:line="250"/>
+            </w:pPr>
+            <w:r>
+              <w:rPr>
+                <w:rFonts w:ascii="Arial" w:cs="Arial" w:eastAsia="Arial" w:hAnsi="Arial"/>
+                <w:sz w:val="18"/>
+                <w:szCs w:val="18"/>
+              </w:rPr>
               <w:t xml:space="preserve">6 → ~14 Oct</w:t>
             </w:r>
           </w:p>
         </w:tc>
         <w:tc>
           <w:tcPr>
-            <w:tcW w:type="dxa" w:w="3400"/>
+            <w:tcW w:type="dxa" w:w="1500"/>
+            <w:tcBorders>
+              <w:top w:val="single" w:color="D9E1EC" w:sz="4"/>
+              <w:left w:val="single" w:color="D9E1EC" w:sz="4"/>
+              <w:bottom w:val="single" w:color="D9E1EC" w:sz="4"/>
+              <w:right w:val="single" w:color="D9E1EC" w:sz="4"/>
+            </w:tcBorders>
+            <w:shd w:fill="E8F2FF" w:color="auto" w:val="clear"/>
+            <w:tcMar>
+              <w:top w:type="dxa" w:w="60"/>
+              <w:left w:type="dxa" w:w="100"/>
+              <w:bottom w:type="dxa" w:w="60"/>
+              <w:right w:type="dxa" w:w="100"/>
+            </w:tcMar>
+          </w:tcPr>
+          <w:p>
+            <w:pPr>
+              <w:spacing w:after="30" w:line="250"/>
+            </w:pPr>
+            <w:r>
+              <w:rPr>
+                <w:rFonts w:ascii="Arial" w:cs="Arial" w:eastAsia="Arial" w:hAnsi="Arial"/>
+                <w:sz w:val="18"/>
+                <w:szCs w:val="18"/>
+              </w:rPr>
+              <w:t xml:space="preserve">Static (feed + story)</w:t>
+            </w:r>
+          </w:p>
+        </w:tc>
+        <w:tc>
+          <w:tcPr>
+            <w:tcW w:type="dxa" w:w="2900"/>
             <w:tcBorders>
               <w:top w:val="single" w:color="D9E1EC" w:sz="4"/>
               <w:left w:val="single" w:color="D9E1EC" w:sz="4"/>
@@ -5651,13 +7000,13 @@
                 <w:sz w:val="18"/>
                 <w:szCs w:val="18"/>
               </w:rPr>
-              <w:t xml:space="preserve">The 6 launch ads above. Hands off for 72 h.</w:t>
-            </w:r>
-          </w:p>
-        </w:tc>
-        <w:tc>
-          <w:tcPr>
-            <w:tcW w:type="dxa" w:w="3038"/>
+              <w:t xml:space="preserve">The 6 launch ads above, angles side by side. Hands off for 72 h.</w:t>
+            </w:r>
+          </w:p>
+        </w:tc>
+        <w:tc>
+          <w:tcPr>
+            <w:tcW w:type="dxa" w:w="2388"/>
             <w:tcBorders>
               <w:top w:val="single" w:color="D9E1EC" w:sz="4"/>
               <w:left w:val="single" w:color="D9E1EC" w:sz="4"/>
@@ -5693,7 +7042,7 @@
         </w:trPr>
         <w:tc>
           <w:tcPr>
-            <w:tcW w:type="dxa" w:w="1900"/>
+            <w:tcW w:type="dxa" w:w="1700"/>
             <w:tcBorders>
               <w:top w:val="single" w:color="D9E1EC" w:sz="4"/>
               <w:left w:val="single" w:color="D9E1EC" w:sz="4"/>
@@ -5720,13 +7069,13 @@
                 <w:sz w:val="18"/>
                 <w:szCs w:val="18"/>
               </w:rPr>
-              <w:t xml:space="preserve">R2 · Iterate the winner</w:t>
-            </w:r>
-          </w:p>
-        </w:tc>
-        <w:tc>
-          <w:tcPr>
-            <w:tcW w:type="dxa" w:w="1300"/>
+              <w:t xml:space="preserve">Round 2 · Iterate the winner</w:t>
+            </w:r>
+          </w:p>
+        </w:tc>
+        <w:tc>
+          <w:tcPr>
+            <w:tcW w:type="dxa" w:w="1150"/>
             <w:tcBorders>
               <w:top w:val="single" w:color="D9E1EC" w:sz="4"/>
               <w:left w:val="single" w:color="D9E1EC" w:sz="4"/>
@@ -5751,13 +7100,57 @@
                 <w:sz w:val="18"/>
                 <w:szCs w:val="18"/>
               </w:rPr>
+              <w:t xml:space="preserve">W3</w:t>
+            </w:r>
+          </w:p>
+          <w:p>
+            <w:pPr>
+              <w:spacing w:after="30" w:line="250"/>
+            </w:pPr>
+            <w:r>
+              <w:rPr>
+                <w:rFonts w:ascii="Arial" w:cs="Arial" w:eastAsia="Arial" w:hAnsi="Arial"/>
+                <w:sz w:val="18"/>
+                <w:szCs w:val="18"/>
+              </w:rPr>
               <w:t xml:space="preserve">~14 → 25 Oct</w:t>
             </w:r>
           </w:p>
         </w:tc>
         <w:tc>
           <w:tcPr>
-            <w:tcW w:type="dxa" w:w="3400"/>
+            <w:tcW w:type="dxa" w:w="1500"/>
+            <w:tcBorders>
+              <w:top w:val="single" w:color="D9E1EC" w:sz="4"/>
+              <w:left w:val="single" w:color="D9E1EC" w:sz="4"/>
+              <w:bottom w:val="single" w:color="D9E1EC" w:sz="4"/>
+              <w:right w:val="single" w:color="D9E1EC" w:sz="4"/>
+            </w:tcBorders>
+            <w:shd w:fill="EDE8FF" w:color="auto" w:val="clear"/>
+            <w:tcMar>
+              <w:top w:type="dxa" w:w="60"/>
+              <w:left w:type="dxa" w:w="100"/>
+              <w:bottom w:type="dxa" w:w="60"/>
+              <w:right w:type="dxa" w:w="100"/>
+            </w:tcMar>
+          </w:tcPr>
+          <w:p>
+            <w:pPr>
+              <w:spacing w:after="30" w:line="250"/>
+            </w:pPr>
+            <w:r>
+              <w:rPr>
+                <w:rFonts w:ascii="Arial" w:cs="Arial" w:eastAsia="Arial" w:hAnsi="Arial"/>
+                <w:sz w:val="18"/>
+                <w:szCs w:val="18"/>
+              </w:rPr>
+              <w:t xml:space="preserve">Static + motion / carousel — winner only</w:t>
+            </w:r>
+          </w:p>
+        </w:tc>
+        <w:tc>
+          <w:tcPr>
+            <w:tcW w:type="dxa" w:w="2900"/>
             <w:tcBorders>
               <w:top w:val="single" w:color="D9E1EC" w:sz="4"/>
               <w:left w:val="single" w:color="D9E1EC" w:sz="4"/>
@@ -5806,7 +7199,7 @@
         </w:tc>
         <w:tc>
           <w:tcPr>
-            <w:tcW w:type="dxa" w:w="3038"/>
+            <w:tcW w:type="dxa" w:w="2388"/>
             <w:tcBorders>
               <w:top w:val="single" w:color="D9E1EC" w:sz="4"/>
               <w:left w:val="single" w:color="D9E1EC" w:sz="4"/>
@@ -5842,7 +7235,7 @@
         </w:trPr>
         <w:tc>
           <w:tcPr>
-            <w:tcW w:type="dxa" w:w="1900"/>
+            <w:tcW w:type="dxa" w:w="1700"/>
             <w:tcBorders>
               <w:top w:val="single" w:color="D9E1EC" w:sz="4"/>
               <w:left w:val="single" w:color="D9E1EC" w:sz="4"/>
@@ -5869,13 +7262,13 @@
                 <w:sz w:val="18"/>
                 <w:szCs w:val="18"/>
               </w:rPr>
-              <w:t xml:space="preserve">R3 · Real content</w:t>
-            </w:r>
-          </w:p>
-        </w:tc>
-        <w:tc>
-          <w:tcPr>
-            <w:tcW w:type="dxa" w:w="1300"/>
+              <w:t xml:space="preserve">Round 3 · Real content</w:t>
+            </w:r>
+          </w:p>
+        </w:tc>
+        <w:tc>
+          <w:tcPr>
+            <w:tcW w:type="dxa" w:w="1150"/>
             <w:tcBorders>
               <w:top w:val="single" w:color="D9E1EC" w:sz="4"/>
               <w:left w:val="single" w:color="D9E1EC" w:sz="4"/>
@@ -5900,13 +7293,57 @@
                 <w:sz w:val="18"/>
                 <w:szCs w:val="18"/>
               </w:rPr>
-              <w:t xml:space="preserve">From 26 Oct</w:t>
-            </w:r>
-          </w:p>
-        </w:tc>
-        <w:tc>
-          <w:tcPr>
-            <w:tcW w:type="dxa" w:w="3400"/>
+              <w:t xml:space="preserve">W4</w:t>
+            </w:r>
+          </w:p>
+          <w:p>
+            <w:pPr>
+              <w:spacing w:after="30" w:line="250"/>
+            </w:pPr>
+            <w:r>
+              <w:rPr>
+                <w:rFonts w:ascii="Arial" w:cs="Arial" w:eastAsia="Arial" w:hAnsi="Arial"/>
+                <w:sz w:val="18"/>
+                <w:szCs w:val="18"/>
+              </w:rPr>
+              <w:t xml:space="preserve">from 26 Oct</w:t>
+            </w:r>
+          </w:p>
+        </w:tc>
+        <w:tc>
+          <w:tcPr>
+            <w:tcW w:type="dxa" w:w="1500"/>
+            <w:tcBorders>
+              <w:top w:val="single" w:color="D9E1EC" w:sz="4"/>
+              <w:left w:val="single" w:color="D9E1EC" w:sz="4"/>
+              <w:bottom w:val="single" w:color="D9E1EC" w:sz="4"/>
+              <w:right w:val="single" w:color="D9E1EC" w:sz="4"/>
+            </w:tcBorders>
+            <w:shd w:fill="E3F6EF" w:color="auto" w:val="clear"/>
+            <w:tcMar>
+              <w:top w:type="dxa" w:w="60"/>
+              <w:left w:type="dxa" w:w="100"/>
+              <w:bottom w:type="dxa" w:w="60"/>
+              <w:right w:type="dxa" w:w="100"/>
+            </w:tcMar>
+          </w:tcPr>
+          <w:p>
+            <w:pPr>
+              <w:spacing w:after="30" w:line="250"/>
+            </w:pPr>
+            <w:r>
+              <w:rPr>
+                <w:rFonts w:ascii="Arial" w:cs="Arial" w:eastAsia="Arial" w:hAnsi="Arial"/>
+                <w:sz w:val="18"/>
+                <w:szCs w:val="18"/>
+              </w:rPr>
+              <w:t xml:space="preserve">Real photo + 15 s video</w:t>
+            </w:r>
+          </w:p>
+        </w:tc>
+        <w:tc>
+          <w:tcPr>
+            <w:tcW w:type="dxa" w:w="2900"/>
             <w:tcBorders>
               <w:top w:val="single" w:color="D9E1EC" w:sz="4"/>
               <w:left w:val="single" w:color="D9E1EC" w:sz="4"/>
@@ -5937,7 +7374,7 @@
         </w:tc>
         <w:tc>
           <w:tcPr>
-            <w:tcW w:type="dxa" w:w="3038"/>
+            <w:tcW w:type="dxa" w:w="2388"/>
             <w:tcBorders>
               <w:top w:val="single" w:color="D9E1EC" w:sz="4"/>
               <w:left w:val="single" w:color="D9E1EC" w:sz="4"/>
@@ -5977,7 +7414,7 @@
         <w:rPr>
           <w:rFonts w:ascii="Arial" w:cs="Arial" w:eastAsia="Arial" w:hAnsi="Arial"/>
         </w:rPr>
-        <w:t xml:space="preserve">Iteration library — pick the row of the angle that wins</w:t>
+        <w:t xml:space="preserve">Iteration library — W3, only for the angle that wins (one change per variant)</w:t>
       </w:r>
     </w:p>
     <w:tbl>
@@ -6193,25 +7630,35 @@
               <w:bottom w:val="single" w:color="D9E1EC" w:sz="4"/>
               <w:right w:val="single" w:color="D9E1EC" w:sz="4"/>
             </w:tcBorders>
-            <w:shd w:fill="FFFFFF" w:color="auto" w:val="clear"/>
-            <w:tcMar>
-              <w:top w:type="dxa" w:w="60"/>
-              <w:left w:type="dxa" w:w="100"/>
-              <w:bottom w:type="dxa" w:w="60"/>
-              <w:right w:type="dxa" w:w="100"/>
-            </w:tcMar>
-          </w:tcPr>
-          <w:p>
-            <w:pPr>
-              <w:spacing w:after="30" w:line="250"/>
-            </w:pPr>
-            <w:r>
-              <w:rPr>
-                <w:rFonts w:ascii="Arial" w:cs="Arial" w:eastAsia="Arial" w:hAnsi="Arial"/>
-                <w:sz w:val="18"/>
-                <w:szCs w:val="18"/>
-              </w:rPr>
-              <w:t xml:space="preserve">Headline language: Serbian "Manje skrolovanja. Više stvaranja." vs English</w:t>
+            <w:shd w:fill="E8F2FF" w:color="auto" w:val="clear"/>
+            <w:tcMar>
+              <w:top w:type="dxa" w:w="60"/>
+              <w:left w:type="dxa" w:w="100"/>
+              <w:bottom w:type="dxa" w:w="60"/>
+              <w:right w:type="dxa" w:w="100"/>
+            </w:tcMar>
+          </w:tcPr>
+          <w:p>
+            <w:pPr>
+              <w:spacing w:after="30" w:line="250"/>
+            </w:pPr>
+            <w:r>
+              <w:rPr>
+                <w:rFonts w:ascii="Arial" w:cs="Arial" w:eastAsia="Arial" w:hAnsi="Arial"/>
+                <w:b/>
+                <w:bCs/>
+                <w:sz w:val="18"/>
+                <w:szCs w:val="18"/>
+              </w:rPr>
+              <w:t xml:space="preserve">Static:</w:t>
+            </w:r>
+            <w:r>
+              <w:rPr>
+                <w:rFonts w:ascii="Arial" w:cs="Arial" w:eastAsia="Arial" w:hAnsi="Arial"/>
+                <w:sz w:val="18"/>
+                <w:szCs w:val="18"/>
+              </w:rPr>
+              <w:t xml:space="preserve"> Serbian headline "Manje skrolovanja. Više stvaranja." vs English</w:t>
             </w:r>
           </w:p>
         </w:tc>
@@ -6224,25 +7671,35 @@
               <w:bottom w:val="single" w:color="D9E1EC" w:sz="4"/>
               <w:right w:val="single" w:color="D9E1EC" w:sz="4"/>
             </w:tcBorders>
-            <w:shd w:fill="FFFFFF" w:color="auto" w:val="clear"/>
-            <w:tcMar>
-              <w:top w:type="dxa" w:w="60"/>
-              <w:left w:type="dxa" w:w="100"/>
-              <w:bottom w:type="dxa" w:w="60"/>
-              <w:right w:type="dxa" w:w="100"/>
-            </w:tcMar>
-          </w:tcPr>
-          <w:p>
-            <w:pPr>
-              <w:spacing w:after="30" w:line="250"/>
-            </w:pPr>
-            <w:r>
-              <w:rPr>
-                <w:rFonts w:ascii="Arial" w:cs="Arial" w:eastAsia="Arial" w:hAnsi="Arial"/>
-                <w:sz w:val="18"/>
-                <w:szCs w:val="18"/>
-              </w:rPr>
-              <w:t xml:space="preserve">Boy vs girl copy ("Napravio…" vs "Napravila…")</w:t>
+            <w:shd w:fill="E8F2FF" w:color="auto" w:val="clear"/>
+            <w:tcMar>
+              <w:top w:type="dxa" w:w="60"/>
+              <w:left w:type="dxa" w:w="100"/>
+              <w:bottom w:type="dxa" w:w="60"/>
+              <w:right w:type="dxa" w:w="100"/>
+            </w:tcMar>
+          </w:tcPr>
+          <w:p>
+            <w:pPr>
+              <w:spacing w:after="30" w:line="250"/>
+            </w:pPr>
+            <w:r>
+              <w:rPr>
+                <w:rFonts w:ascii="Arial" w:cs="Arial" w:eastAsia="Arial" w:hAnsi="Arial"/>
+                <w:b/>
+                <w:bCs/>
+                <w:sz w:val="18"/>
+                <w:szCs w:val="18"/>
+              </w:rPr>
+              <w:t xml:space="preserve">Static:</w:t>
+            </w:r>
+            <w:r>
+              <w:rPr>
+                <w:rFonts w:ascii="Arial" w:cs="Arial" w:eastAsia="Arial" w:hAnsi="Arial"/>
+                <w:sz w:val="18"/>
+                <w:szCs w:val="18"/>
+              </w:rPr>
+              <w:t xml:space="preserve"> boy vs girl copy ("Napravio…" vs "Napravila…")</w:t>
             </w:r>
           </w:p>
         </w:tc>
@@ -6255,25 +7712,35 @@
               <w:bottom w:val="single" w:color="D9E1EC" w:sz="4"/>
               <w:right w:val="single" w:color="D9E1EC" w:sz="4"/>
             </w:tcBorders>
-            <w:shd w:fill="FFFFFF" w:color="auto" w:val="clear"/>
-            <w:tcMar>
-              <w:top w:type="dxa" w:w="60"/>
-              <w:left w:type="dxa" w:w="100"/>
-              <w:bottom w:type="dxa" w:w="60"/>
-              <w:right w:type="dxa" w:w="100"/>
-            </w:tcMar>
-          </w:tcPr>
-          <w:p>
-            <w:pPr>
-              <w:spacing w:after="30" w:line="250"/>
-            </w:pPr>
-            <w:r>
-              <w:rPr>
-                <w:rFonts w:ascii="Arial" w:cs="Arial" w:eastAsia="Arial" w:hAnsi="Arial"/>
-                <w:sz w:val="18"/>
-                <w:szCs w:val="18"/>
-              </w:rPr>
-              <w:t xml:space="preserve">6 s motion: alerts slide in one by one</w:t>
+            <w:shd w:fill="EDE8FF" w:color="auto" w:val="clear"/>
+            <w:tcMar>
+              <w:top w:type="dxa" w:w="60"/>
+              <w:left w:type="dxa" w:w="100"/>
+              <w:bottom w:type="dxa" w:w="60"/>
+              <w:right w:type="dxa" w:w="100"/>
+            </w:tcMar>
+          </w:tcPr>
+          <w:p>
+            <w:pPr>
+              <w:spacing w:after="30" w:line="250"/>
+            </w:pPr>
+            <w:r>
+              <w:rPr>
+                <w:rFonts w:ascii="Arial" w:cs="Arial" w:eastAsia="Arial" w:hAnsi="Arial"/>
+                <w:b/>
+                <w:bCs/>
+                <w:sz w:val="18"/>
+                <w:szCs w:val="18"/>
+              </w:rPr>
+              <w:t xml:space="preserve">Motion 6 s:</w:t>
+            </w:r>
+            <w:r>
+              <w:rPr>
+                <w:rFonts w:ascii="Arial" w:cs="Arial" w:eastAsia="Arial" w:hAnsi="Arial"/>
+                <w:sz w:val="18"/>
+                <w:szCs w:val="18"/>
+              </w:rPr>
+              <w:t xml:space="preserve"> alerts slide in one by one</w:t>
             </w:r>
           </w:p>
         </w:tc>
@@ -6332,25 +7799,35 @@
               <w:bottom w:val="single" w:color="D9E1EC" w:sz="4"/>
               <w:right w:val="single" w:color="D9E1EC" w:sz="4"/>
             </w:tcBorders>
-            <w:shd w:fill="F8FAFC" w:color="auto" w:val="clear"/>
-            <w:tcMar>
-              <w:top w:type="dxa" w:w="60"/>
-              <w:left w:type="dxa" w:w="100"/>
-              <w:bottom w:type="dxa" w:w="60"/>
-              <w:right w:type="dxa" w:w="100"/>
-            </w:tcMar>
-          </w:tcPr>
-          <w:p>
-            <w:pPr>
-              <w:spacing w:after="30" w:line="250"/>
-            </w:pPr>
-            <w:r>
-              <w:rPr>
-                <w:rFonts w:ascii="Arial" w:cs="Arial" w:eastAsia="Arial" w:hAnsi="Arial"/>
-                <w:sz w:val="18"/>
-                <w:szCs w:val="18"/>
-              </w:rPr>
-              <w:t xml:space="preserve">C2 static vs 7-card carousel</w:t>
+            <w:shd w:fill="EDE8FF" w:color="auto" w:val="clear"/>
+            <w:tcMar>
+              <w:top w:type="dxa" w:w="60"/>
+              <w:left w:type="dxa" w:w="100"/>
+              <w:bottom w:type="dxa" w:w="60"/>
+              <w:right w:type="dxa" w:w="100"/>
+            </w:tcMar>
+          </w:tcPr>
+          <w:p>
+            <w:pPr>
+              <w:spacing w:after="30" w:line="250"/>
+            </w:pPr>
+            <w:r>
+              <w:rPr>
+                <w:rFonts w:ascii="Arial" w:cs="Arial" w:eastAsia="Arial" w:hAnsi="Arial"/>
+                <w:b/>
+                <w:bCs/>
+                <w:sz w:val="18"/>
+                <w:szCs w:val="18"/>
+              </w:rPr>
+              <w:t xml:space="preserve">Carousel:</w:t>
+            </w:r>
+            <w:r>
+              <w:rPr>
+                <w:rFonts w:ascii="Arial" w:cs="Arial" w:eastAsia="Arial" w:hAnsi="Arial"/>
+                <w:sz w:val="18"/>
+                <w:szCs w:val="18"/>
+              </w:rPr>
+              <w:t xml:space="preserve"> C2 static vs 7-card carousel</w:t>
             </w:r>
           </w:p>
         </w:tc>
@@ -6363,25 +7840,35 @@
               <w:bottom w:val="single" w:color="D9E1EC" w:sz="4"/>
               <w:right w:val="single" w:color="D9E1EC" w:sz="4"/>
             </w:tcBorders>
-            <w:shd w:fill="F8FAFC" w:color="auto" w:val="clear"/>
-            <w:tcMar>
-              <w:top w:type="dxa" w:w="60"/>
-              <w:left w:type="dxa" w:w="100"/>
-              <w:bottom w:type="dxa" w:w="60"/>
-              <w:right w:type="dxa" w:w="100"/>
-            </w:tcMar>
-          </w:tcPr>
-          <w:p>
-            <w:pPr>
-              <w:spacing w:after="30" w:line="250"/>
-            </w:pPr>
-            <w:r>
-              <w:rPr>
-                <w:rFonts w:ascii="Arial" w:cs="Arial" w:eastAsia="Arial" w:hAnsi="Arial"/>
-                <w:sz w:val="18"/>
-                <w:szCs w:val="18"/>
-              </w:rPr>
-              <w:t xml:space="preserve">C1 typographic vs real photo (kid 9–11)</w:t>
+            <w:shd w:fill="E3F6EF" w:color="auto" w:val="clear"/>
+            <w:tcMar>
+              <w:top w:type="dxa" w:w="60"/>
+              <w:left w:type="dxa" w:w="100"/>
+              <w:bottom w:type="dxa" w:w="60"/>
+              <w:right w:type="dxa" w:w="100"/>
+            </w:tcMar>
+          </w:tcPr>
+          <w:p>
+            <w:pPr>
+              <w:spacing w:after="30" w:line="250"/>
+            </w:pPr>
+            <w:r>
+              <w:rPr>
+                <w:rFonts w:ascii="Arial" w:cs="Arial" w:eastAsia="Arial" w:hAnsi="Arial"/>
+                <w:b/>
+                <w:bCs/>
+                <w:sz w:val="18"/>
+                <w:szCs w:val="18"/>
+              </w:rPr>
+              <w:t xml:space="preserve">Photo:</w:t>
+            </w:r>
+            <w:r>
+              <w:rPr>
+                <w:rFonts w:ascii="Arial" w:cs="Arial" w:eastAsia="Arial" w:hAnsi="Arial"/>
+                <w:sz w:val="18"/>
+                <w:szCs w:val="18"/>
+              </w:rPr>
+              <w:t xml:space="preserve"> C1 typographic vs real photo (kid 9–11) — once photos exist</w:t>
             </w:r>
           </w:p>
         </w:tc>
@@ -6394,25 +7881,35 @@
               <w:bottom w:val="single" w:color="D9E1EC" w:sz="4"/>
               <w:right w:val="single" w:color="D9E1EC" w:sz="4"/>
             </w:tcBorders>
-            <w:shd w:fill="F8FAFC" w:color="auto" w:val="clear"/>
-            <w:tcMar>
-              <w:top w:type="dxa" w:w="60"/>
-              <w:left w:type="dxa" w:w="100"/>
-              <w:bottom w:type="dxa" w:w="60"/>
-              <w:right w:type="dxa" w:w="100"/>
-            </w:tcMar>
-          </w:tcPr>
-          <w:p>
-            <w:pPr>
-              <w:spacing w:after="30" w:line="250"/>
-            </w:pPr>
-            <w:r>
-              <w:rPr>
-                <w:rFonts w:ascii="Arial" w:cs="Arial" w:eastAsia="Arial" w:hAnsi="Arial"/>
-                <w:sz w:val="18"/>
-                <w:szCs w:val="18"/>
-              </w:rPr>
-              <w:t xml:space="preserve">C4 new dialogue, e.g. "Let's make a comic about our city!"</w:t>
+            <w:shd w:fill="E8F2FF" w:color="auto" w:val="clear"/>
+            <w:tcMar>
+              <w:top w:type="dxa" w:w="60"/>
+              <w:left w:type="dxa" w:w="100"/>
+              <w:bottom w:type="dxa" w:w="60"/>
+              <w:right w:type="dxa" w:w="100"/>
+            </w:tcMar>
+          </w:tcPr>
+          <w:p>
+            <w:pPr>
+              <w:spacing w:after="30" w:line="250"/>
+            </w:pPr>
+            <w:r>
+              <w:rPr>
+                <w:rFonts w:ascii="Arial" w:cs="Arial" w:eastAsia="Arial" w:hAnsi="Arial"/>
+                <w:b/>
+                <w:bCs/>
+                <w:sz w:val="18"/>
+                <w:szCs w:val="18"/>
+              </w:rPr>
+              <w:t xml:space="preserve">Static:</w:t>
+            </w:r>
+            <w:r>
+              <w:rPr>
+                <w:rFonts w:ascii="Arial" w:cs="Arial" w:eastAsia="Arial" w:hAnsi="Arial"/>
+                <w:sz w:val="18"/>
+                <w:szCs w:val="18"/>
+              </w:rPr>
+              <w:t xml:space="preserve"> C4 new dialogue, e.g. "Let's make a comic about our city!"</w:t>
             </w:r>
           </w:p>
         </w:tc>
@@ -6471,25 +7968,35 @@
               <w:bottom w:val="single" w:color="D9E1EC" w:sz="4"/>
               <w:right w:val="single" w:color="D9E1EC" w:sz="4"/>
             </w:tcBorders>
-            <w:shd w:fill="FFFFFF" w:color="auto" w:val="clear"/>
-            <w:tcMar>
-              <w:top w:type="dxa" w:w="60"/>
-              <w:left w:type="dxa" w:w="100"/>
-              <w:bottom w:type="dxa" w:w="60"/>
-              <w:right w:type="dxa" w:w="100"/>
-            </w:tcMar>
-          </w:tcPr>
-          <w:p>
-            <w:pPr>
-              <w:spacing w:after="30" w:line="250"/>
-            </w:pPr>
-            <w:r>
-              <w:rPr>
-                <w:rFonts w:ascii="Arial" w:cs="Arial" w:eastAsia="Arial" w:hAnsi="Arial"/>
-                <w:sz w:val="18"/>
-                <w:szCs w:val="18"/>
-              </w:rPr>
-              <w:t xml:space="preserve">Price-first vs proof-first layout</w:t>
+            <w:shd w:fill="E8F2FF" w:color="auto" w:val="clear"/>
+            <w:tcMar>
+              <w:top w:type="dxa" w:w="60"/>
+              <w:left w:type="dxa" w:w="100"/>
+              <w:bottom w:type="dxa" w:w="60"/>
+              <w:right w:type="dxa" w:w="100"/>
+            </w:tcMar>
+          </w:tcPr>
+          <w:p>
+            <w:pPr>
+              <w:spacing w:after="30" w:line="250"/>
+            </w:pPr>
+            <w:r>
+              <w:rPr>
+                <w:rFonts w:ascii="Arial" w:cs="Arial" w:eastAsia="Arial" w:hAnsi="Arial"/>
+                <w:b/>
+                <w:bCs/>
+                <w:sz w:val="18"/>
+                <w:szCs w:val="18"/>
+              </w:rPr>
+              <w:t xml:space="preserve">Static:</w:t>
+            </w:r>
+            <w:r>
+              <w:rPr>
+                <w:rFonts w:ascii="Arial" w:cs="Arial" w:eastAsia="Arial" w:hAnsi="Arial"/>
+                <w:sz w:val="18"/>
+                <w:szCs w:val="18"/>
+              </w:rPr>
+              <w:t xml:space="preserve"> price-first vs proof-first layout</w:t>
             </w:r>
           </w:p>
         </w:tc>
@@ -6502,25 +8009,35 @@
               <w:bottom w:val="single" w:color="D9E1EC" w:sz="4"/>
               <w:right w:val="single" w:color="D9E1EC" w:sz="4"/>
             </w:tcBorders>
-            <w:shd w:fill="FFFFFF" w:color="auto" w:val="clear"/>
-            <w:tcMar>
-              <w:top w:type="dxa" w:w="60"/>
-              <w:left w:type="dxa" w:w="100"/>
-              <w:bottom w:type="dxa" w:w="60"/>
-              <w:right w:type="dxa" w:w="100"/>
-            </w:tcMar>
-          </w:tcPr>
-          <w:p>
-            <w:pPr>
-              <w:spacing w:after="30" w:line="250"/>
-            </w:pPr>
-            <w:r>
-              <w:rPr>
-                <w:rFonts w:ascii="Arial" w:cs="Arial" w:eastAsia="Arial" w:hAnsi="Arial"/>
-                <w:sz w:val="18"/>
-                <w:szCs w:val="18"/>
-              </w:rPr>
-              <w:t xml:space="preserve">Add founding deadline badge (once date is set)</w:t>
+            <w:shd w:fill="E8F2FF" w:color="auto" w:val="clear"/>
+            <w:tcMar>
+              <w:top w:type="dxa" w:w="60"/>
+              <w:left w:type="dxa" w:w="100"/>
+              <w:bottom w:type="dxa" w:w="60"/>
+              <w:right w:type="dxa" w:w="100"/>
+            </w:tcMar>
+          </w:tcPr>
+          <w:p>
+            <w:pPr>
+              <w:spacing w:after="30" w:line="250"/>
+            </w:pPr>
+            <w:r>
+              <w:rPr>
+                <w:rFonts w:ascii="Arial" w:cs="Arial" w:eastAsia="Arial" w:hAnsi="Arial"/>
+                <w:b/>
+                <w:bCs/>
+                <w:sz w:val="18"/>
+                <w:szCs w:val="18"/>
+              </w:rPr>
+              <w:t xml:space="preserve">Static:</w:t>
+            </w:r>
+            <w:r>
+              <w:rPr>
+                <w:rFonts w:ascii="Arial" w:cs="Arial" w:eastAsia="Arial" w:hAnsi="Arial"/>
+                <w:sz w:val="18"/>
+                <w:szCs w:val="18"/>
+              </w:rPr>
+              <w:t xml:space="preserve"> add founding deadline badge (once date is set)</w:t>
             </w:r>
           </w:p>
         </w:tc>
@@ -6533,25 +8050,35 @@
               <w:bottom w:val="single" w:color="D9E1EC" w:sz="4"/>
               <w:right w:val="single" w:color="D9E1EC" w:sz="4"/>
             </w:tcBorders>
-            <w:shd w:fill="FFFFFF" w:color="auto" w:val="clear"/>
-            <w:tcMar>
-              <w:top w:type="dxa" w:w="60"/>
-              <w:left w:type="dxa" w:w="100"/>
-              <w:bottom w:type="dxa" w:w="60"/>
-              <w:right w:type="dxa" w:w="100"/>
-            </w:tcMar>
-          </w:tcPr>
-          <w:p>
-            <w:pPr>
-              <w:spacing w:after="30" w:line="250"/>
-            </w:pPr>
-            <w:r>
-              <w:rPr>
-                <w:rFonts w:ascii="Arial" w:cs="Arial" w:eastAsia="Arial" w:hAnsi="Arial"/>
-                <w:sz w:val="18"/>
-                <w:szCs w:val="18"/>
-              </w:rPr>
-              <w:t xml:space="preserve">Parent quote from Open Day (with consent)</w:t>
+            <w:shd w:fill="E3F6EF" w:color="auto" w:val="clear"/>
+            <w:tcMar>
+              <w:top w:type="dxa" w:w="60"/>
+              <w:left w:type="dxa" w:w="100"/>
+              <w:bottom w:type="dxa" w:w="60"/>
+              <w:right w:type="dxa" w:w="100"/>
+            </w:tcMar>
+          </w:tcPr>
+          <w:p>
+            <w:pPr>
+              <w:spacing w:after="30" w:line="250"/>
+            </w:pPr>
+            <w:r>
+              <w:rPr>
+                <w:rFonts w:ascii="Arial" w:cs="Arial" w:eastAsia="Arial" w:hAnsi="Arial"/>
+                <w:b/>
+                <w:bCs/>
+                <w:sz w:val="18"/>
+                <w:szCs w:val="18"/>
+              </w:rPr>
+              <w:t xml:space="preserve">Photo:</w:t>
+            </w:r>
+            <w:r>
+              <w:rPr>
+                <w:rFonts w:ascii="Arial" w:cs="Arial" w:eastAsia="Arial" w:hAnsi="Arial"/>
+                <w:sz w:val="18"/>
+                <w:szCs w:val="18"/>
+              </w:rPr>
+              <w:t xml:space="preserve"> parent quote from Open Day (with consent)</w:t>
             </w:r>
           </w:p>
         </w:tc>
@@ -6688,7 +8215,7 @@
                 <w:sz w:val="15"/>
                 <w:szCs w:val="15"/>
               </w:rPr>
-              <w:t xml:space="preserve">Language test (vs P4)</w:t>
+              <w:t xml:space="preserve">W3 · static · language test vs P4</w:t>
             </w:r>
           </w:p>
         </w:tc>
@@ -6783,7 +8310,7 @@
                 <w:sz w:val="15"/>
                 <w:szCs w:val="15"/>
               </w:rPr>
-              <w:t xml:space="preserve">Native story version (boy copy)</w:t>
+              <w:t xml:space="preserve">W1 → · static · P4 story version</w:t>
             </w:r>
           </w:p>
         </w:tc>
@@ -6878,7 +8405,7 @@
                 <w:sz w:val="15"/>
                 <w:szCs w:val="15"/>
               </w:rPr>
-              <w:t xml:space="preserve">Layout for real photo</w:t>
+              <w:t xml:space="preserve">W4 · real-photo layout</w:t>
             </w:r>
           </w:p>
         </w:tc>
@@ -7001,7 +8528,7 @@
                 <w:sz w:val="15"/>
                 <w:szCs w:val="15"/>
               </w:rPr>
-              <w:t xml:space="preserve">Hook + "Prevucite →"</w:t>
+              <w:t xml:space="preserve">W3 if B wins · hook</w:t>
             </w:r>
           </w:p>
         </w:tc>
@@ -7096,7 +8623,7 @@
                 <w:sz w:val="15"/>
                 <w:szCs w:val="15"/>
               </w:rPr>
-              <w:t xml:space="preserve">One skill per card</w:t>
+              <w:t xml:space="preserve">W3 · one skill per card</w:t>
             </w:r>
           </w:p>
         </w:tc>
@@ -7191,7 +8718,7 @@
                 <w:sz w:val="15"/>
                 <w:szCs w:val="15"/>
               </w:rPr>
-              <w:t xml:space="preserve">Founding offer + CTA</w:t>
+              <w:t xml:space="preserve">W3 · founding offer + CTA</w:t>
             </w:r>
           </w:p>
         </w:tc>
@@ -7206,7 +8733,7 @@
         <w:rPr>
           <w:rFonts w:ascii="Arial" w:cs="Arial" w:eastAsia="Arial" w:hAnsi="Arial"/>
         </w:rPr>
-        <w:t xml:space="preserve">R3 · 15 s Reel — storyboard (from the shoot)</w:t>
+        <w:t xml:space="preserve">W4 · Round 3 — 15 s Reel storyboard (from the shoot)</w:t>
       </w:r>
     </w:p>
     <w:tbl>
@@ -7815,6 +9342,424 @@
               <w:t xml:space="preserve">Job of the creatives: fill the Open Day (target 40–70 families) — the low-commitment first step for undecided parents.</w:t>
             </w:r>
           </w:p>
+          <w:p>
+            <w:pPr>
+              <w:spacing w:after="20"/>
+            </w:pPr>
+            <w:r>
+              <w:rPr>
+                <w:rFonts w:ascii="Arial" w:cs="Arial" w:eastAsia="Arial" w:hAnsi="Arial"/>
+                <w:color w:val="CBD5E1"/>
+                <w:sz w:val="18"/>
+                <w:szCs w:val="18"/>
+              </w:rPr>
+              <w:t xml:space="preserve">Angle: </w:t>
+            </w:r>
+            <w:r>
+              <w:rPr>
+                <w:rFonts w:ascii="Arial" w:cs="Arial" w:eastAsia="Arial" w:hAnsi="Arial"/>
+                <w:b/>
+                <w:bCs/>
+                <w:color w:val="CBD5E1"/>
+                <w:sz w:val="18"/>
+                <w:szCs w:val="18"/>
+              </w:rPr>
+              <w:t xml:space="preserve">D only</w:t>
+            </w:r>
+            <w:r>
+              <w:rPr>
+                <w:rFonts w:ascii="Arial" w:cs="Arial" w:eastAsia="Arial" w:hAnsi="Arial"/>
+                <w:color w:val="CBD5E1"/>
+                <w:sz w:val="18"/>
+                <w:szCs w:val="18"/>
+              </w:rPr>
+              <w:t xml:space="preserve"> · runs W2–W3 (12 → 23 Oct) · formats: static feed + story throughout</w:t>
+            </w:r>
+          </w:p>
+        </w:tc>
+      </w:tr>
+    </w:tbl>
+    <w:p>
+      <w:pPr>
+        <w:spacing w:after="100"/>
+      </w:pPr>
+    </w:p>
+    <w:tbl>
+      <w:tblPr>
+        <w:tblW w:type="dxa" w:w="9638"/>
+        <w:tblBorders>
+          <w:top w:val="single" w:color="auto" w:sz="4"/>
+          <w:left w:val="single" w:color="auto" w:sz="4"/>
+          <w:bottom w:val="single" w:color="auto" w:sz="4"/>
+          <w:right w:val="single" w:color="auto" w:sz="4"/>
+          <w:insideH w:val="single" w:color="auto" w:sz="4"/>
+          <w:insideV w:val="single" w:color="auto" w:sz="4"/>
+        </w:tblBorders>
+      </w:tblPr>
+      <w:tblGrid>
+        <w:gridCol w:w="1400"/>
+        <w:gridCol w:w="2059"/>
+        <w:gridCol w:w="2059"/>
+        <w:gridCol w:w="2059"/>
+        <w:gridCol w:w="2061"/>
+      </w:tblGrid>
+      <w:tr>
+        <w:tc>
+          <w:tcPr>
+            <w:tcW w:type="dxa" w:w="1400"/>
+            <w:tcBorders>
+              <w:top w:val="single" w:color="D9E1EC" w:sz="4"/>
+              <w:left w:val="single" w:color="D9E1EC" w:sz="4"/>
+              <w:bottom w:val="single" w:color="D9E1EC" w:sz="4"/>
+              <w:right w:val="single" w:color="D9E1EC" w:sz="4"/>
+            </w:tcBorders>
+            <w:shd w:fill="0F172A" w:color="auto" w:val="clear"/>
+            <w:tcMar>
+              <w:top w:type="dxa" w:w="60"/>
+              <w:left w:type="dxa" w:w="90"/>
+              <w:bottom w:type="dxa" w:w="60"/>
+              <w:right w:type="dxa" w:w="90"/>
+            </w:tcMar>
+            <w:vAlign w:val="center"/>
+          </w:tcPr>
+          <w:p>
+            <w:pPr>
+              <w:spacing w:after="30" w:line="250"/>
+            </w:pPr>
+          </w:p>
+        </w:tc>
+        <w:tc>
+          <w:tcPr>
+            <w:tcW w:type="dxa" w:w="2059"/>
+            <w:tcBorders>
+              <w:top w:val="single" w:color="D9E1EC" w:sz="4"/>
+              <w:left w:val="single" w:color="D9E1EC" w:sz="4"/>
+              <w:bottom w:val="single" w:color="D9E1EC" w:sz="4"/>
+              <w:right w:val="single" w:color="D9E1EC" w:sz="4"/>
+            </w:tcBorders>
+            <w:shd w:fill="0F172A" w:color="auto" w:val="clear"/>
+            <w:tcMar>
+              <w:top w:type="dxa" w:w="60"/>
+              <w:left w:type="dxa" w:w="90"/>
+              <w:bottom w:type="dxa" w:w="60"/>
+              <w:right w:type="dxa" w:w="90"/>
+            </w:tcMar>
+            <w:vAlign w:val="center"/>
+          </w:tcPr>
+          <w:p>
+            <w:pPr>
+              <w:spacing w:after="30" w:line="250"/>
+            </w:pPr>
+            <w:r>
+              <w:rPr>
+                <w:rFonts w:ascii="Arial" w:cs="Arial" w:eastAsia="Arial" w:hAnsi="Arial"/>
+                <w:b/>
+                <w:bCs/>
+                <w:color w:val="FFFFFF"/>
+                <w:sz w:val="16"/>
+                <w:szCs w:val="16"/>
+              </w:rPr>
+              <w:t xml:space="preserve">W1 · 6–11 Oct</w:t>
+            </w:r>
+          </w:p>
+        </w:tc>
+        <w:tc>
+          <w:tcPr>
+            <w:tcW w:type="dxa" w:w="2059"/>
+            <w:tcBorders>
+              <w:top w:val="single" w:color="D9E1EC" w:sz="4"/>
+              <w:left w:val="single" w:color="D9E1EC" w:sz="4"/>
+              <w:bottom w:val="single" w:color="D9E1EC" w:sz="4"/>
+              <w:right w:val="single" w:color="D9E1EC" w:sz="4"/>
+            </w:tcBorders>
+            <w:shd w:fill="0F172A" w:color="auto" w:val="clear"/>
+            <w:tcMar>
+              <w:top w:type="dxa" w:w="60"/>
+              <w:left w:type="dxa" w:w="90"/>
+              <w:bottom w:type="dxa" w:w="60"/>
+              <w:right w:type="dxa" w:w="90"/>
+            </w:tcMar>
+            <w:vAlign w:val="center"/>
+          </w:tcPr>
+          <w:p>
+            <w:pPr>
+              <w:spacing w:after="30" w:line="250"/>
+            </w:pPr>
+            <w:r>
+              <w:rPr>
+                <w:rFonts w:ascii="Arial" w:cs="Arial" w:eastAsia="Arial" w:hAnsi="Arial"/>
+                <w:b/>
+                <w:bCs/>
+                <w:color w:val="FFFFFF"/>
+                <w:sz w:val="16"/>
+                <w:szCs w:val="16"/>
+              </w:rPr>
+              <w:t xml:space="preserve">W2 · 12–18 Oct</w:t>
+            </w:r>
+          </w:p>
+        </w:tc>
+        <w:tc>
+          <w:tcPr>
+            <w:tcW w:type="dxa" w:w="2059"/>
+            <w:tcBorders>
+              <w:top w:val="single" w:color="D9E1EC" w:sz="4"/>
+              <w:left w:val="single" w:color="D9E1EC" w:sz="4"/>
+              <w:bottom w:val="single" w:color="D9E1EC" w:sz="4"/>
+              <w:right w:val="single" w:color="D9E1EC" w:sz="4"/>
+            </w:tcBorders>
+            <w:shd w:fill="0F172A" w:color="auto" w:val="clear"/>
+            <w:tcMar>
+              <w:top w:type="dxa" w:w="60"/>
+              <w:left w:type="dxa" w:w="90"/>
+              <w:bottom w:type="dxa" w:w="60"/>
+              <w:right w:type="dxa" w:w="90"/>
+            </w:tcMar>
+            <w:vAlign w:val="center"/>
+          </w:tcPr>
+          <w:p>
+            <w:pPr>
+              <w:spacing w:after="30" w:line="250"/>
+            </w:pPr>
+            <w:r>
+              <w:rPr>
+                <w:rFonts w:ascii="Arial" w:cs="Arial" w:eastAsia="Arial" w:hAnsi="Arial"/>
+                <w:b/>
+                <w:bCs/>
+                <w:color w:val="FFFFFF"/>
+                <w:sz w:val="16"/>
+                <w:szCs w:val="16"/>
+              </w:rPr>
+              <w:t xml:space="preserve">W3 · 19–25 Oct</w:t>
+            </w:r>
+          </w:p>
+        </w:tc>
+        <w:tc>
+          <w:tcPr>
+            <w:tcW w:type="dxa" w:w="2061"/>
+            <w:tcBorders>
+              <w:top w:val="single" w:color="D9E1EC" w:sz="4"/>
+              <w:left w:val="single" w:color="D9E1EC" w:sz="4"/>
+              <w:bottom w:val="single" w:color="D9E1EC" w:sz="4"/>
+              <w:right w:val="single" w:color="D9E1EC" w:sz="4"/>
+            </w:tcBorders>
+            <w:shd w:fill="0F172A" w:color="auto" w:val="clear"/>
+            <w:tcMar>
+              <w:top w:type="dxa" w:w="60"/>
+              <w:left w:type="dxa" w:w="90"/>
+              <w:bottom w:type="dxa" w:w="60"/>
+              <w:right w:type="dxa" w:w="90"/>
+            </w:tcMar>
+            <w:vAlign w:val="center"/>
+          </w:tcPr>
+          <w:p>
+            <w:pPr>
+              <w:spacing w:after="30" w:line="250"/>
+            </w:pPr>
+            <w:r>
+              <w:rPr>
+                <w:rFonts w:ascii="Arial" w:cs="Arial" w:eastAsia="Arial" w:hAnsi="Arial"/>
+                <w:b/>
+                <w:bCs/>
+                <w:color w:val="FFFFFF"/>
+                <w:sz w:val="16"/>
+                <w:szCs w:val="16"/>
+              </w:rPr>
+              <w:t xml:space="preserve">W4 · 26 Oct →</w:t>
+            </w:r>
+          </w:p>
+        </w:tc>
+      </w:tr>
+      <w:tr>
+        <w:trPr>
+          <w:cantSplit/>
+        </w:trPr>
+        <w:tc>
+          <w:tcPr>
+            <w:tcW w:type="dxa" w:w="1400"/>
+            <w:tcBorders>
+              <w:top w:val="single" w:color="D9E1EC" w:sz="4"/>
+              <w:left w:val="single" w:color="D9E1EC" w:sz="4"/>
+              <w:bottom w:val="single" w:color="D9E1EC" w:sz="4"/>
+              <w:right w:val="single" w:color="D9E1EC" w:sz="4"/>
+            </w:tcBorders>
+            <w:shd w:fill="FFFFFF" w:color="auto" w:val="clear"/>
+            <w:tcMar>
+              <w:top w:type="dxa" w:w="60"/>
+              <w:left w:type="dxa" w:w="90"/>
+              <w:bottom w:type="dxa" w:w="60"/>
+              <w:right w:type="dxa" w:w="90"/>
+            </w:tcMar>
+            <w:vAlign w:val="center"/>
+          </w:tcPr>
+          <w:p>
+            <w:pPr>
+              <w:spacing w:after="30" w:line="250"/>
+            </w:pPr>
+            <w:r>
+              <w:rPr>
+                <w:rFonts w:ascii="Arial" w:cs="Arial" w:eastAsia="Arial" w:hAnsi="Arial"/>
+                <w:b/>
+                <w:bCs/>
+                <w:sz w:val="16"/>
+                <w:szCs w:val="16"/>
+              </w:rPr>
+              <w:t xml:space="preserve">This ad set</w:t>
+            </w:r>
+          </w:p>
+        </w:tc>
+        <w:tc>
+          <w:tcPr>
+            <w:tcW w:type="dxa" w:w="2059"/>
+            <w:tcBorders>
+              <w:top w:val="single" w:color="D9E1EC" w:sz="4"/>
+              <w:left w:val="single" w:color="D9E1EC" w:sz="4"/>
+              <w:bottom w:val="single" w:color="D9E1EC" w:sz="4"/>
+              <w:right w:val="single" w:color="D9E1EC" w:sz="4"/>
+            </w:tcBorders>
+            <w:shd w:fill="F1F5F9" w:color="auto" w:val="clear"/>
+            <w:tcMar>
+              <w:top w:type="dxa" w:w="60"/>
+              <w:left w:type="dxa" w:w="90"/>
+              <w:bottom w:type="dxa" w:w="60"/>
+              <w:right w:type="dxa" w:w="90"/>
+            </w:tcMar>
+            <w:vAlign w:val="center"/>
+          </w:tcPr>
+          <w:p>
+            <w:pPr>
+              <w:spacing w:after="30" w:line="250"/>
+            </w:pPr>
+            <w:r>
+              <w:rPr>
+                <w:rFonts w:ascii="Arial" w:cs="Arial" w:eastAsia="Arial" w:hAnsi="Arial"/>
+                <w:sz w:val="16"/>
+                <w:szCs w:val="16"/>
+              </w:rPr>
+              <w:t xml:space="preserve">Off — design prep</w:t>
+            </w:r>
+          </w:p>
+        </w:tc>
+        <w:tc>
+          <w:tcPr>
+            <w:tcW w:type="dxa" w:w="2059"/>
+            <w:tcBorders>
+              <w:top w:val="single" w:color="D9E1EC" w:sz="4"/>
+              <w:left w:val="single" w:color="D9E1EC" w:sz="4"/>
+              <w:bottom w:val="single" w:color="D9E1EC" w:sz="4"/>
+              <w:right w:val="single" w:color="D9E1EC" w:sz="4"/>
+            </w:tcBorders>
+            <w:shd w:fill="E8F2FF" w:color="auto" w:val="clear"/>
+            <w:tcMar>
+              <w:top w:type="dxa" w:w="60"/>
+              <w:left w:type="dxa" w:w="90"/>
+              <w:bottom w:type="dxa" w:w="60"/>
+              <w:right w:type="dxa" w:w="90"/>
+            </w:tcMar>
+            <w:vAlign w:val="center"/>
+          </w:tcPr>
+          <w:p>
+            <w:pPr>
+              <w:spacing w:after="30" w:line="250"/>
+            </w:pPr>
+            <w:r>
+              <w:rPr>
+                <w:rFonts w:ascii="Arial" w:cs="Arial" w:eastAsia="Arial" w:hAnsi="Arial"/>
+                <w:sz w:val="16"/>
+                <w:szCs w:val="16"/>
+              </w:rPr>
+              <w:t xml:space="preserve">O1 live 12 Oct · O2 13 Oct</w:t>
+            </w:r>
+          </w:p>
+          <w:p>
+            <w:pPr>
+              <w:spacing w:after="30" w:line="250"/>
+            </w:pPr>
+            <w:r>
+              <w:rPr>
+                <w:rFonts w:ascii="Arial" w:cs="Arial" w:eastAsia="Arial" w:hAnsi="Arial"/>
+                <w:sz w:val="16"/>
+                <w:szCs w:val="16"/>
+              </w:rPr>
+              <w:t xml:space="preserve">Static feed + story</w:t>
+            </w:r>
+          </w:p>
+        </w:tc>
+        <w:tc>
+          <w:tcPr>
+            <w:tcW w:type="dxa" w:w="2059"/>
+            <w:tcBorders>
+              <w:top w:val="single" w:color="D9E1EC" w:sz="4"/>
+              <w:left w:val="single" w:color="D9E1EC" w:sz="4"/>
+              <w:bottom w:val="single" w:color="D9E1EC" w:sz="4"/>
+              <w:right w:val="single" w:color="D9E1EC" w:sz="4"/>
+            </w:tcBorders>
+            <w:shd w:fill="E8F2FF" w:color="auto" w:val="clear"/>
+            <w:tcMar>
+              <w:top w:type="dxa" w:w="60"/>
+              <w:left w:type="dxa" w:w="90"/>
+              <w:bottom w:type="dxa" w:w="60"/>
+              <w:right w:type="dxa" w:w="90"/>
+            </w:tcMar>
+            <w:vAlign w:val="center"/>
+          </w:tcPr>
+          <w:p>
+            <w:pPr>
+              <w:spacing w:after="30" w:line="250"/>
+            </w:pPr>
+            <w:r>
+              <w:rPr>
+                <w:rFonts w:ascii="Arial" w:cs="Arial" w:eastAsia="Arial" w:hAnsi="Arial"/>
+                <w:sz w:val="16"/>
+                <w:szCs w:val="16"/>
+              </w:rPr>
+              <w:t xml:space="preserve">O1 vs O3 countdown · ends 23 Oct</w:t>
+            </w:r>
+          </w:p>
+          <w:p>
+            <w:pPr>
+              <w:spacing w:after="30" w:line="250"/>
+            </w:pPr>
+            <w:r>
+              <w:rPr>
+                <w:rFonts w:ascii="Arial" w:cs="Arial" w:eastAsia="Arial" w:hAnsi="Arial"/>
+                <w:sz w:val="16"/>
+                <w:szCs w:val="16"/>
+              </w:rPr>
+              <w:t xml:space="preserve">Static</w:t>
+            </w:r>
+          </w:p>
+        </w:tc>
+        <w:tc>
+          <w:tcPr>
+            <w:tcW w:type="dxa" w:w="2061"/>
+            <w:tcBorders>
+              <w:top w:val="single" w:color="D9E1EC" w:sz="4"/>
+              <w:left w:val="single" w:color="D9E1EC" w:sz="4"/>
+              <w:bottom w:val="single" w:color="D9E1EC" w:sz="4"/>
+              <w:right w:val="single" w:color="D9E1EC" w:sz="4"/>
+            </w:tcBorders>
+            <w:shd w:fill="F1F5F9" w:color="auto" w:val="clear"/>
+            <w:tcMar>
+              <w:top w:type="dxa" w:w="60"/>
+              <w:left w:type="dxa" w:w="90"/>
+              <w:bottom w:type="dxa" w:w="60"/>
+              <w:right w:type="dxa" w:w="90"/>
+            </w:tcMar>
+            <w:vAlign w:val="center"/>
+          </w:tcPr>
+          <w:p>
+            <w:pPr>
+              <w:spacing w:after="30" w:line="250"/>
+            </w:pPr>
+            <w:r>
+              <w:rPr>
+                <w:rFonts w:ascii="Arial" w:cs="Arial" w:eastAsia="Arial" w:hAnsi="Arial"/>
+                <w:sz w:val="16"/>
+                <w:szCs w:val="16"/>
+              </w:rPr>
+              <w:t xml:space="preserve">Off — Open Day done (Sat 24)</w:t>
+            </w:r>
+          </w:p>
         </w:tc>
       </w:tr>
     </w:tbl>
@@ -7827,7 +9772,7 @@
         <w:rPr>
           <w:rFonts w:ascii="Arial" w:cs="Arial" w:eastAsia="Arial" w:hAnsi="Arial"/>
         </w:rPr>
-        <w:t xml:space="preserve">START</w:t>
+        <w:t xml:space="preserve">START — W2 (from 12 Oct) · angle D · static</w:t>
       </w:r>
     </w:p>
     <w:tbl>
@@ -7948,6 +9893,30 @@
           </w:p>
           <w:p>
             <w:pPr>
+              <w:shd w:fill="E8F2FF" w:color="auto" w:val="clear"/>
+              <w:spacing w:after="90"/>
+            </w:pPr>
+            <w:r>
+              <w:rPr>
+                <w:rFonts w:ascii="Arial" w:cs="Arial" w:eastAsia="Arial" w:hAnsi="Arial"/>
+                <w:b/>
+                <w:bCs/>
+                <w:sz w:val="18"/>
+                <w:szCs w:val="18"/>
+              </w:rPr>
+              <w:t xml:space="preserve">When · format:</w:t>
+            </w:r>
+            <w:r>
+              <w:rPr>
+                <w:rFonts w:ascii="Arial" w:cs="Arial" w:eastAsia="Arial" w:hAnsi="Arial"/>
+                <w:sz w:val="18"/>
+                <w:szCs w:val="18"/>
+              </w:rPr>
+              <w:t xml:space="preserve"> W2–W3 · 12 → 23 Oct · static feed + story (optional 6 s motion story)</w:t>
+            </w:r>
+          </w:p>
+          <w:p>
+            <w:pPr>
               <w:spacing w:after="55" w:line="250"/>
             </w:pPr>
             <w:r>
@@ -8210,6 +10179,30 @@
           </w:p>
           <w:p>
             <w:pPr>
+              <w:shd w:fill="E8F2FF" w:color="auto" w:val="clear"/>
+              <w:spacing w:after="90"/>
+            </w:pPr>
+            <w:r>
+              <w:rPr>
+                <w:rFonts w:ascii="Arial" w:cs="Arial" w:eastAsia="Arial" w:hAnsi="Arial"/>
+                <w:b/>
+                <w:bCs/>
+                <w:sz w:val="18"/>
+                <w:szCs w:val="18"/>
+              </w:rPr>
+              <w:t xml:space="preserve">When · format:</w:t>
+            </w:r>
+            <w:r>
+              <w:rPr>
+                <w:rFonts w:ascii="Arial" w:cs="Arial" w:eastAsia="Arial" w:hAnsi="Arial"/>
+                <w:sz w:val="18"/>
+                <w:szCs w:val="18"/>
+              </w:rPr>
+              <w:t xml:space="preserve"> W2–W3 · 13 → 23 Oct · static (recut of the winning P-ad)</w:t>
+            </w:r>
+          </w:p>
+          <w:p>
+            <w:pPr>
               <w:spacing w:after="55" w:line="250"/>
             </w:pPr>
             <w:r>
@@ -8312,7 +10305,7 @@
         <w:rPr>
           <w:rFonts w:ascii="Arial" w:cs="Arial" w:eastAsia="Arial" w:hAnsi="Arial"/>
         </w:rPr>
-        <w:t xml:space="preserve">TEST — last 5 days</w:t>
+        <w:t xml:space="preserve">TEST — W3 (19 → 23 Oct) · countdown vs experience · static</w:t>
       </w:r>
     </w:p>
     <w:p>
@@ -8451,7 +10444,7 @@
                 <w:sz w:val="15"/>
                 <w:szCs w:val="15"/>
               </w:rPr>
-              <w:t xml:space="preserve">O1 native story version</w:t>
+              <w:t xml:space="preserve">W2–W3 · static · O1 story</w:t>
             </w:r>
           </w:p>
         </w:tc>
@@ -8546,7 +10539,7 @@
                 <w:sz w:val="15"/>
                 <w:szCs w:val="15"/>
               </w:rPr>
-              <w:t xml:space="preserve">vs O1 from 19 Oct</w:t>
+              <w:t xml:space="preserve">W3 · static · vs O1</w:t>
             </w:r>
           </w:p>
         </w:tc>
@@ -8681,6 +10674,437 @@
               <w:t xml:space="preserve">Job of the creatives: remove the last doubt — price, "is this for my kid?", timing.</w:t>
             </w:r>
           </w:p>
+          <w:p>
+            <w:pPr>
+              <w:spacing w:after="20"/>
+            </w:pPr>
+            <w:r>
+              <w:rPr>
+                <w:rFonts w:ascii="Arial" w:cs="Arial" w:eastAsia="Arial" w:hAnsi="Arial"/>
+                <w:color w:val="CBD5E1"/>
+                <w:sz w:val="18"/>
+                <w:szCs w:val="18"/>
+              </w:rPr>
+              <w:t xml:space="preserve">Angles: </w:t>
+            </w:r>
+            <w:r>
+              <w:rPr>
+                <w:rFonts w:ascii="Arial" w:cs="Arial" w:eastAsia="Arial" w:hAnsi="Arial"/>
+                <w:b/>
+                <w:bCs/>
+                <w:color w:val="CBD5E1"/>
+                <w:sz w:val="18"/>
+                <w:szCs w:val="18"/>
+              </w:rPr>
+              <w:t xml:space="preserve">C (offer) + D (Open Day, until 23 Oct)</w:t>
+            </w:r>
+            <w:r>
+              <w:rPr>
+                <w:rFonts w:ascii="Arial" w:cs="Arial" w:eastAsia="Arial" w:hAnsi="Arial"/>
+                <w:color w:val="CBD5E1"/>
+                <w:sz w:val="18"/>
+                <w:szCs w:val="18"/>
+              </w:rPr>
+              <w:t xml:space="preserve"> · formats: static (W2–W3) → real photos after the Open Day (W4)</w:t>
+            </w:r>
+          </w:p>
+        </w:tc>
+      </w:tr>
+    </w:tbl>
+    <w:p>
+      <w:pPr>
+        <w:spacing w:after="100"/>
+      </w:pPr>
+    </w:p>
+    <w:tbl>
+      <w:tblPr>
+        <w:tblW w:type="dxa" w:w="9638"/>
+        <w:tblBorders>
+          <w:top w:val="single" w:color="auto" w:sz="4"/>
+          <w:left w:val="single" w:color="auto" w:sz="4"/>
+          <w:bottom w:val="single" w:color="auto" w:sz="4"/>
+          <w:right w:val="single" w:color="auto" w:sz="4"/>
+          <w:insideH w:val="single" w:color="auto" w:sz="4"/>
+          <w:insideV w:val="single" w:color="auto" w:sz="4"/>
+        </w:tblBorders>
+      </w:tblPr>
+      <w:tblGrid>
+        <w:gridCol w:w="1400"/>
+        <w:gridCol w:w="2059"/>
+        <w:gridCol w:w="2059"/>
+        <w:gridCol w:w="2059"/>
+        <w:gridCol w:w="2061"/>
+      </w:tblGrid>
+      <w:tr>
+        <w:tc>
+          <w:tcPr>
+            <w:tcW w:type="dxa" w:w="1400"/>
+            <w:tcBorders>
+              <w:top w:val="single" w:color="D9E1EC" w:sz="4"/>
+              <w:left w:val="single" w:color="D9E1EC" w:sz="4"/>
+              <w:bottom w:val="single" w:color="D9E1EC" w:sz="4"/>
+              <w:right w:val="single" w:color="D9E1EC" w:sz="4"/>
+            </w:tcBorders>
+            <w:shd w:fill="0F172A" w:color="auto" w:val="clear"/>
+            <w:tcMar>
+              <w:top w:type="dxa" w:w="60"/>
+              <w:left w:type="dxa" w:w="90"/>
+              <w:bottom w:type="dxa" w:w="60"/>
+              <w:right w:type="dxa" w:w="90"/>
+            </w:tcMar>
+            <w:vAlign w:val="center"/>
+          </w:tcPr>
+          <w:p>
+            <w:pPr>
+              <w:spacing w:after="30" w:line="250"/>
+            </w:pPr>
+          </w:p>
+        </w:tc>
+        <w:tc>
+          <w:tcPr>
+            <w:tcW w:type="dxa" w:w="2059"/>
+            <w:tcBorders>
+              <w:top w:val="single" w:color="D9E1EC" w:sz="4"/>
+              <w:left w:val="single" w:color="D9E1EC" w:sz="4"/>
+              <w:bottom w:val="single" w:color="D9E1EC" w:sz="4"/>
+              <w:right w:val="single" w:color="D9E1EC" w:sz="4"/>
+            </w:tcBorders>
+            <w:shd w:fill="0F172A" w:color="auto" w:val="clear"/>
+            <w:tcMar>
+              <w:top w:type="dxa" w:w="60"/>
+              <w:left w:type="dxa" w:w="90"/>
+              <w:bottom w:type="dxa" w:w="60"/>
+              <w:right w:type="dxa" w:w="90"/>
+            </w:tcMar>
+            <w:vAlign w:val="center"/>
+          </w:tcPr>
+          <w:p>
+            <w:pPr>
+              <w:spacing w:after="30" w:line="250"/>
+            </w:pPr>
+            <w:r>
+              <w:rPr>
+                <w:rFonts w:ascii="Arial" w:cs="Arial" w:eastAsia="Arial" w:hAnsi="Arial"/>
+                <w:b/>
+                <w:bCs/>
+                <w:color w:val="FFFFFF"/>
+                <w:sz w:val="16"/>
+                <w:szCs w:val="16"/>
+              </w:rPr>
+              <w:t xml:space="preserve">W1 · 6–11 Oct</w:t>
+            </w:r>
+          </w:p>
+        </w:tc>
+        <w:tc>
+          <w:tcPr>
+            <w:tcW w:type="dxa" w:w="2059"/>
+            <w:tcBorders>
+              <w:top w:val="single" w:color="D9E1EC" w:sz="4"/>
+              <w:left w:val="single" w:color="D9E1EC" w:sz="4"/>
+              <w:bottom w:val="single" w:color="D9E1EC" w:sz="4"/>
+              <w:right w:val="single" w:color="D9E1EC" w:sz="4"/>
+            </w:tcBorders>
+            <w:shd w:fill="0F172A" w:color="auto" w:val="clear"/>
+            <w:tcMar>
+              <w:top w:type="dxa" w:w="60"/>
+              <w:left w:type="dxa" w:w="90"/>
+              <w:bottom w:type="dxa" w:w="60"/>
+              <w:right w:type="dxa" w:w="90"/>
+            </w:tcMar>
+            <w:vAlign w:val="center"/>
+          </w:tcPr>
+          <w:p>
+            <w:pPr>
+              <w:spacing w:after="30" w:line="250"/>
+            </w:pPr>
+            <w:r>
+              <w:rPr>
+                <w:rFonts w:ascii="Arial" w:cs="Arial" w:eastAsia="Arial" w:hAnsi="Arial"/>
+                <w:b/>
+                <w:bCs/>
+                <w:color w:val="FFFFFF"/>
+                <w:sz w:val="16"/>
+                <w:szCs w:val="16"/>
+              </w:rPr>
+              <w:t xml:space="preserve">W2 · 12–18 Oct</w:t>
+            </w:r>
+          </w:p>
+        </w:tc>
+        <w:tc>
+          <w:tcPr>
+            <w:tcW w:type="dxa" w:w="2059"/>
+            <w:tcBorders>
+              <w:top w:val="single" w:color="D9E1EC" w:sz="4"/>
+              <w:left w:val="single" w:color="D9E1EC" w:sz="4"/>
+              <w:bottom w:val="single" w:color="D9E1EC" w:sz="4"/>
+              <w:right w:val="single" w:color="D9E1EC" w:sz="4"/>
+            </w:tcBorders>
+            <w:shd w:fill="0F172A" w:color="auto" w:val="clear"/>
+            <w:tcMar>
+              <w:top w:type="dxa" w:w="60"/>
+              <w:left w:type="dxa" w:w="90"/>
+              <w:bottom w:type="dxa" w:w="60"/>
+              <w:right w:type="dxa" w:w="90"/>
+            </w:tcMar>
+            <w:vAlign w:val="center"/>
+          </w:tcPr>
+          <w:p>
+            <w:pPr>
+              <w:spacing w:after="30" w:line="250"/>
+            </w:pPr>
+            <w:r>
+              <w:rPr>
+                <w:rFonts w:ascii="Arial" w:cs="Arial" w:eastAsia="Arial" w:hAnsi="Arial"/>
+                <w:b/>
+                <w:bCs/>
+                <w:color w:val="FFFFFF"/>
+                <w:sz w:val="16"/>
+                <w:szCs w:val="16"/>
+              </w:rPr>
+              <w:t xml:space="preserve">W3 · 19–25 Oct</w:t>
+            </w:r>
+          </w:p>
+        </w:tc>
+        <w:tc>
+          <w:tcPr>
+            <w:tcW w:type="dxa" w:w="2061"/>
+            <w:tcBorders>
+              <w:top w:val="single" w:color="D9E1EC" w:sz="4"/>
+              <w:left w:val="single" w:color="D9E1EC" w:sz="4"/>
+              <w:bottom w:val="single" w:color="D9E1EC" w:sz="4"/>
+              <w:right w:val="single" w:color="D9E1EC" w:sz="4"/>
+            </w:tcBorders>
+            <w:shd w:fill="0F172A" w:color="auto" w:val="clear"/>
+            <w:tcMar>
+              <w:top w:type="dxa" w:w="60"/>
+              <w:left w:type="dxa" w:w="90"/>
+              <w:bottom w:type="dxa" w:w="60"/>
+              <w:right w:type="dxa" w:w="90"/>
+            </w:tcMar>
+            <w:vAlign w:val="center"/>
+          </w:tcPr>
+          <w:p>
+            <w:pPr>
+              <w:spacing w:after="30" w:line="250"/>
+            </w:pPr>
+            <w:r>
+              <w:rPr>
+                <w:rFonts w:ascii="Arial" w:cs="Arial" w:eastAsia="Arial" w:hAnsi="Arial"/>
+                <w:b/>
+                <w:bCs/>
+                <w:color w:val="FFFFFF"/>
+                <w:sz w:val="16"/>
+                <w:szCs w:val="16"/>
+              </w:rPr>
+              <w:t xml:space="preserve">W4 · 26 Oct →</w:t>
+            </w:r>
+          </w:p>
+        </w:tc>
+      </w:tr>
+      <w:tr>
+        <w:trPr>
+          <w:cantSplit/>
+        </w:trPr>
+        <w:tc>
+          <w:tcPr>
+            <w:tcW w:type="dxa" w:w="1400"/>
+            <w:tcBorders>
+              <w:top w:val="single" w:color="D9E1EC" w:sz="4"/>
+              <w:left w:val="single" w:color="D9E1EC" w:sz="4"/>
+              <w:bottom w:val="single" w:color="D9E1EC" w:sz="4"/>
+              <w:right w:val="single" w:color="D9E1EC" w:sz="4"/>
+            </w:tcBorders>
+            <w:shd w:fill="FFFFFF" w:color="auto" w:val="clear"/>
+            <w:tcMar>
+              <w:top w:type="dxa" w:w="60"/>
+              <w:left w:type="dxa" w:w="90"/>
+              <w:bottom w:type="dxa" w:w="60"/>
+              <w:right w:type="dxa" w:w="90"/>
+            </w:tcMar>
+            <w:vAlign w:val="center"/>
+          </w:tcPr>
+          <w:p>
+            <w:pPr>
+              <w:spacing w:after="30" w:line="250"/>
+            </w:pPr>
+            <w:r>
+              <w:rPr>
+                <w:rFonts w:ascii="Arial" w:cs="Arial" w:eastAsia="Arial" w:hAnsi="Arial"/>
+                <w:b/>
+                <w:bCs/>
+                <w:sz w:val="16"/>
+                <w:szCs w:val="16"/>
+              </w:rPr>
+              <w:t xml:space="preserve">This ad set</w:t>
+            </w:r>
+          </w:p>
+        </w:tc>
+        <w:tc>
+          <w:tcPr>
+            <w:tcW w:type="dxa" w:w="2059"/>
+            <w:tcBorders>
+              <w:top w:val="single" w:color="D9E1EC" w:sz="4"/>
+              <w:left w:val="single" w:color="D9E1EC" w:sz="4"/>
+              <w:bottom w:val="single" w:color="D9E1EC" w:sz="4"/>
+              <w:right w:val="single" w:color="D9E1EC" w:sz="4"/>
+            </w:tcBorders>
+            <w:shd w:fill="F1F5F9" w:color="auto" w:val="clear"/>
+            <w:tcMar>
+              <w:top w:type="dxa" w:w="60"/>
+              <w:left w:type="dxa" w:w="90"/>
+              <w:bottom w:type="dxa" w:w="60"/>
+              <w:right w:type="dxa" w:w="90"/>
+            </w:tcMar>
+            <w:vAlign w:val="center"/>
+          </w:tcPr>
+          <w:p>
+            <w:pPr>
+              <w:spacing w:after="30" w:line="250"/>
+            </w:pPr>
+            <w:r>
+              <w:rPr>
+                <w:rFonts w:ascii="Arial" w:cs="Arial" w:eastAsia="Arial" w:hAnsi="Arial"/>
+                <w:sz w:val="16"/>
+                <w:szCs w:val="16"/>
+              </w:rPr>
+              <w:t xml:space="preserve">Off — audience building</w:t>
+            </w:r>
+          </w:p>
+        </w:tc>
+        <w:tc>
+          <w:tcPr>
+            <w:tcW w:type="dxa" w:w="2059"/>
+            <w:tcBorders>
+              <w:top w:val="single" w:color="D9E1EC" w:sz="4"/>
+              <w:left w:val="single" w:color="D9E1EC" w:sz="4"/>
+              <w:bottom w:val="single" w:color="D9E1EC" w:sz="4"/>
+              <w:right w:val="single" w:color="D9E1EC" w:sz="4"/>
+            </w:tcBorders>
+            <w:shd w:fill="E8F2FF" w:color="auto" w:val="clear"/>
+            <w:tcMar>
+              <w:top w:type="dxa" w:w="60"/>
+              <w:left w:type="dxa" w:w="90"/>
+              <w:bottom w:type="dxa" w:w="60"/>
+              <w:right w:type="dxa" w:w="90"/>
+            </w:tcMar>
+            <w:vAlign w:val="center"/>
+          </w:tcPr>
+          <w:p>
+            <w:pPr>
+              <w:spacing w:after="30" w:line="250"/>
+            </w:pPr>
+            <w:r>
+              <w:rPr>
+                <w:rFonts w:ascii="Arial" w:cs="Arial" w:eastAsia="Arial" w:hAnsi="Arial"/>
+                <w:sz w:val="16"/>
+                <w:szCs w:val="16"/>
+              </w:rPr>
+              <w:t xml:space="preserve">R1 + R2 (C) + R3 (D) live 13 Oct</w:t>
+            </w:r>
+          </w:p>
+          <w:p>
+            <w:pPr>
+              <w:spacing w:after="30" w:line="250"/>
+            </w:pPr>
+            <w:r>
+              <w:rPr>
+                <w:rFonts w:ascii="Arial" w:cs="Arial" w:eastAsia="Arial" w:hAnsi="Arial"/>
+                <w:sz w:val="16"/>
+                <w:szCs w:val="16"/>
+              </w:rPr>
+              <w:t xml:space="preserve">Static</w:t>
+            </w:r>
+          </w:p>
+        </w:tc>
+        <w:tc>
+          <w:tcPr>
+            <w:tcW w:type="dxa" w:w="2059"/>
+            <w:tcBorders>
+              <w:top w:val="single" w:color="D9E1EC" w:sz="4"/>
+              <w:left w:val="single" w:color="D9E1EC" w:sz="4"/>
+              <w:bottom w:val="single" w:color="D9E1EC" w:sz="4"/>
+              <w:right w:val="single" w:color="D9E1EC" w:sz="4"/>
+            </w:tcBorders>
+            <w:shd w:fill="E8F2FF" w:color="auto" w:val="clear"/>
+            <w:tcMar>
+              <w:top w:type="dxa" w:w="60"/>
+              <w:left w:type="dxa" w:w="90"/>
+              <w:bottom w:type="dxa" w:w="60"/>
+              <w:right w:type="dxa" w:w="90"/>
+            </w:tcMar>
+            <w:vAlign w:val="center"/>
+          </w:tcPr>
+          <w:p>
+            <w:pPr>
+              <w:spacing w:after="30" w:line="250"/>
+            </w:pPr>
+            <w:r>
+              <w:rPr>
+                <w:rFonts w:ascii="Arial" w:cs="Arial" w:eastAsia="Arial" w:hAnsi="Arial"/>
+                <w:sz w:val="16"/>
+                <w:szCs w:val="16"/>
+              </w:rPr>
+              <w:t xml:space="preserve">R1 vs R2 · R3 ends 23 Oct</w:t>
+            </w:r>
+          </w:p>
+          <w:p>
+            <w:pPr>
+              <w:spacing w:after="30" w:line="250"/>
+            </w:pPr>
+            <w:r>
+              <w:rPr>
+                <w:rFonts w:ascii="Arial" w:cs="Arial" w:eastAsia="Arial" w:hAnsi="Arial"/>
+                <w:sz w:val="16"/>
+                <w:szCs w:val="16"/>
+              </w:rPr>
+              <w:t xml:space="preserve">Static</w:t>
+            </w:r>
+          </w:p>
+        </w:tc>
+        <w:tc>
+          <w:tcPr>
+            <w:tcW w:type="dxa" w:w="2061"/>
+            <w:tcBorders>
+              <w:top w:val="single" w:color="D9E1EC" w:sz="4"/>
+              <w:left w:val="single" w:color="D9E1EC" w:sz="4"/>
+              <w:bottom w:val="single" w:color="D9E1EC" w:sz="4"/>
+              <w:right w:val="single" w:color="D9E1EC" w:sz="4"/>
+            </w:tcBorders>
+            <w:shd w:fill="E3F6EF" w:color="auto" w:val="clear"/>
+            <w:tcMar>
+              <w:top w:type="dxa" w:w="60"/>
+              <w:left w:type="dxa" w:w="90"/>
+              <w:bottom w:type="dxa" w:w="60"/>
+              <w:right w:type="dxa" w:w="90"/>
+            </w:tcMar>
+            <w:vAlign w:val="center"/>
+          </w:tcPr>
+          <w:p>
+            <w:pPr>
+              <w:spacing w:after="30" w:line="250"/>
+            </w:pPr>
+            <w:r>
+              <w:rPr>
+                <w:rFonts w:ascii="Arial" w:cs="Arial" w:eastAsia="Arial" w:hAnsi="Arial"/>
+                <w:sz w:val="16"/>
+                <w:szCs w:val="16"/>
+              </w:rPr>
+              <w:t xml:space="preserve">R4 last seats + R5 recap</w:t>
+            </w:r>
+          </w:p>
+          <w:p>
+            <w:pPr>
+              <w:spacing w:after="30" w:line="250"/>
+            </w:pPr>
+            <w:r>
+              <w:rPr>
+                <w:rFonts w:ascii="Arial" w:cs="Arial" w:eastAsia="Arial" w:hAnsi="Arial"/>
+                <w:sz w:val="16"/>
+                <w:szCs w:val="16"/>
+              </w:rPr>
+              <w:t xml:space="preserve">Real photos</w:t>
+            </w:r>
+          </w:p>
         </w:tc>
       </w:tr>
     </w:tbl>
@@ -8693,7 +11117,7 @@
         <w:rPr>
           <w:rFonts w:ascii="Arial" w:cs="Arial" w:eastAsia="Arial" w:hAnsi="Arial"/>
         </w:rPr>
-        <w:t xml:space="preserve">START</w:t>
+        <w:t xml:space="preserve">START — W2 (from 13 Oct) · angles C + D · static</w:t>
       </w:r>
     </w:p>
     <w:tbl>
@@ -8814,6 +11238,30 @@
           </w:p>
           <w:p>
             <w:pPr>
+              <w:shd w:fill="E8F2FF" w:color="auto" w:val="clear"/>
+              <w:spacing w:after="90"/>
+            </w:pPr>
+            <w:r>
+              <w:rPr>
+                <w:rFonts w:ascii="Arial" w:cs="Arial" w:eastAsia="Arial" w:hAnsi="Arial"/>
+                <w:b/>
+                <w:bCs/>
+                <w:sz w:val="18"/>
+                <w:szCs w:val="18"/>
+              </w:rPr>
+              <w:t xml:space="preserve">When · format:</w:t>
+            </w:r>
+            <w:r>
+              <w:rPr>
+                <w:rFonts w:ascii="Arial" w:cs="Arial" w:eastAsia="Arial" w:hAnsi="Arial"/>
+                <w:sz w:val="18"/>
+                <w:szCs w:val="18"/>
+              </w:rPr>
+              <w:t xml:space="preserve"> From W2 · from 13 Oct · static</w:t>
+            </w:r>
+          </w:p>
+          <w:p>
+            <w:pPr>
               <w:spacing w:after="55" w:line="250"/>
             </w:pPr>
             <w:r>
@@ -9025,6 +11473,30 @@
           </w:p>
           <w:p>
             <w:pPr>
+              <w:shd w:fill="E8F2FF" w:color="auto" w:val="clear"/>
+              <w:spacing w:after="90"/>
+            </w:pPr>
+            <w:r>
+              <w:rPr>
+                <w:rFonts w:ascii="Arial" w:cs="Arial" w:eastAsia="Arial" w:hAnsi="Arial"/>
+                <w:b/>
+                <w:bCs/>
+                <w:sz w:val="18"/>
+                <w:szCs w:val="18"/>
+              </w:rPr>
+              <w:t xml:space="preserve">When · format:</w:t>
+            </w:r>
+            <w:r>
+              <w:rPr>
+                <w:rFonts w:ascii="Arial" w:cs="Arial" w:eastAsia="Arial" w:hAnsi="Arial"/>
+                <w:sz w:val="18"/>
+                <w:szCs w:val="18"/>
+              </w:rPr>
+              <w:t xml:space="preserve"> From W2 · from 13 Oct · static · refresh when frequency &gt; 3/week</w:t>
+            </w:r>
+          </w:p>
+          <w:p>
+            <w:pPr>
               <w:spacing w:after="55" w:line="250"/>
             </w:pPr>
             <w:r>
@@ -9180,7 +11652,7 @@
         <w:rPr>
           <w:rFonts w:ascii="Arial" w:cs="Arial" w:eastAsia="Arial" w:hAnsi="Arial"/>
         </w:rPr>
-        <w:t xml:space="preserve"> — same asset as O1, shown to warm parents until 23 Oct (people who visited but didn't apply are the best Open Day guests).</w:t>
+        <w:t xml:space="preserve"> (angle D · W2–W3 · static) — same asset as O1, shown to warm parents until 23 Oct (people who visited but didn't apply are the best Open Day guests).</w:t>
       </w:r>
     </w:p>
     <w:p>
@@ -9192,7 +11664,7 @@
         <w:rPr>
           <w:rFonts w:ascii="Arial" w:cs="Arial" w:eastAsia="Arial" w:hAnsi="Arial"/>
         </w:rPr>
-        <w:t xml:space="preserve">TEST</w:t>
+        <w:t xml:space="preserve">TEST — W2–W3 · price-led vs objection-led · static</w:t>
       </w:r>
     </w:p>
     <w:p>
@@ -9223,7 +11695,7 @@
         <w:rPr>
           <w:rFonts w:ascii="Arial" w:cs="Arial" w:eastAsia="Arial" w:hAnsi="Arial"/>
         </w:rPr>
-        <w:t xml:space="preserve">SWAP IN after the Open Day (from 26 Oct)</w:t>
+        <w:t xml:space="preserve">SWAP IN — W4 (from 26 Oct) · real photos</w:t>
       </w:r>
     </w:p>
     <w:tbl>
@@ -9337,7 +11809,7 @@
                 <w:sz w:val="15"/>
                 <w:szCs w:val="15"/>
               </w:rPr>
-              <w:t xml:space="preserve">Only with a REAL seat count per group</w:t>
+              <w:t xml:space="preserve">W4 · only with a REAL seat count</w:t>
             </w:r>
           </w:p>
         </w:tc>
@@ -9432,7 +11904,7 @@
                 <w:sz w:val="15"/>
                 <w:szCs w:val="15"/>
               </w:rPr>
-              <w:t xml:space="preserve">Real photos from 24 Oct (consent!)</w:t>
+              <w:t xml:space="preserve">W4 · real photos from 24 Oct (consent!)</w:t>
             </w:r>
           </w:p>
         </w:tc>
@@ -9463,10 +11935,11 @@
         </w:tblBorders>
       </w:tblPr>
       <w:tblGrid>
-        <w:gridCol w:w="1700"/>
-        <w:gridCol w:w="3100"/>
-        <w:gridCol w:w="2500"/>
-        <w:gridCol w:w="2338"/>
+        <w:gridCol w:w="1500"/>
+        <w:gridCol w:w="1550"/>
+        <w:gridCol w:w="2700"/>
+        <w:gridCol w:w="1950"/>
+        <w:gridCol w:w="1938"/>
       </w:tblGrid>
       <w:tr>
         <w:trPr>
@@ -9474,7 +11947,7 @@
         </w:trPr>
         <w:tc>
           <w:tcPr>
-            <w:tcW w:type="dxa" w:w="1700"/>
+            <w:tcW w:type="dxa" w:w="1500"/>
             <w:tcBorders>
               <w:top w:val="single" w:color="D9E1EC" w:sz="4"/>
               <w:left w:val="single" w:color="D9E1EC" w:sz="4"/>
@@ -9508,7 +11981,7 @@
         </w:tc>
         <w:tc>
           <w:tcPr>
-            <w:tcW w:type="dxa" w:w="3100"/>
+            <w:tcW w:type="dxa" w:w="1550"/>
             <w:tcBorders>
               <w:top w:val="single" w:color="D9E1EC" w:sz="4"/>
               <w:left w:val="single" w:color="D9E1EC" w:sz="4"/>
@@ -9536,13 +12009,47 @@
                 <w:sz w:val="18"/>
                 <w:szCs w:val="18"/>
               </w:rPr>
+              <w:t xml:space="preserve">Formats live</w:t>
+            </w:r>
+          </w:p>
+        </w:tc>
+        <w:tc>
+          <w:tcPr>
+            <w:tcW w:type="dxa" w:w="2700"/>
+            <w:tcBorders>
+              <w:top w:val="single" w:color="D9E1EC" w:sz="4"/>
+              <w:left w:val="single" w:color="D9E1EC" w:sz="4"/>
+              <w:bottom w:val="single" w:color="D9E1EC" w:sz="4"/>
+              <w:right w:val="single" w:color="D9E1EC" w:sz="4"/>
+            </w:tcBorders>
+            <w:shd w:fill="0F172A" w:color="auto" w:val="clear"/>
+            <w:tcMar>
+              <w:top w:type="dxa" w:w="70"/>
+              <w:left w:type="dxa" w:w="100"/>
+              <w:bottom w:type="dxa" w:w="70"/>
+              <w:right w:type="dxa" w:w="100"/>
+            </w:tcMar>
+          </w:tcPr>
+          <w:p>
+            <w:pPr>
+              <w:spacing w:after="30" w:line="250"/>
+            </w:pPr>
+            <w:r>
+              <w:rPr>
+                <w:rFonts w:ascii="Arial" w:cs="Arial" w:eastAsia="Arial" w:hAnsi="Arial"/>
+                <w:b/>
+                <w:bCs/>
+                <w:color w:val="FFFFFF"/>
+                <w:sz w:val="18"/>
+                <w:szCs w:val="18"/>
+              </w:rPr>
               <w:t xml:space="preserve">Prospecting (1.1)</w:t>
             </w:r>
           </w:p>
         </w:tc>
         <w:tc>
           <w:tcPr>
-            <w:tcW w:type="dxa" w:w="2500"/>
+            <w:tcW w:type="dxa" w:w="1950"/>
             <w:tcBorders>
               <w:top w:val="single" w:color="D9E1EC" w:sz="4"/>
               <w:left w:val="single" w:color="D9E1EC" w:sz="4"/>
@@ -9576,7 +12083,7 @@
         </w:tc>
         <w:tc>
           <w:tcPr>
-            <w:tcW w:type="dxa" w:w="2338"/>
+            <w:tcW w:type="dxa" w:w="1938"/>
             <w:tcBorders>
               <w:top w:val="single" w:color="D9E1EC" w:sz="4"/>
               <w:left w:val="single" w:color="D9E1EC" w:sz="4"/>
@@ -9615,7 +12122,7 @@
         </w:trPr>
         <w:tc>
           <w:tcPr>
-            <w:tcW w:type="dxa" w:w="1700"/>
+            <w:tcW w:type="dxa" w:w="1500"/>
             <w:tcBorders>
               <w:top w:val="single" w:color="D9E1EC" w:sz="4"/>
               <w:left w:val="single" w:color="D9E1EC" w:sz="4"/>
@@ -9648,7 +12155,38 @@
         </w:tc>
         <w:tc>
           <w:tcPr>
-            <w:tcW w:type="dxa" w:w="3100"/>
+            <w:tcW w:type="dxa" w:w="1550"/>
+            <w:tcBorders>
+              <w:top w:val="single" w:color="D9E1EC" w:sz="4"/>
+              <w:left w:val="single" w:color="D9E1EC" w:sz="4"/>
+              <w:bottom w:val="single" w:color="D9E1EC" w:sz="4"/>
+              <w:right w:val="single" w:color="D9E1EC" w:sz="4"/>
+            </w:tcBorders>
+            <w:shd w:fill="E8F2FF" w:color="auto" w:val="clear"/>
+            <w:tcMar>
+              <w:top w:type="dxa" w:w="60"/>
+              <w:left w:type="dxa" w:w="100"/>
+              <w:bottom w:type="dxa" w:w="60"/>
+              <w:right w:type="dxa" w:w="100"/>
+            </w:tcMar>
+          </w:tcPr>
+          <w:p>
+            <w:pPr>
+              <w:spacing w:after="30" w:line="250"/>
+            </w:pPr>
+            <w:r>
+              <w:rPr>
+                <w:rFonts w:ascii="Arial" w:cs="Arial" w:eastAsia="Arial" w:hAnsi="Arial"/>
+                <w:sz w:val="18"/>
+                <w:szCs w:val="18"/>
+              </w:rPr>
+              <w:t xml:space="preserve">Static (feed + story)</w:t>
+            </w:r>
+          </w:p>
+        </w:tc>
+        <w:tc>
+          <w:tcPr>
+            <w:tcW w:type="dxa" w:w="2700"/>
             <w:tcBorders>
               <w:top w:val="single" w:color="D9E1EC" w:sz="4"/>
               <w:left w:val="single" w:color="D9E1EC" w:sz="4"/>
@@ -9673,13 +12211,31 @@
                 <w:sz w:val="18"/>
                 <w:szCs w:val="18"/>
               </w:rPr>
-              <w:t xml:space="preserve">P1–P6 live. No edits for 72 h. Daily QA only.</w:t>
-            </w:r>
-          </w:p>
-        </w:tc>
-        <w:tc>
-          <w:tcPr>
-            <w:tcW w:type="dxa" w:w="2500"/>
+              <w:t xml:space="preserve">P1–P6 live — </w:t>
+            </w:r>
+            <w:r>
+              <w:rPr>
+                <w:rFonts w:ascii="Arial" w:cs="Arial" w:eastAsia="Arial" w:hAnsi="Arial"/>
+                <w:b/>
+                <w:bCs/>
+                <w:sz w:val="18"/>
+                <w:szCs w:val="18"/>
+              </w:rPr>
+              <w:t xml:space="preserve">angles A + B + C side by side</w:t>
+            </w:r>
+            <w:r>
+              <w:rPr>
+                <w:rFonts w:ascii="Arial" w:cs="Arial" w:eastAsia="Arial" w:hAnsi="Arial"/>
+                <w:sz w:val="18"/>
+                <w:szCs w:val="18"/>
+              </w:rPr>
+              <w:t xml:space="preserve">. No edits for 72 h.</w:t>
+            </w:r>
+          </w:p>
+        </w:tc>
+        <w:tc>
+          <w:tcPr>
+            <w:tcW w:type="dxa" w:w="1950"/>
             <w:tcBorders>
               <w:top w:val="single" w:color="D9E1EC" w:sz="4"/>
               <w:left w:val="single" w:color="D9E1EC" w:sz="4"/>
@@ -9704,13 +12260,13 @@
                 <w:sz w:val="18"/>
                 <w:szCs w:val="18"/>
               </w:rPr>
-              <w:t xml:space="preserve">Prep C6 + story</w:t>
-            </w:r>
-          </w:p>
-        </w:tc>
-        <w:tc>
-          <w:tcPr>
-            <w:tcW w:type="dxa" w:w="2338"/>
+              <w:t xml:space="preserve">Off · prep C6 + story</w:t>
+            </w:r>
+          </w:p>
+        </w:tc>
+        <w:tc>
+          <w:tcPr>
+            <w:tcW w:type="dxa" w:w="1938"/>
             <w:tcBorders>
               <w:top w:val="single" w:color="D9E1EC" w:sz="4"/>
               <w:left w:val="single" w:color="D9E1EC" w:sz="4"/>
@@ -9735,7 +12291,7 @@
                 <w:sz w:val="18"/>
                 <w:szCs w:val="18"/>
               </w:rPr>
-              <w:t xml:space="preserve">Audience building</w:t>
+              <w:t xml:space="preserve">Off · audience building</w:t>
             </w:r>
           </w:p>
         </w:tc>
@@ -9746,7 +12302,7 @@
         </w:trPr>
         <w:tc>
           <w:tcPr>
-            <w:tcW w:type="dxa" w:w="1700"/>
+            <w:tcW w:type="dxa" w:w="1500"/>
             <w:tcBorders>
               <w:top w:val="single" w:color="D9E1EC" w:sz="4"/>
               <w:left w:val="single" w:color="D9E1EC" w:sz="4"/>
@@ -9779,7 +12335,38 @@
         </w:tc>
         <w:tc>
           <w:tcPr>
-            <w:tcW w:type="dxa" w:w="3100"/>
+            <w:tcW w:type="dxa" w:w="1550"/>
+            <w:tcBorders>
+              <w:top w:val="single" w:color="D9E1EC" w:sz="4"/>
+              <w:left w:val="single" w:color="D9E1EC" w:sz="4"/>
+              <w:bottom w:val="single" w:color="D9E1EC" w:sz="4"/>
+              <w:right w:val="single" w:color="D9E1EC" w:sz="4"/>
+            </w:tcBorders>
+            <w:shd w:fill="E8F2FF" w:color="auto" w:val="clear"/>
+            <w:tcMar>
+              <w:top w:type="dxa" w:w="60"/>
+              <w:left w:type="dxa" w:w="100"/>
+              <w:bottom w:type="dxa" w:w="60"/>
+              <w:right w:type="dxa" w:w="100"/>
+            </w:tcMar>
+          </w:tcPr>
+          <w:p>
+            <w:pPr>
+              <w:spacing w:after="30" w:line="250"/>
+            </w:pPr>
+            <w:r>
+              <w:rPr>
+                <w:rFonts w:ascii="Arial" w:cs="Arial" w:eastAsia="Arial" w:hAnsi="Arial"/>
+                <w:sz w:val="18"/>
+                <w:szCs w:val="18"/>
+              </w:rPr>
+              <w:t xml:space="preserve">Static</w:t>
+            </w:r>
+          </w:p>
+        </w:tc>
+        <w:tc>
+          <w:tcPr>
+            <w:tcW w:type="dxa" w:w="2700"/>
             <w:tcBorders>
               <w:top w:val="single" w:color="D9E1EC" w:sz="4"/>
               <w:left w:val="single" w:color="D9E1EC" w:sz="4"/>
@@ -9810,7 +12397,7 @@
         </w:tc>
         <w:tc>
           <w:tcPr>
-            <w:tcW w:type="dxa" w:w="2500"/>
+            <w:tcW w:type="dxa" w:w="1950"/>
             <w:tcBorders>
               <w:top w:val="single" w:color="D9E1EC" w:sz="4"/>
               <w:left w:val="single" w:color="D9E1EC" w:sz="4"/>
@@ -9832,16 +12419,26 @@
             <w:r>
               <w:rPr>
                 <w:rFonts w:ascii="Arial" w:cs="Arial" w:eastAsia="Arial" w:hAnsi="Arial"/>
-                <w:sz w:val="18"/>
-                <w:szCs w:val="18"/>
-              </w:rPr>
-              <w:t xml:space="preserve">O1 live 12 Oct · O2 (winner + band) 13 Oct</w:t>
-            </w:r>
-          </w:p>
-        </w:tc>
-        <w:tc>
-          <w:tcPr>
-            <w:tcW w:type="dxa" w:w="2338"/>
+                <w:b/>
+                <w:bCs/>
+                <w:sz w:val="18"/>
+                <w:szCs w:val="18"/>
+              </w:rPr>
+              <w:t xml:space="preserve">Angle D:</w:t>
+            </w:r>
+            <w:r>
+              <w:rPr>
+                <w:rFonts w:ascii="Arial" w:cs="Arial" w:eastAsia="Arial" w:hAnsi="Arial"/>
+                <w:sz w:val="18"/>
+                <w:szCs w:val="18"/>
+              </w:rPr>
+              <w:t xml:space="preserve"> O1 live 12 Oct · O2 13 Oct</w:t>
+            </w:r>
+          </w:p>
+        </w:tc>
+        <w:tc>
+          <w:tcPr>
+            <w:tcW w:type="dxa" w:w="1938"/>
             <w:tcBorders>
               <w:top w:val="single" w:color="D9E1EC" w:sz="4"/>
               <w:left w:val="single" w:color="D9E1EC" w:sz="4"/>
@@ -9863,10 +12460,20 @@
             <w:r>
               <w:rPr>
                 <w:rFonts w:ascii="Arial" w:cs="Arial" w:eastAsia="Arial" w:hAnsi="Arial"/>
-                <w:sz w:val="18"/>
-                <w:szCs w:val="18"/>
-              </w:rPr>
-              <w:t xml:space="preserve">R1, R2, R3 live 13 Oct</w:t>
+                <w:b/>
+                <w:bCs/>
+                <w:sz w:val="18"/>
+                <w:szCs w:val="18"/>
+              </w:rPr>
+              <w:t xml:space="preserve">Angles C + D:</w:t>
+            </w:r>
+            <w:r>
+              <w:rPr>
+                <w:rFonts w:ascii="Arial" w:cs="Arial" w:eastAsia="Arial" w:hAnsi="Arial"/>
+                <w:sz w:val="18"/>
+                <w:szCs w:val="18"/>
+              </w:rPr>
+              <w:t xml:space="preserve"> R1, R2, R3 live 13 Oct</w:t>
             </w:r>
           </w:p>
         </w:tc>
@@ -9877,7 +12484,7 @@
         </w:trPr>
         <w:tc>
           <w:tcPr>
-            <w:tcW w:type="dxa" w:w="1700"/>
+            <w:tcW w:type="dxa" w:w="1500"/>
             <w:tcBorders>
               <w:top w:val="single" w:color="D9E1EC" w:sz="4"/>
               <w:left w:val="single" w:color="D9E1EC" w:sz="4"/>
@@ -9910,7 +12517,38 @@
         </w:tc>
         <w:tc>
           <w:tcPr>
-            <w:tcW w:type="dxa" w:w="3100"/>
+            <w:tcW w:type="dxa" w:w="1550"/>
+            <w:tcBorders>
+              <w:top w:val="single" w:color="D9E1EC" w:sz="4"/>
+              <w:left w:val="single" w:color="D9E1EC" w:sz="4"/>
+              <w:bottom w:val="single" w:color="D9E1EC" w:sz="4"/>
+              <w:right w:val="single" w:color="D9E1EC" w:sz="4"/>
+            </w:tcBorders>
+            <w:shd w:fill="EDE8FF" w:color="auto" w:val="clear"/>
+            <w:tcMar>
+              <w:top w:type="dxa" w:w="60"/>
+              <w:left w:type="dxa" w:w="100"/>
+              <w:bottom w:type="dxa" w:w="60"/>
+              <w:right w:type="dxa" w:w="100"/>
+            </w:tcMar>
+          </w:tcPr>
+          <w:p>
+            <w:pPr>
+              <w:spacing w:after="30" w:line="250"/>
+            </w:pPr>
+            <w:r>
+              <w:rPr>
+                <w:rFonts w:ascii="Arial" w:cs="Arial" w:eastAsia="Arial" w:hAnsi="Arial"/>
+                <w:sz w:val="18"/>
+                <w:szCs w:val="18"/>
+              </w:rPr>
+              <w:t xml:space="preserve">Static + motion / carousel (winner only)</w:t>
+            </w:r>
+          </w:p>
+        </w:tc>
+        <w:tc>
+          <w:tcPr>
+            <w:tcW w:type="dxa" w:w="2700"/>
             <w:tcBorders>
               <w:top w:val="single" w:color="D9E1EC" w:sz="4"/>
               <w:left w:val="single" w:color="D9E1EC" w:sz="4"/>
@@ -9935,13 +12573,13 @@
                 <w:sz w:val="18"/>
                 <w:szCs w:val="18"/>
               </w:rPr>
-              <w:t xml:space="preserve">R2 iterations of winner live (1 change each).</w:t>
-            </w:r>
-          </w:p>
-        </w:tc>
-        <w:tc>
-          <w:tcPr>
-            <w:tcW w:type="dxa" w:w="2500"/>
+              <w:t xml:space="preserve">Round 2: winner iterations (1 change each).</w:t>
+            </w:r>
+          </w:p>
+        </w:tc>
+        <w:tc>
+          <w:tcPr>
+            <w:tcW w:type="dxa" w:w="1950"/>
             <w:tcBorders>
               <w:top w:val="single" w:color="D9E1EC" w:sz="4"/>
               <w:left w:val="single" w:color="D9E1EC" w:sz="4"/>
@@ -9972,7 +12610,7 @@
         </w:tc>
         <w:tc>
           <w:tcPr>
-            <w:tcW w:type="dxa" w:w="2338"/>
+            <w:tcW w:type="dxa" w:w="1938"/>
             <w:tcBorders>
               <w:top w:val="single" w:color="D9E1EC" w:sz="4"/>
               <w:left w:val="single" w:color="D9E1EC" w:sz="4"/>
@@ -9997,7 +12635,7 @@
                 <w:sz w:val="18"/>
                 <w:szCs w:val="18"/>
               </w:rPr>
-              <w:t xml:space="preserve">R3 ends 23 Oct · Open Day Sat 24</w:t>
+              <w:t xml:space="preserve">R1 vs R2 · R3 ends 23 Oct · Open Day Sat 24</w:t>
             </w:r>
           </w:p>
         </w:tc>
@@ -10008,7 +12646,7 @@
         </w:trPr>
         <w:tc>
           <w:tcPr>
-            <w:tcW w:type="dxa" w:w="1700"/>
+            <w:tcW w:type="dxa" w:w="1500"/>
             <w:tcBorders>
               <w:top w:val="single" w:color="D9E1EC" w:sz="4"/>
               <w:left w:val="single" w:color="D9E1EC" w:sz="4"/>
@@ -10041,7 +12679,38 @@
         </w:tc>
         <w:tc>
           <w:tcPr>
-            <w:tcW w:type="dxa" w:w="3100"/>
+            <w:tcW w:type="dxa" w:w="1550"/>
+            <w:tcBorders>
+              <w:top w:val="single" w:color="D9E1EC" w:sz="4"/>
+              <w:left w:val="single" w:color="D9E1EC" w:sz="4"/>
+              <w:bottom w:val="single" w:color="D9E1EC" w:sz="4"/>
+              <w:right w:val="single" w:color="D9E1EC" w:sz="4"/>
+            </w:tcBorders>
+            <w:shd w:fill="E3F6EF" w:color="auto" w:val="clear"/>
+            <w:tcMar>
+              <w:top w:type="dxa" w:w="60"/>
+              <w:left w:type="dxa" w:w="100"/>
+              <w:bottom w:type="dxa" w:w="60"/>
+              <w:right w:type="dxa" w:w="100"/>
+            </w:tcMar>
+          </w:tcPr>
+          <w:p>
+            <w:pPr>
+              <w:spacing w:after="30" w:line="250"/>
+            </w:pPr>
+            <w:r>
+              <w:rPr>
+                <w:rFonts w:ascii="Arial" w:cs="Arial" w:eastAsia="Arial" w:hAnsi="Arial"/>
+                <w:sz w:val="18"/>
+                <w:szCs w:val="18"/>
+              </w:rPr>
+              <w:t xml:space="preserve">Real photo + 15 s video</w:t>
+            </w:r>
+          </w:p>
+        </w:tc>
+        <w:tc>
+          <w:tcPr>
+            <w:tcW w:type="dxa" w:w="2700"/>
             <w:tcBorders>
               <w:top w:val="single" w:color="D9E1EC" w:sz="4"/>
               <w:left w:val="single" w:color="D9E1EC" w:sz="4"/>
@@ -10066,13 +12735,13 @@
                 <w:sz w:val="18"/>
                 <w:szCs w:val="18"/>
               </w:rPr>
-              <w:t xml:space="preserve">Real-photo versions + 15 s Reel. 60/30/10 budget on winners.</w:t>
-            </w:r>
-          </w:p>
-        </w:tc>
-        <w:tc>
-          <w:tcPr>
-            <w:tcW w:type="dxa" w:w="2500"/>
+              <w:t xml:space="preserve">Round 3: real-photo versions + 15 s Reel · 60/30/10 on winners.</w:t>
+            </w:r>
+          </w:p>
+        </w:tc>
+        <w:tc>
+          <w:tcPr>
+            <w:tcW w:type="dxa" w:w="1950"/>
             <w:tcBorders>
               <w:top w:val="single" w:color="D9E1EC" w:sz="4"/>
               <w:left w:val="single" w:color="D9E1EC" w:sz="4"/>
@@ -10103,7 +12772,7 @@
         </w:tc>
         <w:tc>
           <w:tcPr>
-            <w:tcW w:type="dxa" w:w="2338"/>
+            <w:tcW w:type="dxa" w:w="1938"/>
             <w:tcBorders>
               <w:top w:val="single" w:color="D9E1EC" w:sz="4"/>
               <w:left w:val="single" w:color="D9E1EC" w:sz="4"/>
@@ -10128,7 +12797,7 @@
                 <w:sz w:val="18"/>
                 <w:szCs w:val="18"/>
               </w:rPr>
-              <w:t xml:space="preserve">R4 last seats + R5 recap live</w:t>
+              <w:t xml:space="preserve">R4 last seats + R5 recap</w:t>
             </w:r>
           </w:p>
         </w:tc>
@@ -10480,7 +13149,7 @@
                 <w:sz w:val="18"/>
                 <w:szCs w:val="18"/>
               </w:rPr>
-              <w:t xml:space="preserve">C1 Hero, C2 Future Skills, C3 Less scrolling, C4 English + AI, C5 Founding</w:t>
+              <w:t xml:space="preserve">C1 Hero, C2 Future Skills, C3 Less scrolling, C4 English + AI, C5 Founding (angles A/B/C)</w:t>
             </w:r>
           </w:p>
         </w:tc>
@@ -10511,7 +13180,7 @@
                 <w:sz w:val="18"/>
                 <w:szCs w:val="18"/>
               </w:rPr>
-              <w:t xml:space="preserve">4:5 + 9:16 each</w:t>
+              <w:t xml:space="preserve">Static 4:5 + 9:16 each</w:t>
             </w:r>
           </w:p>
         </w:tc>

</xml_diff>

<commit_message>
English angle: drop 'not a subject / language we use', new 'Engleski bez straha'
- C4 English mockup and carousel card 2 re-designed around the new line
- 1-pager, creative plan (full + short), weekly plan and short homepage
  (?angle=english hero, row, FAQ) updated
- Briefs: B1-3 rewritten with UPDATED note, C4 added to the update brief
  (U1-U8 labels), winner-variant notes adjusted
- design-briefs/images/: every brief's pictures in their own folder + zip,
  named by brief ID, ready to attach

Co-Authored-By: Claude Opus 5.5 <noreply@anthropic.com>
Claude-Session: https://claude.ai/code/session_01WYxT2oKqHUxfsBrXZ2Myb2
</commit_message>
<xml_diff>
--- a/nxt-school-launch/NXT_Meta_Creative_Plan.docx
+++ b/nxt-school-launch/NXT_Meta_Creative_Plan.docx
@@ -2510,7 +2510,7 @@
                 <w:sz w:val="17"/>
                 <w:szCs w:val="17"/>
               </w:rPr>
-              <w:t xml:space="preserve">"English is not a subject here."</w:t>
+              <w:t xml:space="preserve">"Engleski bez straha."</w:t>
             </w:r>
           </w:p>
         </w:tc>
@@ -2632,7 +2632,7 @@
                 <w:sz w:val="17"/>
                 <w:szCs w:val="17"/>
               </w:rPr>
-              <w:t xml:space="preserve">If 3 wins: kid presenting in English (photo), SR-first headline</w:t>
+              <w:t xml:space="preserve">If 3 wins: kid presenting in English (photo), chat as 6 s motion</w:t>
             </w:r>
           </w:p>
         </w:tc>
@@ -4141,7 +4141,7 @@
                 <w:sz w:val="18"/>
                 <w:szCs w:val="18"/>
               </w:rPr>
-              <w:t xml:space="preserve">English is not a subject here. It’s the language we use. · Engleski raste sa samopouzdanjem grupe.</w:t>
+              <w:t xml:space="preserve">Engleski bez straha — kroz projekte. · Engleski raste sa samopouzdanjem grupe.</w:t>
             </w:r>
           </w:p>
         </w:tc>
@@ -7304,7 +7304,7 @@
                 <w:sz w:val="18"/>
                 <w:szCs w:val="18"/>
               </w:rPr>
-              <w:t xml:space="preserve"> English as the working language — our edge vs English schools.</w:t>
+              <w:t xml:space="preserve"> English confidence for the “zna reči, ali ne priča” parent — kids speak through projects.</w:t>
             </w:r>
           </w:p>
           <w:p>
@@ -7327,7 +7327,7 @@
                 <w:sz w:val="18"/>
                 <w:szCs w:val="18"/>
               </w:rPr>
-              <w:t xml:space="preserve"> "English is not a subject here. It’s the language we use." + chat: "Can I show my project first?" → "Of course! Tell us why you made it." + "Raste sa samopouzdanjem grupe."</w:t>
+              <w:t xml:space="preserve"> "Engleski bez straha." + chat: "Can I show my project first?" → "Of course! Tell us why you made it." + "Kroz projekte deca pitaju, istražuju i predstavljaju na engleskom — u skladu sa nivoom grupe. Kad treba, pređemo na srpski."</w:t>
             </w:r>
           </w:p>
           <w:p>
@@ -7350,7 +7350,7 @@
                 <w:sz w:val="18"/>
                 <w:szCs w:val="18"/>
               </w:rPr>
-              <w:t xml:space="preserve"> Angle 3 — opens "English is not a subject here. It’s the language we use."</w:t>
+              <w:t xml:space="preserve"> Angle 3 — opens "Zna reči, ali se ne usuđuje da priča?"</w:t>
             </w:r>
           </w:p>
           <w:p>
@@ -7373,7 +7373,7 @@
                 <w:sz w:val="18"/>
                 <w:szCs w:val="18"/>
               </w:rPr>
-              <w:t xml:space="preserve"> Engleski je ovde jezik rada · </w:t>
+              <w:t xml:space="preserve"> Engleski bez straha — kroz projekte · </w:t>
             </w:r>
             <w:r>
               <w:rPr>
@@ -18399,7 +18399,7 @@
                 <w:sz w:val="19"/>
                 <w:szCs w:val="19"/>
               </w:rPr>
-              <w:t xml:space="preserve">ANGLE 3 — "English is not a subject here."  ·  P3</w:t>
+              <w:t xml:space="preserve">ANGLE 3 — "Engleski bez straha."  ·  P3</w:t>
             </w:r>
           </w:p>
         </w:tc>
@@ -18450,7 +18450,7 @@
                 <w:sz w:val="19"/>
                 <w:szCs w:val="19"/>
               </w:rPr>
-              <w:t xml:space="preserve">English is not a subject here. It’s the language we use.</w:t>
+              <w:t xml:space="preserve">Zna reči, ali se ne usuđuje da priča?</w:t>
             </w:r>
           </w:p>
           <w:p>
@@ -18478,7 +18478,7 @@
                 <w:sz w:val="19"/>
                 <w:szCs w:val="19"/>
               </w:rPr>
-              <w:t xml:space="preserve">U NXT School engleski nije čas gramatike — to je jezik kojim deca rade: postavljaju pitanja, istražuju, koriste AI i predstavljaju svoje projekte.</w:t>
+              <w:t xml:space="preserve">U NXT School engleski se koristi prirodno, kroz projekte: deca postavljaju pitanja, istražuju, koriste AI i predstavljaju svoje radove na engleskom.</w:t>
             </w:r>
           </w:p>
           <w:p>
@@ -18607,7 +18607,7 @@
                 <w:sz w:val="19"/>
                 <w:szCs w:val="19"/>
               </w:rPr>
-              <w:t xml:space="preserve">Engleski ovde nije predmet — to je jezik kojim deca rade, pitaju i predstavljaju. Raste sa samopouzdanjem grupe. 1–8. razred, Novi Sad, početak 9. novembra.</w:t>
+              <w:t xml:space="preserve">Zna reči, ali ne priča? Kroz projekte deca pitaju, istražuju i predstavljaju na engleskom. Engleski raste zajedno sa samopouzdanjem grupe. 1–8. razred, Novi Sad, početak 9. novembra.</w:t>
             </w:r>
           </w:p>
           <w:p>
@@ -18638,7 +18638,7 @@
                 <w:sz w:val="19"/>
                 <w:szCs w:val="19"/>
               </w:rPr>
-              <w:t xml:space="preserve">Engleski je ovde jezik rada · English is the language we use · Hrabrost da pričaju engleski</w:t>
+              <w:t xml:space="preserve">Engleski bez straha — kroz projekte · Zna reči, ali ne priča? · Hrabrost da pričaju engleski</w:t>
             </w:r>
           </w:p>
         </w:tc>

</xml_diff>

<commit_message>
O2 reworked Open Day-first; Week 2 docs updated
- O2 mockup: Open Day kicker + date on top, the winning P-ad hook as an
  invitation ('Less scrolling? Dodite da vidite kako deca stvaraju.'),
  P-ad banners kept small, date card + 'Prijavi se za Open Day'
- Batch 2 brief (B2-5) rewritten with pattern for other winners; update
  brief row, weekly plan W2/W3, short + full creative plan, 1-pager
- Brief 'UPDATED' label made neutral; image folders regenerated

Co-Authored-By: Claude Opus 5.5 <noreply@anthropic.com>
Claude-Session: https://claude.ai/code/session_01WYxT2oKqHUxfsBrXZ2Myb2
</commit_message>
<xml_diff>
--- a/nxt-school-launch/NXT_Meta_Creative_Plan.docx
+++ b/nxt-school-launch/NXT_Meta_Creative_Plan.docx
@@ -1292,7 +1292,7 @@
                 <w:sz w:val="18"/>
                 <w:szCs w:val="18"/>
               </w:rPr>
-              <w:t xml:space="preserve">O2 best P-ad + Open Day band (13 Oct)</w:t>
+              <w:t xml:space="preserve">O2 Open Day + winning P-ad hook (13 Oct)</w:t>
             </w:r>
           </w:p>
         </w:tc>
@@ -3192,7 +3192,7 @@
                 <w:sz w:val="17"/>
                 <w:szCs w:val="17"/>
               </w:rPr>
-              <w:t xml:space="preserve">O1 (feed + story), O2 recut, R3</w:t>
+              <w:t xml:space="preserve">O1 (feed + story), O2 winner hook, R3</w:t>
             </w:r>
           </w:p>
           <w:p>
@@ -12066,7 +12066,7 @@
                 <w:sz w:val="22"/>
                 <w:szCs w:val="22"/>
               </w:rPr>
-              <w:t xml:space="preserve">O2 · Best prospecting ad + Open Day band</w:t>
+              <w:t xml:space="preserve">O2 · Open Day invite with the winning P-ad hook</w:t>
             </w:r>
           </w:p>
           <w:p>
@@ -12090,7 +12090,7 @@
                 <w:sz w:val="18"/>
                 <w:szCs w:val="18"/>
               </w:rPr>
-              <w:t xml:space="preserve"> W2–W3 · 13 → 26 Oct · static (recut of the winning P-ad)</w:t>
+              <w:t xml:space="preserve"> W2–W3 · 13 → 26 Oct · static (Open Day + winner’s hook)</w:t>
             </w:r>
           </w:p>
           <w:p>
@@ -12136,7 +12136,7 @@
                 <w:sz w:val="18"/>
                 <w:szCs w:val="18"/>
               </w:rPr>
-              <w:t xml:space="preserve"> reuses the visual parents already responded to; swaps the footer for an Open Day band (date + "Prijavi se"). Mock uses C3 — use whichever P-ad leads on day 6–7.</w:t>
+              <w:t xml:space="preserve"> Open Day first — kicker with the date on top, the winner’s hook turned into an invitation (“Less scrolling? Dođite da vidite kako deca stvaraju.”), the P-ad visual kept small so people recognize it. Mock uses C3 — use whichever P-ad leads on day 6–7.</w:t>
             </w:r>
           </w:p>
           <w:p>
@@ -16314,7 +16314,7 @@
                 <w:sz w:val="18"/>
                 <w:szCs w:val="18"/>
               </w:rPr>
-              <w:t xml:space="preserve">O2 = winning P-ad + Open Day band</w:t>
+              <w:t xml:space="preserve">O2 = Open Day invite on the winning P-ad hook</w:t>
             </w:r>
           </w:p>
         </w:tc>

</xml_diff>

<commit_message>
O2 balanced: proven C3 intact + Open Day framing
- O2 keeps C3 as is (phone banners + 'Less scrolling. More creating.'),
  adds 'NXT Open Day · dodite da vidite uzivo' kicker, invitation subline
  and the Open Day band with date + 'Prijavi se'
- B2-5, update brief, weekly plan, short + full creative plan, 1-pager
  describe the balanced version; image folders regenerated

Co-Authored-By: Claude Opus 5.5 <noreply@anthropic.com>
Claude-Session: https://claude.ai/code/session_01WYxT2oKqHUxfsBrXZ2Myb2
</commit_message>
<xml_diff>
--- a/nxt-school-launch/NXT_Meta_Creative_Plan.docx
+++ b/nxt-school-launch/NXT_Meta_Creative_Plan.docx
@@ -1292,7 +1292,7 @@
                 <w:sz w:val="18"/>
                 <w:szCs w:val="18"/>
               </w:rPr>
-              <w:t xml:space="preserve">O2 Open Day + winning P-ad hook (13 Oct)</w:t>
+              <w:t xml:space="preserve">O2 best P-ad + Open Day framing (13 Oct)</w:t>
             </w:r>
           </w:p>
         </w:tc>
@@ -3192,7 +3192,7 @@
                 <w:sz w:val="17"/>
                 <w:szCs w:val="17"/>
               </w:rPr>
-              <w:t xml:space="preserve">O1 (feed + story), O2 winner hook, R3</w:t>
+              <w:t xml:space="preserve">O1 (feed + story), O2 winner + Open Day, R3</w:t>
             </w:r>
           </w:p>
           <w:p>
@@ -12066,7 +12066,7 @@
                 <w:sz w:val="22"/>
                 <w:szCs w:val="22"/>
               </w:rPr>
-              <w:t xml:space="preserve">O2 · Open Day invite with the winning P-ad hook</w:t>
+              <w:t xml:space="preserve">O2 · Best prospecting ad + Open Day framing</w:t>
             </w:r>
           </w:p>
           <w:p>
@@ -12090,7 +12090,7 @@
                 <w:sz w:val="18"/>
                 <w:szCs w:val="18"/>
               </w:rPr>
-              <w:t xml:space="preserve"> W2–W3 · 13 → 26 Oct · static (Open Day + winner’s hook)</w:t>
+              <w:t xml:space="preserve"> W2–W3 · 13 → 26 Oct · static (winner + Open Day framing)</w:t>
             </w:r>
           </w:p>
           <w:p>
@@ -12136,7 +12136,7 @@
                 <w:sz w:val="18"/>
                 <w:szCs w:val="18"/>
               </w:rPr>
-              <w:t xml:space="preserve"> Open Day first — kicker with the date on top, the winner’s hook turned into an invitation (“Less scrolling? Dođite da vidite kako deca stvaraju.”), the P-ad visual kept small so people recognize it. Mock uses C3 — use whichever P-ad leads on day 6–7.</w:t>
+              <w:t xml:space="preserve"> keeps the winning P-ad intact (headline + visual parents already responded to) and frames it as Open Day: kicker “NXT Open Day · dođite da vidite uživo” on top, invitation as the subline, gradient band with date + “Prijavi se” at the bottom. Mock uses C3 — use whichever P-ad leads on day 6–7.</w:t>
             </w:r>
           </w:p>
           <w:p>
@@ -16314,7 +16314,7 @@
                 <w:sz w:val="18"/>
                 <w:szCs w:val="18"/>
               </w:rPr>
-              <w:t xml:space="preserve">O2 = Open Day invite on the winning P-ad hook</w:t>
+              <w:t xml:space="preserve">O2 = winning P-ad + Open Day framing</w:t>
             </w:r>
           </w:p>
         </w:tc>

</xml_diff>